<commit_message>
Expand comparative table to full verbatim text throughout
Replaces all abridgements and placeholders with complete verbatim
provisions: FI definitions glossary, full 5.5.2/5.8.2/5.10.2/5.12.1,
both cloud annexes, examples annex and FI material-outsourcing annex.

Co-Authored-By: Claude Fable 5 <noreply@anthropic.com>
Claude-Session: https://claude.ai/code/session_01JPzxLJCqu7ynMjqaCPY5Jt
</commit_message>
<xml_diff>
--- a/mas-outsourcing-comparative-table.docx
+++ b/mas-outsourcing-comparative-table.docx
@@ -55,7 +55,7 @@
           <w:sz w:val="16"/>
           <w:szCs w:val="16"/>
         </w:rPr>
-        <w:t xml:space="preserve"> marks wording that differs between the two instruments; small grey text reproduces footnotes; FI paragraph numbers are shown in bold brackets where they differ from the row number. Where provisions are worded identically, the FI text is reproduced with the mechanical substitutions "Bank"→"institution", "bank-wide"→"institution-wide" and "MOORS"→"material outsourcing arrangement(s)", with any residual drafting variances applied as they appear in the official FI text. Text in [square brackets] within quoted provisions is editorial abridgement; all other quoted text is verbatim from the official MAS PDFs.</w:t>
+        <w:t xml:space="preserve"> marks wording that differs between the two instruments; small grey text reproduces footnotes; FI paragraph numbers are shown in bold brackets where they differ from the row number. Where provisions are worded identically, the FI text is reproduced with the mechanical substitutions "Bank"→"institution", "bank-wide"→"institution-wide" and "MOORS"→"material outsourcing arrangement(s)", with any residual drafting variances applied as they appear in the official FI text. Cross-references of the form "set out in full at row X of this table" indicate where a split provision's remaining limbs are quoted.</w:t>
       </w:r>
     </w:p>
     <w:tbl>
@@ -2592,8 +2592,13 @@
                 <w:sz w:val="18"/>
                 <w:szCs w:val="18"/>
               </w:rPr>
-              <w:t xml:space="preserve"> In these Guidelines on Outsourcing, unless the context otherwise requires: definitions are provided for </w:t>
-            </w:r>
+              <w:t xml:space="preserve"> In these Guidelines on Outsourcing, unless the context otherwise requires:</w:t>
+            </w:r>
+          </w:p>
+          <w:p>
+            <w:pPr>
+              <w:spacing w:after="40" w:before="40"/>
+            </w:pPr>
             <w:r>
               <w:rPr>
                 <w:rFonts w:ascii="Arial" w:cs="Arial" w:eastAsia="Arial" w:hAnsi="Arial"/>
@@ -2605,18 +2610,459 @@
                 <w:highlight w:val="yellow"/>
                 <w:highlightCs w:val="yellow"/>
               </w:rPr>
-              <w:t xml:space="preserve">"benchmark administrator"; "board" (for a foreign-incorporated institution, a management committee or body beyond local management charged with oversight of the Singapore operations); "bridge-institution"; "business relations" [sector-specific limbs for insurers, CMIs, financial advisers, card licensees and benchmark administrators]; "CMI"; "customer" [ten sector-specific limbs covering CIS trustees, exchanges, market operators, trade repositories, clearing houses, the central depository, licensed trust companies, insurers, insurance intermediaries, financial advisers, CMIs, card licensees, money-changers/remittance businesses and benchmark administrators]; "customer information" [SFA "user information"/"transaction information" for market infrastructure; otherwise customers’ accounts, particulars, transaction details and dealings, excluding public, anonymised or securely encrypted information]; "financial adviser" [Amended on 24 January 2025]; "institution" (any FSMA s 2 financial institution other than a licensed bank or merchant bank); "material outsourcing arrangement" (an arrangement which (a) on service failure or security breach has the potential to materially impact the institution’s business operations, reputation or profitability, or ability to manage risk and comply with applicable laws and regulations, or (b) involves customer information which, on unauthorised access or disclosure, loss or theft, may have a material impact on the institution’s customers); "legal arrangement"; "legal person"; "outsourcing agreement"; "outsourcing arrangement" (an arrangement in which a service provider provides the institution with a service that may currently or potentially be performed by the institution itself and which includes the following characteristics: (a) the institution is dependent on the service on an ongoing basis; and (b) the service is integral to the provision of a financial service by the institution or the service is provided to the market by the service provider in the name of the institution); "relevant business transaction"; "service provider" (any party providing a service to the institution, including any entity within the institution’s group); and "sub-contracting"</w:t>
-            </w:r>
-            <w:r>
-              <w:rPr>
-                <w:rFonts w:ascii="Arial" w:cs="Arial" w:eastAsia="Arial" w:hAnsi="Arial"/>
-                <w:i w:val="false"/>
-                <w:iCs w:val="false"/>
-                <w:color w:val="000000"/>
-                <w:sz w:val="18"/>
-                <w:szCs w:val="18"/>
-              </w:rPr>
-              <w:t xml:space="preserve">. [Text in square brackets is editorial abridgement; all other text is verbatim.]</w:t>
+              <w:t xml:space="preserve">"benchmark administrator"</w:t>
+            </w:r>
+            <w:r>
+              <w:rPr>
+                <w:rFonts w:ascii="Arial" w:cs="Arial" w:eastAsia="Arial" w:hAnsi="Arial"/>
+                <w:i w:val="false"/>
+                <w:iCs w:val="false"/>
+                <w:color w:val="000000"/>
+                <w:sz w:val="18"/>
+                <w:szCs w:val="18"/>
+              </w:rPr>
+              <w:t xml:space="preserve"> means a benchmark administrator authorised under section 123F of the Securities and Futures Act 2001 (SFA) or a benchmark administrator exempt under section 123K of the SFA;</w:t>
+            </w:r>
+          </w:p>
+          <w:p>
+            <w:pPr>
+              <w:spacing w:after="40" w:before="40"/>
+            </w:pPr>
+            <w:r>
+              <w:rPr>
+                <w:rFonts w:ascii="Arial" w:cs="Arial" w:eastAsia="Arial" w:hAnsi="Arial"/>
+                <w:i w:val="false"/>
+                <w:iCs w:val="false"/>
+                <w:color w:val="000000"/>
+                <w:sz w:val="18"/>
+                <w:szCs w:val="18"/>
+                <w:highlight w:val="yellow"/>
+                <w:highlightCs w:val="yellow"/>
+              </w:rPr>
+              <w:t xml:space="preserve">"board" or "board of directors"</w:t>
+            </w:r>
+            <w:r>
+              <w:rPr>
+                <w:rFonts w:ascii="Arial" w:cs="Arial" w:eastAsia="Arial" w:hAnsi="Arial"/>
+                <w:i w:val="false"/>
+                <w:iCs w:val="false"/>
+                <w:color w:val="000000"/>
+                <w:sz w:val="18"/>
+                <w:szCs w:val="18"/>
+              </w:rPr>
+              <w:t xml:space="preserve"> means – (a) in the case of an institution incorporated in Singapore, the board of directors; and (b) in the case of an institution incorporated or established outside Singapore, a management committee or body beyond local management charged with oversight and supervision responsibilities for the institution in Singapore;</w:t>
+            </w:r>
+          </w:p>
+          <w:p>
+            <w:pPr>
+              <w:spacing w:after="40" w:before="40"/>
+            </w:pPr>
+            <w:r>
+              <w:rPr>
+                <w:rFonts w:ascii="Arial" w:cs="Arial" w:eastAsia="Arial" w:hAnsi="Arial"/>
+                <w:i w:val="false"/>
+                <w:iCs w:val="false"/>
+                <w:color w:val="000000"/>
+                <w:sz w:val="18"/>
+                <w:szCs w:val="18"/>
+              </w:rPr>
+              <w:t xml:space="preserve">"bridge-institution" means an institution, whether incorporated in Singapore or outside Singapore, to temporarily take over and maintain certain assets, liabilities and operations of a distressed financial institution, as part of a resolution Authority's exercise of a resolution power;</w:t>
+            </w:r>
+          </w:p>
+          <w:p>
+            <w:pPr>
+              <w:spacing w:after="40" w:before="40"/>
+            </w:pPr>
+            <w:r>
+              <w:rPr>
+                <w:rFonts w:ascii="Arial" w:cs="Arial" w:eastAsia="Arial" w:hAnsi="Arial"/>
+                <w:i w:val="false"/>
+                <w:iCs w:val="false"/>
+                <w:color w:val="000000"/>
+                <w:sz w:val="18"/>
+                <w:szCs w:val="18"/>
+                <w:highlight w:val="yellow"/>
+                <w:highlightCs w:val="yellow"/>
+              </w:rPr>
+              <w:t xml:space="preserve">"business relations"</w:t>
+            </w:r>
+            <w:r>
+              <w:rPr>
+                <w:rFonts w:ascii="Arial" w:cs="Arial" w:eastAsia="Arial" w:hAnsi="Arial"/>
+                <w:i w:val="false"/>
+                <w:iCs w:val="false"/>
+                <w:color w:val="000000"/>
+                <w:sz w:val="18"/>
+                <w:szCs w:val="18"/>
+              </w:rPr>
+              <w:t xml:space="preserve"> – (a) in relation to an insurer, means (i) the issuance of a policy or reinsurance cover by the insurer to; or (ii) the provision of financial advice by the insurer to, a person (whether a natural person, legal person or legal arrangement); (b) in relation to a CMI, means (i) the opening or maintenance of an account by the CMI in the name of; (ii) the provision of financial advice by the CMI to; or (iii) the provision of fund management services by the CMI to, a person (whether a natural person, legal person or legal arrangement); (c) in relation to a financial adviser, means (i) the opening or maintenance of an account by the financial adviser in the name of; or (ii) the provision of financial advice by the financial adviser to, a person (whether a natural person, legal person or legal arrangement); (d) in relation to a credit card or charge card licensee licensed under section 57B of the Banking Act 1970, means the opening or maintenance of an account by the credit card or charge card licensee in the name of a person (whether a natural person, legal person or legal arrangement); (e) in relation to a benchmark administrator, means (i) the collection of information from a person (whether a natural person, legal person or legal arrangement) by the benchmark administrator for the purpose of administering a designated benchmark under the SFA; or (ii) the provision of a designated benchmark by the benchmark administrator to, a person (whether a natural person, legal person or legal arrangement);</w:t>
+            </w:r>
+          </w:p>
+          <w:p>
+            <w:pPr>
+              <w:spacing w:after="40" w:before="40"/>
+            </w:pPr>
+            <w:r>
+              <w:rPr>
+                <w:rFonts w:ascii="Arial" w:cs="Arial" w:eastAsia="Arial" w:hAnsi="Arial"/>
+                <w:i w:val="false"/>
+                <w:iCs w:val="false"/>
+                <w:color w:val="000000"/>
+                <w:sz w:val="18"/>
+                <w:szCs w:val="18"/>
+                <w:highlight w:val="yellow"/>
+                <w:highlightCs w:val="yellow"/>
+              </w:rPr>
+              <w:t xml:space="preserve">"CMI"</w:t>
+            </w:r>
+            <w:r>
+              <w:rPr>
+                <w:rFonts w:ascii="Arial" w:cs="Arial" w:eastAsia="Arial" w:hAnsi="Arial"/>
+                <w:i w:val="false"/>
+                <w:iCs w:val="false"/>
+                <w:color w:val="000000"/>
+                <w:sz w:val="18"/>
+                <w:szCs w:val="18"/>
+              </w:rPr>
+              <w:t xml:space="preserve"> means a person holding a capital markets services licence under the SFA, a fund management company registered under paragraph 5(1)(i) of the Second Schedule to the Securities and Futures (Licensing and Conduct of Business) Regulations (SF(LCB)R) or a person exempted from the requirement to hold such a licence under paragraph 7(1)(b) of the Second Schedule to the SF(LCB)R;</w:t>
+            </w:r>
+          </w:p>
+          <w:p>
+            <w:pPr>
+              <w:spacing w:after="40" w:before="40"/>
+            </w:pPr>
+            <w:r>
+              <w:rPr>
+                <w:rFonts w:ascii="Arial" w:cs="Arial" w:eastAsia="Arial" w:hAnsi="Arial"/>
+                <w:i w:val="false"/>
+                <w:iCs w:val="false"/>
+                <w:color w:val="000000"/>
+                <w:sz w:val="18"/>
+                <w:szCs w:val="18"/>
+                <w:highlight w:val="yellow"/>
+                <w:highlightCs w:val="yellow"/>
+              </w:rPr>
+              <w:t xml:space="preserve">"customer"</w:t>
+            </w:r>
+            <w:r>
+              <w:rPr>
+                <w:rFonts w:ascii="Arial" w:cs="Arial" w:eastAsia="Arial" w:hAnsi="Arial"/>
+                <w:i w:val="false"/>
+                <w:iCs w:val="false"/>
+                <w:color w:val="000000"/>
+                <w:sz w:val="18"/>
+                <w:szCs w:val="18"/>
+              </w:rPr>
+              <w:t xml:space="preserve"> means – (a) in relation to any trustee for a collective investment scheme authorised under section 286 of the SFA, that is approved under that Act, the managers and participants of the collective investment scheme; (b) in relation to an approved exchange, recognised market operator, licensed trade repository, licensed foreign trade repository, approved clearing house, recognised clearing house, and central depository system under the SFA, a person who may participate in one or more of the services provided by such entities; (c) in relation to a licensed trust company under the Trust Companies Act 2005, a trust for which the trust company provides trust business services and includes the settlor and any beneficiary under the trust; (d) in relation to an insurer, means a person (whether a natural person, legal person or legal arrangement) with whom the insurer establishes or intends to establish business relations, including, in the case of a group policy, the owner of the master policy issued or intended to be issued; (e) in relation to an insurance intermediary, means a person (whether a natural person, legal person or a legal arrangement) with whom the insurance intermediary arranges or intends to arrange for such persons, contracts of insurance in Singapore with one or more insurers; (f) in relation to a financial adviser, means a person (whether a natural person, legal person or a legal arrangement) with whom the financial adviser establishes or intends to establish business relations and includes in the case where the financial adviser arranges a group life insurance policy, the owner of the master policy; (g) in relation to a CMI, means a person (whether a natural person, legal person or a legal arrangement) – (i) with whom the CMI establishes or intends to establish business relations; (ii) for whom the CMI undertakes or intends to undertake any transaction without an account being opened; or (iii) who invests into an investment vehicle to which the CMI provides the regulated activities of fund management and real estate investment trust management; (h) in relation to a credit card or charge card licensee licensed under section 57B of the Banking Act 1970, means a person (whether a natural person, legal person or legal arrangement) with whom the credit card or charge card licensee establishes or intends to establish business relations; (i) in relation to money-changers and remittance businesses, means a person (whether a natural, legal person or legal arrangement) – (i) with whom the licensee establishes or intends to establish an account relationship; or (ii) for whom the licensee undertakes or intends to undertake a relevant business transaction without an account being opened, including in the case of an inward remittance transaction, the person to whom the licensee pays out funds in cash or cash equivalent in Singapore and the person on behalf of whom such funds are paid out in Singapore; (j) in relation to a benchmark administrator, means a person (whether a natural, legal person or legal arrangement) – (i) who provides information to the benchmark administrator in relation to a designated benchmark; or (ii) with whom the benchmark administrator establishes or intends to establish business relations;</w:t>
+            </w:r>
+          </w:p>
+          <w:p>
+            <w:pPr>
+              <w:spacing w:after="40" w:before="40"/>
+            </w:pPr>
+            <w:r>
+              <w:rPr>
+                <w:rFonts w:ascii="Arial" w:cs="Arial" w:eastAsia="Arial" w:hAnsi="Arial"/>
+                <w:i w:val="false"/>
+                <w:iCs w:val="false"/>
+                <w:color w:val="000000"/>
+                <w:sz w:val="18"/>
+                <w:szCs w:val="18"/>
+                <w:highlight w:val="yellow"/>
+                <w:highlightCs w:val="yellow"/>
+              </w:rPr>
+              <w:t xml:space="preserve">"customer information"</w:t>
+            </w:r>
+            <w:r>
+              <w:rPr>
+                <w:rFonts w:ascii="Arial" w:cs="Arial" w:eastAsia="Arial" w:hAnsi="Arial"/>
+                <w:i w:val="false"/>
+                <w:iCs w:val="false"/>
+                <w:color w:val="000000"/>
+                <w:sz w:val="18"/>
+                <w:szCs w:val="18"/>
+              </w:rPr>
+              <w:t xml:space="preserve"> means – (a) in relation to an approved exchange, recognised market operator, approved clearing house and recognised clearing house, "user information" as defined in section 2 of the SFA; (b) in relation to a licensed trade repository and licensed foreign trade repository, "user information" and "transaction information" as defined in section 2 of the SFA; or (c) in the case of any other institution, information that relates to its customers and these include customers' accounts, particulars, transaction details and dealings with the financial institutions, but does not include any information that is public, anonymised, or encrypted in a secure manner such that the identities of the customers cannot be readily inferred;</w:t>
+            </w:r>
+          </w:p>
+          <w:p>
+            <w:pPr>
+              <w:spacing w:after="40" w:before="40"/>
+            </w:pPr>
+            <w:r>
+              <w:rPr>
+                <w:rFonts w:ascii="Arial" w:cs="Arial" w:eastAsia="Arial" w:hAnsi="Arial"/>
+                <w:i w:val="false"/>
+                <w:iCs w:val="false"/>
+                <w:color w:val="000000"/>
+                <w:sz w:val="18"/>
+                <w:szCs w:val="18"/>
+                <w:highlight w:val="yellow"/>
+                <w:highlightCs w:val="yellow"/>
+              </w:rPr>
+              <w:t xml:space="preserve">"financial adviser"</w:t>
+            </w:r>
+            <w:r>
+              <w:rPr>
+                <w:rFonts w:ascii="Arial" w:cs="Arial" w:eastAsia="Arial" w:hAnsi="Arial"/>
+                <w:i w:val="false"/>
+                <w:iCs w:val="false"/>
+                <w:color w:val="000000"/>
+                <w:sz w:val="18"/>
+                <w:szCs w:val="18"/>
+              </w:rPr>
+              <w:t xml:space="preserve"> means a licensed financial adviser under the Financial Advisers Act 2001 (FAA) or a person exempt, under section 20(1)(g) of the FAA read with regulation 27(1)(d) of the Financial Advisers Regulations, from holding a financial adviser's licence to act as a financial adviser in Singapore in respect of any financial advisory service; </w:t>
+            </w:r>
+            <w:r>
+              <w:rPr>
+                <w:rFonts w:ascii="Arial" w:cs="Arial" w:eastAsia="Arial" w:hAnsi="Arial"/>
+                <w:i w:val="false"/>
+                <w:iCs w:val="false"/>
+                <w:color w:val="000000"/>
+                <w:sz w:val="18"/>
+                <w:szCs w:val="18"/>
+                <w:highlight w:val="yellow"/>
+                <w:highlightCs w:val="yellow"/>
+              </w:rPr>
+              <w:t xml:space="preserve">[Amended on 24 January 2025]</w:t>
+            </w:r>
+          </w:p>
+          <w:p>
+            <w:pPr>
+              <w:spacing w:after="40" w:before="40"/>
+            </w:pPr>
+            <w:r>
+              <w:rPr>
+                <w:rFonts w:ascii="Arial" w:cs="Arial" w:eastAsia="Arial" w:hAnsi="Arial"/>
+                <w:i w:val="false"/>
+                <w:iCs w:val="false"/>
+                <w:color w:val="000000"/>
+                <w:sz w:val="18"/>
+                <w:szCs w:val="18"/>
+                <w:highlight w:val="yellow"/>
+                <w:highlightCs w:val="yellow"/>
+              </w:rPr>
+              <w:t xml:space="preserve">"institution"</w:t>
+            </w:r>
+            <w:r>
+              <w:rPr>
+                <w:rFonts w:ascii="Arial" w:cs="Arial" w:eastAsia="Arial" w:hAnsi="Arial"/>
+                <w:i w:val="false"/>
+                <w:iCs w:val="false"/>
+                <w:color w:val="000000"/>
+                <w:sz w:val="18"/>
+                <w:szCs w:val="18"/>
+              </w:rPr>
+              <w:t xml:space="preserve"> means any financial institution as defined in Section 2 of the Financial Services and Markets Act 2022 other than a bank licensed under the Banking Act 1970 or a merchant bank licensed under the Banking Act 1970;</w:t>
+            </w:r>
+          </w:p>
+          <w:p>
+            <w:pPr>
+              <w:spacing w:after="40" w:before="40"/>
+            </w:pPr>
+            <w:r>
+              <w:rPr>
+                <w:rFonts w:ascii="Arial" w:cs="Arial" w:eastAsia="Arial" w:hAnsi="Arial"/>
+                <w:i w:val="false"/>
+                <w:iCs w:val="false"/>
+                <w:color w:val="000000"/>
+                <w:sz w:val="18"/>
+                <w:szCs w:val="18"/>
+                <w:highlight w:val="yellow"/>
+                <w:highlightCs w:val="yellow"/>
+              </w:rPr>
+              <w:t xml:space="preserve">"material outsourcing arrangement"</w:t>
+            </w:r>
+            <w:r>
+              <w:rPr>
+                <w:rFonts w:ascii="Arial" w:cs="Arial" w:eastAsia="Arial" w:hAnsi="Arial"/>
+                <w:i w:val="false"/>
+                <w:iCs w:val="false"/>
+                <w:color w:val="000000"/>
+                <w:sz w:val="18"/>
+                <w:szCs w:val="18"/>
+              </w:rPr>
+              <w:t xml:space="preserve"> means an outsourcing arrangement – (a) which, in the event of a service failure or security breach, has the potential to either materially impact an institution's– (i) business operations, reputation or profitability; or (ii) ability to manage risk and comply with applicable laws and regulations, or (b) which involves customer information and, in the event of any unauthorised access or disclosure, loss or theft of customer information, may have a material impact on an institution's customers;</w:t>
+            </w:r>
+          </w:p>
+          <w:p>
+            <w:pPr>
+              <w:spacing w:after="40" w:before="40"/>
+            </w:pPr>
+            <w:r>
+              <w:rPr>
+                <w:rFonts w:ascii="Arial" w:cs="Arial" w:eastAsia="Arial" w:hAnsi="Arial"/>
+                <w:i w:val="false"/>
+                <w:iCs w:val="false"/>
+                <w:color w:val="000000"/>
+                <w:sz w:val="18"/>
+                <w:szCs w:val="18"/>
+              </w:rPr>
+              <w:t xml:space="preserve">"legal arrangement" means a trust or other similar arrangement;</w:t>
+            </w:r>
+          </w:p>
+          <w:p>
+            <w:pPr>
+              <w:spacing w:after="40" w:before="40"/>
+            </w:pPr>
+            <w:r>
+              <w:rPr>
+                <w:rFonts w:ascii="Arial" w:cs="Arial" w:eastAsia="Arial" w:hAnsi="Arial"/>
+                <w:i w:val="false"/>
+                <w:iCs w:val="false"/>
+                <w:color w:val="000000"/>
+                <w:sz w:val="18"/>
+                <w:szCs w:val="18"/>
+              </w:rPr>
+              <w:t xml:space="preserve">"legal person" means an entity other than a natural person that can establish a permanent customer relationship with a financial institution or otherwise own property;</w:t>
+            </w:r>
+          </w:p>
+          <w:p>
+            <w:pPr>
+              <w:spacing w:after="40" w:before="40"/>
+            </w:pPr>
+            <w:r>
+              <w:rPr>
+                <w:rFonts w:ascii="Arial" w:cs="Arial" w:eastAsia="Arial" w:hAnsi="Arial"/>
+                <w:i w:val="false"/>
+                <w:iCs w:val="false"/>
+                <w:color w:val="000000"/>
+                <w:sz w:val="18"/>
+                <w:szCs w:val="18"/>
+              </w:rPr>
+              <w:t xml:space="preserve">"outsourcing agreement" means a written agreement setting out the contractual terms and conditions governing relationships, obligations, responsibilities, rights and expectations of the contracting parties in an outsourcing arrangement;</w:t>
+            </w:r>
+          </w:p>
+          <w:p>
+            <w:pPr>
+              <w:spacing w:after="40" w:before="40"/>
+            </w:pPr>
+            <w:r>
+              <w:rPr>
+                <w:rFonts w:ascii="Arial" w:cs="Arial" w:eastAsia="Arial" w:hAnsi="Arial"/>
+                <w:i w:val="false"/>
+                <w:iCs w:val="false"/>
+                <w:color w:val="000000"/>
+                <w:sz w:val="18"/>
+                <w:szCs w:val="18"/>
+                <w:highlight w:val="yellow"/>
+                <w:highlightCs w:val="yellow"/>
+              </w:rPr>
+              <w:t xml:space="preserve">"outsourcing arrangement"</w:t>
+            </w:r>
+            <w:r>
+              <w:rPr>
+                <w:rFonts w:ascii="Arial" w:cs="Arial" w:eastAsia="Arial" w:hAnsi="Arial"/>
+                <w:i w:val="false"/>
+                <w:iCs w:val="false"/>
+                <w:color w:val="000000"/>
+                <w:sz w:val="18"/>
+                <w:szCs w:val="18"/>
+              </w:rPr>
+              <w:t xml:space="preserve"> means an arrangement in which a service provider provides the institution with a service that may currently or potentially be performed by the institution itself and which includes the following characteristics – (a) the institution is dependent on the service on an ongoing basis; and (b) the service is integral to the provision of a financial service by the institution or the service is provided to the market by the service provider in the name of the institution;</w:t>
+            </w:r>
+          </w:p>
+          <w:p>
+            <w:pPr>
+              <w:spacing w:after="40" w:before="40"/>
+            </w:pPr>
+            <w:r>
+              <w:rPr>
+                <w:rFonts w:ascii="Arial" w:cs="Arial" w:eastAsia="Arial" w:hAnsi="Arial"/>
+                <w:i w:val="false"/>
+                <w:iCs w:val="false"/>
+                <w:color w:val="000000"/>
+                <w:sz w:val="18"/>
+                <w:szCs w:val="18"/>
+                <w:highlight w:val="yellow"/>
+                <w:highlightCs w:val="yellow"/>
+              </w:rPr>
+              <w:t xml:space="preserve">"relevant business transaction"</w:t>
+            </w:r>
+            <w:r>
+              <w:rPr>
+                <w:rFonts w:ascii="Arial" w:cs="Arial" w:eastAsia="Arial" w:hAnsi="Arial"/>
+                <w:i w:val="false"/>
+                <w:iCs w:val="false"/>
+                <w:color w:val="000000"/>
+                <w:sz w:val="18"/>
+                <w:szCs w:val="18"/>
+              </w:rPr>
+              <w:t xml:space="preserve"> – (a) in relation to a holder of a money-changer's licence means – (i) a money-changing transaction of an aggregate value not less than S$5,000; or (ii) an inward remittance transaction from another country or jurisdiction to Singapore; or (b) in relation to a holder of a remittance license means, a remittance transaction whether from Singapore to another country or jurisdiction or from another country or jurisdiction to Singapore;</w:t>
+            </w:r>
+          </w:p>
+          <w:p>
+            <w:pPr>
+              <w:spacing w:after="40" w:before="40"/>
+            </w:pPr>
+            <w:r>
+              <w:rPr>
+                <w:rFonts w:ascii="Arial" w:cs="Arial" w:eastAsia="Arial" w:hAnsi="Arial"/>
+                <w:i w:val="false"/>
+                <w:iCs w:val="false"/>
+                <w:color w:val="000000"/>
+                <w:sz w:val="18"/>
+                <w:szCs w:val="18"/>
+                <w:highlight w:val="yellow"/>
+                <w:highlightCs w:val="yellow"/>
+              </w:rPr>
+              <w:t xml:space="preserve">"service provider"</w:t>
+            </w:r>
+            <w:r>
+              <w:rPr>
+                <w:rFonts w:ascii="Arial" w:cs="Arial" w:eastAsia="Arial" w:hAnsi="Arial"/>
+                <w:i w:val="false"/>
+                <w:iCs w:val="false"/>
+                <w:color w:val="000000"/>
+                <w:sz w:val="18"/>
+                <w:szCs w:val="18"/>
+              </w:rPr>
+              <w:t xml:space="preserve"> means any party which provides a service to the institution, including any entity within the institution's group4, whether it is located in Singapore or elsewhere;</w:t>
+            </w:r>
+          </w:p>
+          <w:p>
+            <w:pPr>
+              <w:spacing w:after="40" w:before="40"/>
+            </w:pPr>
+            <w:r>
+              <w:rPr>
+                <w:rFonts w:ascii="Arial" w:cs="Arial" w:eastAsia="Arial" w:hAnsi="Arial"/>
+                <w:i w:val="false"/>
+                <w:iCs w:val="false"/>
+                <w:color w:val="595959"/>
+                <w:sz w:val="14"/>
+                <w:szCs w:val="14"/>
+              </w:rPr>
+              <w:t xml:space="preserve">4 – This refers to the institution's Head Office or parent institution, subsidiaries, affiliates, and any entity (including their subsidiaries, affiliates and special purpose entities) that the institution exerts control over or that exerts control over the institution.</w:t>
+            </w:r>
+          </w:p>
+          <w:p>
+            <w:pPr>
+              <w:spacing w:after="40" w:before="40"/>
+            </w:pPr>
+            <w:r>
+              <w:rPr>
+                <w:rFonts w:ascii="Arial" w:cs="Arial" w:eastAsia="Arial" w:hAnsi="Arial"/>
+                <w:i w:val="false"/>
+                <w:iCs w:val="false"/>
+                <w:color w:val="000000"/>
+                <w:sz w:val="18"/>
+                <w:szCs w:val="18"/>
+                <w:highlight w:val="yellow"/>
+                <w:highlightCs w:val="yellow"/>
+              </w:rPr>
+              <w:t xml:space="preserve">"sub-contracting"</w:t>
+            </w:r>
+            <w:r>
+              <w:rPr>
+                <w:rFonts w:ascii="Arial" w:cs="Arial" w:eastAsia="Arial" w:hAnsi="Arial"/>
+                <w:i w:val="false"/>
+                <w:iCs w:val="false"/>
+                <w:color w:val="000000"/>
+                <w:sz w:val="18"/>
+                <w:szCs w:val="18"/>
+              </w:rPr>
+              <w:t xml:space="preserve"> means an arrangement where a service provider which has an outsourcing arrangement with an institution, further outsources the services or part of the services covered under the outsourcing arrangement to another service provider.</w:t>
             </w:r>
           </w:p>
         </w:tc>
@@ -5430,7 +5876,7 @@
                 <w:sz w:val="18"/>
                 <w:szCs w:val="18"/>
               </w:rPr>
-              <w:t xml:space="preserve"> An institution should ensure that every outsourcing agreement addresses the risks identified at the risk evaluation and due diligence stages. Each outsourcing agreement should allow for timely renegotiation and renewal to enable the institution to retain an appropriate level of control over the outsourcing arrangement and the right to intervene with appropriate measures to meet its legal and regulatory obligations. It should at the very least, have provisions to address the following aspects of outsourcing: (a) scope of the outsourcing arrangement; (b) performance, operational, internal control and risk management standards; (c) confidentiality and security; (d) business continuity management; (e) monitoring and control; (f) audit and inspection; (g) notification of adverse developments [as per the Bank text, addressee adjusted, cross-referring ¶4.2.1]; (h) dispute resolution [as per the Bank text, addressee adjusted]; (i) default termination and early exit [expanded inline — see row 3.4.3 below]; </w:t>
+              <w:t xml:space="preserve"> An institution should ensure that every outsourcing agreement addresses the risks identified at the risk evaluation and due diligence stages. Each outsourcing agreement should allow for timely renegotiation and renewal to enable the institution to retain an appropriate level of control over the outsourcing arrangement and the right to intervene with appropriate measures to meet its legal and regulatory obligations. It should at the very least, have provisions to address the following aspects of outsourcing: (a) scope of the outsourcing arrangement; (b) performance, operational, internal control and risk management standards; (c) confidentiality and security9; (d) business continuity management10; (e) monitoring and control11; (f) audit and inspection12; (g) notification of adverse developments — An institution should specify in its outsourcing agreement the type of events and the circumstances under which the service provider should report to the institution in order for an institution to take prompt risk mitigation measures and notify MAS of such developments under paragraph 4.2.1; (h) dispute resolution — An institution should specify in its outsourcing agreement the resolution process, events of default, and the indemnities, remedies and recourse of the respective parties in the agreement. The institution should ensure that its contractual rights can be exercised in the event of a breach of the outsourcing agreement by the service provider; (i) default termination and early exit — set out in full at rows 3.4.3 and 3.4.4 of this table; </w:t>
             </w:r>
             <w:r>
               <w:rPr>
@@ -5454,286 +5900,7 @@
                 <w:sz w:val="18"/>
                 <w:szCs w:val="18"/>
               </w:rPr>
-              <w:t xml:space="preserve"> [see row 3.5.1 below]; (k) applicable laws [as per the Bank text].</w:t>
-            </w:r>
-          </w:p>
-        </w:tc>
-        <w:tc>
-          <w:tcPr>
-            <w:tcW w:type="dxa" w:w="3000"/>
-            <w:tcMar>
-              <w:top w:type="dxa" w:w="60"/>
-              <w:left w:type="dxa" w:w="100"/>
-              <w:bottom w:type="dxa" w:w="60"/>
-              <w:right w:type="dxa" w:w="100"/>
-            </w:tcMar>
-            <w:vAlign w:val="top"/>
-          </w:tcPr>
-          <w:p>
-            <w:pPr>
-              <w:spacing w:after="40" w:before="40"/>
-            </w:pPr>
-            <w:r>
-              <w:rPr>
-                <w:rFonts w:ascii="Arial" w:cs="Arial" w:eastAsia="Arial" w:hAnsi="Arial"/>
-                <w:i w:val="false"/>
-                <w:iCs w:val="false"/>
-                <w:color w:val="000000"/>
-                <w:sz w:val="18"/>
-                <w:szCs w:val="18"/>
-              </w:rPr>
-              <w:t xml:space="preserve">1.  Same core checklist, found at FI ¶5.5.2, with three differences: (i) the FI list adds </w:t>
-            </w:r>
-            <w:r>
-              <w:rPr>
-                <w:rFonts w:ascii="Arial" w:cs="Arial" w:eastAsia="Arial" w:hAnsi="Arial"/>
-                <w:i w:val="false"/>
-                <w:iCs w:val="false"/>
-                <w:color w:val="000000"/>
-                <w:sz w:val="18"/>
-                <w:szCs w:val="18"/>
-                <w:highlight w:val="yellow"/>
-                <w:highlightCs w:val="yellow"/>
-              </w:rPr>
-              <w:t xml:space="preserve">item (j) sub-contracting</w:t>
-            </w:r>
-            <w:r>
-              <w:rPr>
-                <w:rFonts w:ascii="Arial" w:cs="Arial" w:eastAsia="Arial" w:hAnsi="Arial"/>
-                <w:i w:val="false"/>
-                <w:iCs w:val="false"/>
-                <w:color w:val="000000"/>
-                <w:sz w:val="18"/>
-                <w:szCs w:val="18"/>
-              </w:rPr>
-              <w:t xml:space="preserve"> (the Bank Guidelines deal with sub-contracting in a dedicated §3.5); (ii) Bank footnotes 9 and 12 require MOORS agreements to include the binding requirements of Notices ¶7.1(a)–(c) and ¶7.1(d) — no FI equivalent; (iii) the FI version expands "default termination and early exit" inline (see next row).</w:t>
-            </w:r>
-          </w:p>
-        </w:tc>
-      </w:tr>
-      <w:tr>
-        <w:tc>
-          <w:tcPr>
-            <w:tcW w:type="dxa" w:w="800"/>
-            <w:tcMar>
-              <w:top w:type="dxa" w:w="60"/>
-              <w:left w:type="dxa" w:w="100"/>
-              <w:bottom w:type="dxa" w:w="60"/>
-              <w:right w:type="dxa" w:w="100"/>
-            </w:tcMar>
-            <w:vAlign w:val="top"/>
-          </w:tcPr>
-          <w:p>
-            <w:pPr>
-              <w:spacing w:after="40" w:before="40"/>
-            </w:pPr>
-            <w:r>
-              <w:rPr>
-                <w:rFonts w:ascii="Arial" w:cs="Arial" w:eastAsia="Arial" w:hAnsi="Arial"/>
-                <w:i w:val="false"/>
-                <w:iCs w:val="false"/>
-                <w:color w:val="000000"/>
-                <w:sz w:val="18"/>
-                <w:szCs w:val="18"/>
-              </w:rPr>
-              <w:t xml:space="preserve">3.4.3</w:t>
-            </w:r>
-          </w:p>
-        </w:tc>
-        <w:tc>
-          <w:tcPr>
-            <w:tcW w:type="dxa" w:w="5300"/>
-            <w:tcMar>
-              <w:top w:type="dxa" w:w="60"/>
-              <w:left w:type="dxa" w:w="100"/>
-              <w:bottom w:type="dxa" w:w="60"/>
-              <w:right w:type="dxa" w:w="100"/>
-            </w:tcMar>
-            <w:vAlign w:val="top"/>
-          </w:tcPr>
-          <w:p>
-            <w:pPr>
-              <w:spacing w:after="40" w:before="40"/>
-            </w:pPr>
-            <w:r>
-              <w:rPr>
-                <w:rFonts w:ascii="Arial" w:cs="Arial" w:eastAsia="Arial" w:hAnsi="Arial"/>
-                <w:i w:val="false"/>
-                <w:iCs w:val="false"/>
-                <w:color w:val="000000"/>
-                <w:sz w:val="18"/>
-                <w:szCs w:val="18"/>
-              </w:rPr>
-              <w:t xml:space="preserve">A Bank should have the right to terminate the outsourcing agreement in the event of default, or under any of the following circumstances: </w:t>
-            </w:r>
-            <w:r>
-              <w:rPr>
-                <w:rFonts w:ascii="Arial" w:cs="Arial" w:eastAsia="Arial" w:hAnsi="Arial"/>
-                <w:i w:val="false"/>
-                <w:iCs w:val="false"/>
-                <w:color w:val="000000"/>
-                <w:sz w:val="18"/>
-                <w:szCs w:val="18"/>
-                <w:highlight w:val="yellow"/>
-                <w:highlightCs w:val="yellow"/>
-              </w:rPr>
-              <w:t xml:space="preserve">(a) by giving reasonable notice to the service provider; (b) if the service provider or a sub-contractor, as the case may be, failed to safeguard the confidentiality or integrity of customer information of the Bank; or (c) if there has been a demonstrable deterioration in the ability of the service provider or a sub-contractor to safeguard the confidentiality of customer information.</w:t>
-            </w:r>
-          </w:p>
-        </w:tc>
-        <w:tc>
-          <w:tcPr>
-            <w:tcW w:type="dxa" w:w="5300"/>
-            <w:tcMar>
-              <w:top w:type="dxa" w:w="60"/>
-              <w:left w:type="dxa" w:w="100"/>
-              <w:bottom w:type="dxa" w:w="60"/>
-              <w:right w:type="dxa" w:w="100"/>
-            </w:tcMar>
-            <w:vAlign w:val="top"/>
-          </w:tcPr>
-          <w:p>
-            <w:pPr>
-              <w:spacing w:after="40" w:before="40"/>
-            </w:pPr>
-            <w:r>
-              <w:rPr>
-                <w:rFonts w:ascii="Arial" w:cs="Arial" w:eastAsia="Arial" w:hAnsi="Arial"/>
-                <w:b/>
-                <w:bCs/>
-                <w:i w:val="false"/>
-                <w:iCs w:val="false"/>
-                <w:color w:val="000000"/>
-                <w:sz w:val="18"/>
-                <w:szCs w:val="18"/>
-              </w:rPr>
-              <w:t xml:space="preserve">[¶5.5.2(i)]</w:t>
-            </w:r>
-            <w:r>
-              <w:rPr>
-                <w:rFonts w:ascii="Arial" w:cs="Arial" w:eastAsia="Arial" w:hAnsi="Arial"/>
-                <w:i w:val="false"/>
-                <w:iCs w:val="false"/>
-                <w:color w:val="000000"/>
-                <w:sz w:val="18"/>
-                <w:szCs w:val="18"/>
-              </w:rPr>
-              <w:t xml:space="preserve"> An institution should, have the right to terminate the outsourcing agreement in the event of default, or under circumstances where: </w:t>
-            </w:r>
-            <w:r>
-              <w:rPr>
-                <w:rFonts w:ascii="Arial" w:cs="Arial" w:eastAsia="Arial" w:hAnsi="Arial"/>
-                <w:i w:val="false"/>
-                <w:iCs w:val="false"/>
-                <w:color w:val="000000"/>
-                <w:sz w:val="18"/>
-                <w:szCs w:val="18"/>
-                <w:highlight w:val="yellow"/>
-                <w:highlightCs w:val="yellow"/>
-              </w:rPr>
-              <w:t xml:space="preserve">(i) the service provider undergoes a change in ownership; (ii) the service provider becomes insolvent or goes into liquidation; (iii) the service provider goes into receivership or judicial management whether in Singapore or elsewhere; (iv) there has been a breach of security or confidentiality; or (v) there is a demonstrable deterioration in the ability of the service provider to perform the contracted service.</w:t>
-            </w:r>
-          </w:p>
-        </w:tc>
-        <w:tc>
-          <w:tcPr>
-            <w:tcW w:type="dxa" w:w="3000"/>
-            <w:tcMar>
-              <w:top w:type="dxa" w:w="60"/>
-              <w:left w:type="dxa" w:w="100"/>
-              <w:bottom w:type="dxa" w:w="60"/>
-              <w:right w:type="dxa" w:w="100"/>
-            </w:tcMar>
-            <w:vAlign w:val="top"/>
-          </w:tcPr>
-          <w:p>
-            <w:pPr>
-              <w:spacing w:after="40" w:before="40"/>
-            </w:pPr>
-            <w:r>
-              <w:rPr>
-                <w:rFonts w:ascii="Arial" w:cs="Arial" w:eastAsia="Arial" w:hAnsi="Arial"/>
-                <w:i w:val="false"/>
-                <w:iCs w:val="false"/>
-                <w:color w:val="000000"/>
-                <w:sz w:val="18"/>
-                <w:szCs w:val="18"/>
-              </w:rPr>
-              <w:t xml:space="preserve">1.  Materially different trigger lists. The FI version keeps the traditional corporate-event triggers (change of ownership; insolvency/liquidation; receivership/judicial management) and a service-performance trigger; the Bank list is confidentiality-centred (extending expressly to sub-contractor failures) and adds a no-fault reasonable-notice right.</w:t>
-            </w:r>
-          </w:p>
-          <w:p>
-            <w:pPr>
-              <w:spacing w:after="40" w:before="40"/>
-            </w:pPr>
-            <w:r>
-              <w:rPr>
-                <w:rFonts w:ascii="Arial" w:cs="Arial" w:eastAsia="Arial" w:hAnsi="Arial"/>
-                <w:i w:val="false"/>
-                <w:iCs w:val="false"/>
-                <w:color w:val="000000"/>
-                <w:sz w:val="18"/>
-                <w:szCs w:val="18"/>
-              </w:rPr>
-              <w:t xml:space="preserve">2.  The Bank Guidelines recite no corporate-event triggers — banks’ binding contractual requirements are prescribed by Notices ¶7.1, whose full content the Guidelines do not reproduce. On the face of the two Guidelines, the FI list is the broader one.</w:t>
-            </w:r>
-          </w:p>
-        </w:tc>
-      </w:tr>
-      <w:tr>
-        <w:tc>
-          <w:tcPr>
-            <w:tcW w:type="dxa" w:w="800"/>
-            <w:tcMar>
-              <w:top w:type="dxa" w:w="60"/>
-              <w:left w:type="dxa" w:w="100"/>
-              <w:bottom w:type="dxa" w:w="60"/>
-              <w:right w:type="dxa" w:w="100"/>
-            </w:tcMar>
-            <w:vAlign w:val="top"/>
-          </w:tcPr>
-          <w:p>
-            <w:pPr>
-              <w:spacing w:after="40" w:before="40"/>
-            </w:pPr>
-            <w:r>
-              <w:rPr>
-                <w:rFonts w:ascii="Arial" w:cs="Arial" w:eastAsia="Arial" w:hAnsi="Arial"/>
-                <w:i w:val="false"/>
-                <w:iCs w:val="false"/>
-                <w:color w:val="000000"/>
-                <w:sz w:val="18"/>
-                <w:szCs w:val="18"/>
-              </w:rPr>
-              <w:t xml:space="preserve">3.4.4</w:t>
-            </w:r>
-          </w:p>
-        </w:tc>
-        <w:tc>
-          <w:tcPr>
-            <w:tcW w:type="dxa" w:w="5300"/>
-            <w:tcMar>
-              <w:top w:type="dxa" w:w="60"/>
-              <w:left w:type="dxa" w:w="100"/>
-              <w:bottom w:type="dxa" w:w="60"/>
-              <w:right w:type="dxa" w:w="100"/>
-            </w:tcMar>
-            <w:vAlign w:val="top"/>
-          </w:tcPr>
-          <w:p>
-            <w:pPr>
-              <w:spacing w:after="40" w:before="40"/>
-            </w:pPr>
-            <w:r>
-              <w:rPr>
-                <w:rFonts w:ascii="Arial" w:cs="Arial" w:eastAsia="Arial" w:hAnsi="Arial"/>
-                <w:i w:val="false"/>
-                <w:iCs w:val="false"/>
-                <w:color w:val="000000"/>
-                <w:sz w:val="18"/>
-                <w:szCs w:val="18"/>
-              </w:rPr>
-              <w:t xml:space="preserve">The minimum period to execute a termination provision should be specified in the outsourcing agreement. Other provisions should also be put in place to ensure a smooth transition when the agreement is terminated or being amended. Such provisions may facilitate transferability of the outsourced services to a bridge-institution14 or a third party. Where the outsourcing agreement involves an intra-group entity, the agreement should be legally enforceable against the intra-group entity providing the outsourced service.</w:t>
+              <w:t xml:space="preserve"> — set out in full at row 3.5.1 of this table; (k) applicable laws — Agreements should include choice-of-law provisions, agreement covenants and jurisdictional covenants that provide for adjudication of disputes between the parties under the laws of a specific jurisdiction.</w:t>
             </w:r>
           </w:p>
           <w:p>
@@ -5749,48 +5916,7 @@
                 <w:sz w:val="14"/>
                 <w:szCs w:val="14"/>
               </w:rPr>
-              <w:t xml:space="preserve">14 – "bridge-institution" means an institution, whether incorporated in Singapore or outside Singapore, to temporarily take over and maintain certain assets, liabilities and operations of a distressed financial institution, as part of a resolution Authority's exercise of a resolution.</w:t>
-            </w:r>
-          </w:p>
-        </w:tc>
-        <w:tc>
-          <w:tcPr>
-            <w:tcW w:type="dxa" w:w="5300"/>
-            <w:tcMar>
-              <w:top w:type="dxa" w:w="60"/>
-              <w:left w:type="dxa" w:w="100"/>
-              <w:bottom w:type="dxa" w:w="60"/>
-              <w:right w:type="dxa" w:w="100"/>
-            </w:tcMar>
-            <w:vAlign w:val="top"/>
-          </w:tcPr>
-          <w:p>
-            <w:pPr>
-              <w:spacing w:after="40" w:before="40"/>
-            </w:pPr>
-            <w:r>
-              <w:rPr>
-                <w:rFonts w:ascii="Arial" w:cs="Arial" w:eastAsia="Arial" w:hAnsi="Arial"/>
-                <w:b/>
-                <w:bCs/>
-                <w:i w:val="false"/>
-                <w:iCs w:val="false"/>
-                <w:color w:val="000000"/>
-                <w:sz w:val="18"/>
-                <w:szCs w:val="18"/>
-              </w:rPr>
-              <w:t xml:space="preserve">[¶5.5.2(i) (closing text)]</w:t>
-            </w:r>
-            <w:r>
-              <w:rPr>
-                <w:rFonts w:ascii="Arial" w:cs="Arial" w:eastAsia="Arial" w:hAnsi="Arial"/>
-                <w:i w:val="false"/>
-                <w:iCs w:val="false"/>
-                <w:color w:val="000000"/>
-                <w:sz w:val="18"/>
-                <w:szCs w:val="18"/>
-              </w:rPr>
-              <w:t xml:space="preserve"> The minimum period to execute a termination provision should be specified in the outsourcing agreement. Other provisions should also be put in place to ensure a smooth transition when the agreement is terminated or being amended. Such provisions may facilitate transferability of the outsourced services to a bridge-institution14 or a third party. Where the outsourcing agreement involves an intra-group entity, the agreement should be legally enforceable against the intra-group entity providing the outsourced service.</w:t>
+              <w:t xml:space="preserve">9 – Refer to paragraph 5.6.</w:t>
             </w:r>
           </w:p>
           <w:p>
@@ -5806,130 +5932,7 @@
                 <w:sz w:val="14"/>
                 <w:szCs w:val="14"/>
               </w:rPr>
-              <w:t xml:space="preserve">14 – "bridge-institution" means an institution, whether incorporated in Singapore or outside Singapore, to temporarily take over and maintain certain assets, liabilities and operations of a distressed financial institution, as part of a resolution Authority's exercise of a resolution.</w:t>
-            </w:r>
-          </w:p>
-        </w:tc>
-        <w:tc>
-          <w:tcPr>
-            <w:tcW w:type="dxa" w:w="3000"/>
-            <w:tcMar>
-              <w:top w:type="dxa" w:w="60"/>
-              <w:left w:type="dxa" w:w="100"/>
-              <w:bottom w:type="dxa" w:w="60"/>
-              <w:right w:type="dxa" w:w="100"/>
-            </w:tcMar>
-            <w:vAlign w:val="top"/>
-          </w:tcPr>
-          <w:p>
-            <w:pPr>
-              <w:spacing w:after="40" w:before="40"/>
-            </w:pPr>
-            <w:r>
-              <w:rPr>
-                <w:rFonts w:ascii="Arial" w:cs="Arial" w:eastAsia="Arial" w:hAnsi="Arial"/>
-                <w:i w:val="false"/>
-                <w:iCs w:val="false"/>
-                <w:color w:val="000000"/>
-                <w:sz w:val="18"/>
-                <w:szCs w:val="18"/>
-              </w:rPr>
-              <w:t xml:space="preserve">1.  Found in the closing text of FI ¶5.5.2(i), worded identically ("bridge-institution" defined identically at FI fn 13).</w:t>
-            </w:r>
-          </w:p>
-        </w:tc>
-      </w:tr>
-      <w:tr>
-        <w:tc>
-          <w:tcPr>
-            <w:tcW w:type="dxa" w:w="800"/>
-            <w:tcMar>
-              <w:top w:type="dxa" w:w="60"/>
-              <w:left w:type="dxa" w:w="100"/>
-              <w:bottom w:type="dxa" w:w="60"/>
-              <w:right w:type="dxa" w:w="100"/>
-            </w:tcMar>
-            <w:vAlign w:val="top"/>
-          </w:tcPr>
-          <w:p>
-            <w:pPr>
-              <w:spacing w:after="40" w:before="40"/>
-            </w:pPr>
-            <w:r>
-              <w:rPr>
-                <w:rFonts w:ascii="Arial" w:cs="Arial" w:eastAsia="Arial" w:hAnsi="Arial"/>
-                <w:i w:val="false"/>
-                <w:iCs w:val="false"/>
-                <w:color w:val="000000"/>
-                <w:sz w:val="18"/>
-                <w:szCs w:val="18"/>
-              </w:rPr>
-              <w:t xml:space="preserve">3.4.5</w:t>
-            </w:r>
-          </w:p>
-        </w:tc>
-        <w:tc>
-          <w:tcPr>
-            <w:tcW w:type="dxa" w:w="5300"/>
-            <w:tcMar>
-              <w:top w:type="dxa" w:w="60"/>
-              <w:left w:type="dxa" w:w="100"/>
-              <w:bottom w:type="dxa" w:w="60"/>
-              <w:right w:type="dxa" w:w="100"/>
-            </w:tcMar>
-            <w:vAlign w:val="top"/>
-          </w:tcPr>
-          <w:p>
-            <w:pPr>
-              <w:spacing w:after="40" w:before="40"/>
-            </w:pPr>
-            <w:r>
-              <w:rPr>
-                <w:rFonts w:ascii="Arial" w:cs="Arial" w:eastAsia="Arial" w:hAnsi="Arial"/>
-                <w:i w:val="false"/>
-                <w:iCs w:val="false"/>
-                <w:color w:val="000000"/>
-                <w:sz w:val="18"/>
-                <w:szCs w:val="18"/>
-                <w:highlight w:val="yellow"/>
-                <w:highlightCs w:val="yellow"/>
-              </w:rPr>
-              <w:t xml:space="preserve">For the purposes of paragraph 7.1(g) in the Notices, MAS will consider directing a Bank to terminate the contract, or to stop obtaining or receiving the MOORS15, when</w:t>
-            </w:r>
-            <w:r>
-              <w:rPr>
-                <w:rFonts w:ascii="Arial" w:cs="Arial" w:eastAsia="Arial" w:hAnsi="Arial"/>
-                <w:i w:val="false"/>
-                <w:iCs w:val="false"/>
-                <w:color w:val="000000"/>
-                <w:sz w:val="18"/>
-                <w:szCs w:val="18"/>
-              </w:rPr>
-              <w:t xml:space="preserve"> (a) circumstances referred to in paragraph 10.3 of the Notices arise and the service provider is unwilling or unable to remediate the issues; (b) the service provider is unable or unwilling to remediate issues and the Bank did not elect to terminate the outsourcing agreement of its own accord; (c) a Bank fails or is unable to demonstrate a satisfactory level of understanding of the nature and extent of risk arising from the MOORS; (d) a Bank fails or is unable to implement adequate measures to address the risks arising from its ongoing outsourced relevant services in a satisfactory and timely manner; (e) adverse developments arise from the MOORS that could impact a Bank; (f) </w:t>
-            </w:r>
-            <w:r>
-              <w:rPr>
-                <w:rFonts w:ascii="Arial" w:cs="Arial" w:eastAsia="Arial" w:hAnsi="Arial"/>
-                <w:i w:val="false"/>
-                <w:iCs w:val="false"/>
-                <w:color w:val="000000"/>
-                <w:sz w:val="18"/>
-                <w:szCs w:val="18"/>
-                <w:highlight w:val="yellow"/>
-                <w:highlightCs w:val="yellow"/>
-              </w:rPr>
-              <w:t xml:space="preserve">MAS or an auditor appointed by MAS, is prevented by the service provider from auditing the books, systems and premises of the service provider for any of the purposes mentioned in section 47A(10) of the Banking Act 1970 (the "Act")</w:t>
-            </w:r>
-            <w:r>
-              <w:rPr>
-                <w:rFonts w:ascii="Arial" w:cs="Arial" w:eastAsia="Arial" w:hAnsi="Arial"/>
-                <w:i w:val="false"/>
-                <w:iCs w:val="false"/>
-                <w:color w:val="000000"/>
-                <w:sz w:val="18"/>
-                <w:szCs w:val="18"/>
-              </w:rPr>
-              <w:t xml:space="preserve">; (g) where the sub-contracting agreement provides for the matter mentioned in paragraph 3.5.3(b)(iv), the Bank or any auditor appointed by the Bank, is prevented by the sub-contractor from auditing the books, systems and premises of the sub-contractor for any of the purposes mentioned in paragraph 3.5.3(b)(iv); or (h) where the sub-contracting agreement provides for the matter mentioned in paragraph 3.5.3(b)(v), the Bank, or any person appointed by the Bank, is prevented by the sub-contractor from obtaining any record, document, report or information relating to the sub-contracting arrangement.</w:t>
+              <w:t xml:space="preserve">10 – Refer to paragraph 5.7.</w:t>
             </w:r>
           </w:p>
           <w:p>
@@ -5945,6 +5948,513 @@
                 <w:sz w:val="14"/>
                 <w:szCs w:val="14"/>
               </w:rPr>
+              <w:t xml:space="preserve">11 – Refer to paragraph 5.8.</w:t>
+            </w:r>
+          </w:p>
+          <w:p>
+            <w:pPr>
+              <w:spacing w:after="40" w:before="40"/>
+            </w:pPr>
+            <w:r>
+              <w:rPr>
+                <w:rFonts w:ascii="Arial" w:cs="Arial" w:eastAsia="Arial" w:hAnsi="Arial"/>
+                <w:i w:val="false"/>
+                <w:iCs w:val="false"/>
+                <w:color w:val="595959"/>
+                <w:sz w:val="14"/>
+                <w:szCs w:val="14"/>
+              </w:rPr>
+              <w:t xml:space="preserve">12 – Refer to paragraph 5.9.</w:t>
+            </w:r>
+          </w:p>
+        </w:tc>
+        <w:tc>
+          <w:tcPr>
+            <w:tcW w:type="dxa" w:w="3000"/>
+            <w:tcMar>
+              <w:top w:type="dxa" w:w="60"/>
+              <w:left w:type="dxa" w:w="100"/>
+              <w:bottom w:type="dxa" w:w="60"/>
+              <w:right w:type="dxa" w:w="100"/>
+            </w:tcMar>
+            <w:vAlign w:val="top"/>
+          </w:tcPr>
+          <w:p>
+            <w:pPr>
+              <w:spacing w:after="40" w:before="40"/>
+            </w:pPr>
+            <w:r>
+              <w:rPr>
+                <w:rFonts w:ascii="Arial" w:cs="Arial" w:eastAsia="Arial" w:hAnsi="Arial"/>
+                <w:i w:val="false"/>
+                <w:iCs w:val="false"/>
+                <w:color w:val="000000"/>
+                <w:sz w:val="18"/>
+                <w:szCs w:val="18"/>
+              </w:rPr>
+              <w:t xml:space="preserve">1.  Same core checklist, found at FI ¶5.5.2, with three differences: (i) the FI list adds </w:t>
+            </w:r>
+            <w:r>
+              <w:rPr>
+                <w:rFonts w:ascii="Arial" w:cs="Arial" w:eastAsia="Arial" w:hAnsi="Arial"/>
+                <w:i w:val="false"/>
+                <w:iCs w:val="false"/>
+                <w:color w:val="000000"/>
+                <w:sz w:val="18"/>
+                <w:szCs w:val="18"/>
+                <w:highlight w:val="yellow"/>
+                <w:highlightCs w:val="yellow"/>
+              </w:rPr>
+              <w:t xml:space="preserve">item (j) sub-contracting</w:t>
+            </w:r>
+            <w:r>
+              <w:rPr>
+                <w:rFonts w:ascii="Arial" w:cs="Arial" w:eastAsia="Arial" w:hAnsi="Arial"/>
+                <w:i w:val="false"/>
+                <w:iCs w:val="false"/>
+                <w:color w:val="000000"/>
+                <w:sz w:val="18"/>
+                <w:szCs w:val="18"/>
+              </w:rPr>
+              <w:t xml:space="preserve"> (the Bank Guidelines deal with sub-contracting in a dedicated §3.5); (ii) Bank footnotes 9 and 12 require MOORS agreements to include the binding requirements of Notices ¶7.1(a)–(c) and ¶7.1(d) — no FI equivalent; (iii) the FI version expands "default termination and early exit" inline (see next row).</w:t>
+            </w:r>
+          </w:p>
+        </w:tc>
+      </w:tr>
+      <w:tr>
+        <w:tc>
+          <w:tcPr>
+            <w:tcW w:type="dxa" w:w="800"/>
+            <w:tcMar>
+              <w:top w:type="dxa" w:w="60"/>
+              <w:left w:type="dxa" w:w="100"/>
+              <w:bottom w:type="dxa" w:w="60"/>
+              <w:right w:type="dxa" w:w="100"/>
+            </w:tcMar>
+            <w:vAlign w:val="top"/>
+          </w:tcPr>
+          <w:p>
+            <w:pPr>
+              <w:spacing w:after="40" w:before="40"/>
+            </w:pPr>
+            <w:r>
+              <w:rPr>
+                <w:rFonts w:ascii="Arial" w:cs="Arial" w:eastAsia="Arial" w:hAnsi="Arial"/>
+                <w:i w:val="false"/>
+                <w:iCs w:val="false"/>
+                <w:color w:val="000000"/>
+                <w:sz w:val="18"/>
+                <w:szCs w:val="18"/>
+              </w:rPr>
+              <w:t xml:space="preserve">3.4.3</w:t>
+            </w:r>
+          </w:p>
+        </w:tc>
+        <w:tc>
+          <w:tcPr>
+            <w:tcW w:type="dxa" w:w="5300"/>
+            <w:tcMar>
+              <w:top w:type="dxa" w:w="60"/>
+              <w:left w:type="dxa" w:w="100"/>
+              <w:bottom w:type="dxa" w:w="60"/>
+              <w:right w:type="dxa" w:w="100"/>
+            </w:tcMar>
+            <w:vAlign w:val="top"/>
+          </w:tcPr>
+          <w:p>
+            <w:pPr>
+              <w:spacing w:after="40" w:before="40"/>
+            </w:pPr>
+            <w:r>
+              <w:rPr>
+                <w:rFonts w:ascii="Arial" w:cs="Arial" w:eastAsia="Arial" w:hAnsi="Arial"/>
+                <w:i w:val="false"/>
+                <w:iCs w:val="false"/>
+                <w:color w:val="000000"/>
+                <w:sz w:val="18"/>
+                <w:szCs w:val="18"/>
+              </w:rPr>
+              <w:t xml:space="preserve">A Bank should have the right to terminate the outsourcing agreement in the event of default, or under any of the following circumstances: </w:t>
+            </w:r>
+            <w:r>
+              <w:rPr>
+                <w:rFonts w:ascii="Arial" w:cs="Arial" w:eastAsia="Arial" w:hAnsi="Arial"/>
+                <w:i w:val="false"/>
+                <w:iCs w:val="false"/>
+                <w:color w:val="000000"/>
+                <w:sz w:val="18"/>
+                <w:szCs w:val="18"/>
+                <w:highlight w:val="yellow"/>
+                <w:highlightCs w:val="yellow"/>
+              </w:rPr>
+              <w:t xml:space="preserve">(a) by giving reasonable notice to the service provider; (b) if the service provider or a sub-contractor, as the case may be, failed to safeguard the confidentiality or integrity of customer information of the Bank; or (c) if there has been a demonstrable deterioration in the ability of the service provider or a sub-contractor to safeguard the confidentiality of customer information.</w:t>
+            </w:r>
+          </w:p>
+        </w:tc>
+        <w:tc>
+          <w:tcPr>
+            <w:tcW w:type="dxa" w:w="5300"/>
+            <w:tcMar>
+              <w:top w:type="dxa" w:w="60"/>
+              <w:left w:type="dxa" w:w="100"/>
+              <w:bottom w:type="dxa" w:w="60"/>
+              <w:right w:type="dxa" w:w="100"/>
+            </w:tcMar>
+            <w:vAlign w:val="top"/>
+          </w:tcPr>
+          <w:p>
+            <w:pPr>
+              <w:spacing w:after="40" w:before="40"/>
+            </w:pPr>
+            <w:r>
+              <w:rPr>
+                <w:rFonts w:ascii="Arial" w:cs="Arial" w:eastAsia="Arial" w:hAnsi="Arial"/>
+                <w:b/>
+                <w:bCs/>
+                <w:i w:val="false"/>
+                <w:iCs w:val="false"/>
+                <w:color w:val="000000"/>
+                <w:sz w:val="18"/>
+                <w:szCs w:val="18"/>
+              </w:rPr>
+              <w:t xml:space="preserve">[¶5.5.2(i)]</w:t>
+            </w:r>
+            <w:r>
+              <w:rPr>
+                <w:rFonts w:ascii="Arial" w:cs="Arial" w:eastAsia="Arial" w:hAnsi="Arial"/>
+                <w:i w:val="false"/>
+                <w:iCs w:val="false"/>
+                <w:color w:val="000000"/>
+                <w:sz w:val="18"/>
+                <w:szCs w:val="18"/>
+              </w:rPr>
+              <w:t xml:space="preserve"> An institution should, have the right to terminate the outsourcing agreement in the event of default, or under circumstances where: </w:t>
+            </w:r>
+            <w:r>
+              <w:rPr>
+                <w:rFonts w:ascii="Arial" w:cs="Arial" w:eastAsia="Arial" w:hAnsi="Arial"/>
+                <w:i w:val="false"/>
+                <w:iCs w:val="false"/>
+                <w:color w:val="000000"/>
+                <w:sz w:val="18"/>
+                <w:szCs w:val="18"/>
+                <w:highlight w:val="yellow"/>
+                <w:highlightCs w:val="yellow"/>
+              </w:rPr>
+              <w:t xml:space="preserve">(i) the service provider undergoes a change in ownership; (ii) the service provider becomes insolvent or goes into liquidation; (iii) the service provider goes into receivership or judicial management whether in Singapore or elsewhere; (iv) there has been a breach of security or confidentiality; or (v) there is a demonstrable deterioration in the ability of the service provider to perform the contracted service.</w:t>
+            </w:r>
+          </w:p>
+        </w:tc>
+        <w:tc>
+          <w:tcPr>
+            <w:tcW w:type="dxa" w:w="3000"/>
+            <w:tcMar>
+              <w:top w:type="dxa" w:w="60"/>
+              <w:left w:type="dxa" w:w="100"/>
+              <w:bottom w:type="dxa" w:w="60"/>
+              <w:right w:type="dxa" w:w="100"/>
+            </w:tcMar>
+            <w:vAlign w:val="top"/>
+          </w:tcPr>
+          <w:p>
+            <w:pPr>
+              <w:spacing w:after="40" w:before="40"/>
+            </w:pPr>
+            <w:r>
+              <w:rPr>
+                <w:rFonts w:ascii="Arial" w:cs="Arial" w:eastAsia="Arial" w:hAnsi="Arial"/>
+                <w:i w:val="false"/>
+                <w:iCs w:val="false"/>
+                <w:color w:val="000000"/>
+                <w:sz w:val="18"/>
+                <w:szCs w:val="18"/>
+              </w:rPr>
+              <w:t xml:space="preserve">1.  Materially different trigger lists. The FI version keeps the traditional corporate-event triggers (change of ownership; insolvency/liquidation; receivership/judicial management) and a service-performance trigger; the Bank list is confidentiality-centred (extending expressly to sub-contractor failures) and adds a no-fault reasonable-notice right.</w:t>
+            </w:r>
+          </w:p>
+          <w:p>
+            <w:pPr>
+              <w:spacing w:after="40" w:before="40"/>
+            </w:pPr>
+            <w:r>
+              <w:rPr>
+                <w:rFonts w:ascii="Arial" w:cs="Arial" w:eastAsia="Arial" w:hAnsi="Arial"/>
+                <w:i w:val="false"/>
+                <w:iCs w:val="false"/>
+                <w:color w:val="000000"/>
+                <w:sz w:val="18"/>
+                <w:szCs w:val="18"/>
+              </w:rPr>
+              <w:t xml:space="preserve">2.  The Bank Guidelines recite no corporate-event triggers — banks’ binding contractual requirements are prescribed by Notices ¶7.1, whose full content the Guidelines do not reproduce. On the face of the two Guidelines, the FI list is the broader one.</w:t>
+            </w:r>
+          </w:p>
+        </w:tc>
+      </w:tr>
+      <w:tr>
+        <w:tc>
+          <w:tcPr>
+            <w:tcW w:type="dxa" w:w="800"/>
+            <w:tcMar>
+              <w:top w:type="dxa" w:w="60"/>
+              <w:left w:type="dxa" w:w="100"/>
+              <w:bottom w:type="dxa" w:w="60"/>
+              <w:right w:type="dxa" w:w="100"/>
+            </w:tcMar>
+            <w:vAlign w:val="top"/>
+          </w:tcPr>
+          <w:p>
+            <w:pPr>
+              <w:spacing w:after="40" w:before="40"/>
+            </w:pPr>
+            <w:r>
+              <w:rPr>
+                <w:rFonts w:ascii="Arial" w:cs="Arial" w:eastAsia="Arial" w:hAnsi="Arial"/>
+                <w:i w:val="false"/>
+                <w:iCs w:val="false"/>
+                <w:color w:val="000000"/>
+                <w:sz w:val="18"/>
+                <w:szCs w:val="18"/>
+              </w:rPr>
+              <w:t xml:space="preserve">3.4.4</w:t>
+            </w:r>
+          </w:p>
+        </w:tc>
+        <w:tc>
+          <w:tcPr>
+            <w:tcW w:type="dxa" w:w="5300"/>
+            <w:tcMar>
+              <w:top w:type="dxa" w:w="60"/>
+              <w:left w:type="dxa" w:w="100"/>
+              <w:bottom w:type="dxa" w:w="60"/>
+              <w:right w:type="dxa" w:w="100"/>
+            </w:tcMar>
+            <w:vAlign w:val="top"/>
+          </w:tcPr>
+          <w:p>
+            <w:pPr>
+              <w:spacing w:after="40" w:before="40"/>
+            </w:pPr>
+            <w:r>
+              <w:rPr>
+                <w:rFonts w:ascii="Arial" w:cs="Arial" w:eastAsia="Arial" w:hAnsi="Arial"/>
+                <w:i w:val="false"/>
+                <w:iCs w:val="false"/>
+                <w:color w:val="000000"/>
+                <w:sz w:val="18"/>
+                <w:szCs w:val="18"/>
+              </w:rPr>
+              <w:t xml:space="preserve">The minimum period to execute a termination provision should be specified in the outsourcing agreement. Other provisions should also be put in place to ensure a smooth transition when the agreement is terminated or being amended. Such provisions may facilitate transferability of the outsourced services to a bridge-institution14 or a third party. Where the outsourcing agreement involves an intra-group entity, the agreement should be legally enforceable against the intra-group entity providing the outsourced service.</w:t>
+            </w:r>
+          </w:p>
+          <w:p>
+            <w:pPr>
+              <w:spacing w:after="40" w:before="40"/>
+            </w:pPr>
+            <w:r>
+              <w:rPr>
+                <w:rFonts w:ascii="Arial" w:cs="Arial" w:eastAsia="Arial" w:hAnsi="Arial"/>
+                <w:i w:val="false"/>
+                <w:iCs w:val="false"/>
+                <w:color w:val="595959"/>
+                <w:sz w:val="14"/>
+                <w:szCs w:val="14"/>
+              </w:rPr>
+              <w:t xml:space="preserve">14 – "bridge-institution" means an institution, whether incorporated in Singapore or outside Singapore, to temporarily take over and maintain certain assets, liabilities and operations of a distressed financial institution, as part of a resolution Authority's exercise of a resolution.</w:t>
+            </w:r>
+          </w:p>
+        </w:tc>
+        <w:tc>
+          <w:tcPr>
+            <w:tcW w:type="dxa" w:w="5300"/>
+            <w:tcMar>
+              <w:top w:type="dxa" w:w="60"/>
+              <w:left w:type="dxa" w:w="100"/>
+              <w:bottom w:type="dxa" w:w="60"/>
+              <w:right w:type="dxa" w:w="100"/>
+            </w:tcMar>
+            <w:vAlign w:val="top"/>
+          </w:tcPr>
+          <w:p>
+            <w:pPr>
+              <w:spacing w:after="40" w:before="40"/>
+            </w:pPr>
+            <w:r>
+              <w:rPr>
+                <w:rFonts w:ascii="Arial" w:cs="Arial" w:eastAsia="Arial" w:hAnsi="Arial"/>
+                <w:b/>
+                <w:bCs/>
+                <w:i w:val="false"/>
+                <w:iCs w:val="false"/>
+                <w:color w:val="000000"/>
+                <w:sz w:val="18"/>
+                <w:szCs w:val="18"/>
+              </w:rPr>
+              <w:t xml:space="preserve">[¶5.5.2(i) (closing text)]</w:t>
+            </w:r>
+            <w:r>
+              <w:rPr>
+                <w:rFonts w:ascii="Arial" w:cs="Arial" w:eastAsia="Arial" w:hAnsi="Arial"/>
+                <w:i w:val="false"/>
+                <w:iCs w:val="false"/>
+                <w:color w:val="000000"/>
+                <w:sz w:val="18"/>
+                <w:szCs w:val="18"/>
+              </w:rPr>
+              <w:t xml:space="preserve"> The minimum period to execute a termination provision should be specified in the outsourcing agreement. Other provisions should also be put in place to ensure a smooth transition when the agreement is terminated or being amended. Such provisions may facilitate transferability of the outsourced services to a bridge-institution14 or a third party. Where the outsourcing agreement involves an intra-group entity, the agreement should be legally enforceable against the intra-group entity providing the outsourced service.</w:t>
+            </w:r>
+          </w:p>
+          <w:p>
+            <w:pPr>
+              <w:spacing w:after="40" w:before="40"/>
+            </w:pPr>
+            <w:r>
+              <w:rPr>
+                <w:rFonts w:ascii="Arial" w:cs="Arial" w:eastAsia="Arial" w:hAnsi="Arial"/>
+                <w:i w:val="false"/>
+                <w:iCs w:val="false"/>
+                <w:color w:val="595959"/>
+                <w:sz w:val="14"/>
+                <w:szCs w:val="14"/>
+              </w:rPr>
+              <w:t xml:space="preserve">14 – "bridge-institution" means an institution, whether incorporated in Singapore or outside Singapore, to temporarily take over and maintain certain assets, liabilities and operations of a distressed financial institution, as part of a resolution Authority's exercise of a resolution.</w:t>
+            </w:r>
+          </w:p>
+        </w:tc>
+        <w:tc>
+          <w:tcPr>
+            <w:tcW w:type="dxa" w:w="3000"/>
+            <w:tcMar>
+              <w:top w:type="dxa" w:w="60"/>
+              <w:left w:type="dxa" w:w="100"/>
+              <w:bottom w:type="dxa" w:w="60"/>
+              <w:right w:type="dxa" w:w="100"/>
+            </w:tcMar>
+            <w:vAlign w:val="top"/>
+          </w:tcPr>
+          <w:p>
+            <w:pPr>
+              <w:spacing w:after="40" w:before="40"/>
+            </w:pPr>
+            <w:r>
+              <w:rPr>
+                <w:rFonts w:ascii="Arial" w:cs="Arial" w:eastAsia="Arial" w:hAnsi="Arial"/>
+                <w:i w:val="false"/>
+                <w:iCs w:val="false"/>
+                <w:color w:val="000000"/>
+                <w:sz w:val="18"/>
+                <w:szCs w:val="18"/>
+              </w:rPr>
+              <w:t xml:space="preserve">1.  Found in the closing text of FI ¶5.5.2(i), worded identically ("bridge-institution" defined identically at FI fn 13).</w:t>
+            </w:r>
+          </w:p>
+        </w:tc>
+      </w:tr>
+      <w:tr>
+        <w:tc>
+          <w:tcPr>
+            <w:tcW w:type="dxa" w:w="800"/>
+            <w:tcMar>
+              <w:top w:type="dxa" w:w="60"/>
+              <w:left w:type="dxa" w:w="100"/>
+              <w:bottom w:type="dxa" w:w="60"/>
+              <w:right w:type="dxa" w:w="100"/>
+            </w:tcMar>
+            <w:vAlign w:val="top"/>
+          </w:tcPr>
+          <w:p>
+            <w:pPr>
+              <w:spacing w:after="40" w:before="40"/>
+            </w:pPr>
+            <w:r>
+              <w:rPr>
+                <w:rFonts w:ascii="Arial" w:cs="Arial" w:eastAsia="Arial" w:hAnsi="Arial"/>
+                <w:i w:val="false"/>
+                <w:iCs w:val="false"/>
+                <w:color w:val="000000"/>
+                <w:sz w:val="18"/>
+                <w:szCs w:val="18"/>
+              </w:rPr>
+              <w:t xml:space="preserve">3.4.5</w:t>
+            </w:r>
+          </w:p>
+        </w:tc>
+        <w:tc>
+          <w:tcPr>
+            <w:tcW w:type="dxa" w:w="5300"/>
+            <w:tcMar>
+              <w:top w:type="dxa" w:w="60"/>
+              <w:left w:type="dxa" w:w="100"/>
+              <w:bottom w:type="dxa" w:w="60"/>
+              <w:right w:type="dxa" w:w="100"/>
+            </w:tcMar>
+            <w:vAlign w:val="top"/>
+          </w:tcPr>
+          <w:p>
+            <w:pPr>
+              <w:spacing w:after="40" w:before="40"/>
+            </w:pPr>
+            <w:r>
+              <w:rPr>
+                <w:rFonts w:ascii="Arial" w:cs="Arial" w:eastAsia="Arial" w:hAnsi="Arial"/>
+                <w:i w:val="false"/>
+                <w:iCs w:val="false"/>
+                <w:color w:val="000000"/>
+                <w:sz w:val="18"/>
+                <w:szCs w:val="18"/>
+                <w:highlight w:val="yellow"/>
+                <w:highlightCs w:val="yellow"/>
+              </w:rPr>
+              <w:t xml:space="preserve">For the purposes of paragraph 7.1(g) in the Notices, MAS will consider directing a Bank to terminate the contract, or to stop obtaining or receiving the MOORS15, when</w:t>
+            </w:r>
+            <w:r>
+              <w:rPr>
+                <w:rFonts w:ascii="Arial" w:cs="Arial" w:eastAsia="Arial" w:hAnsi="Arial"/>
+                <w:i w:val="false"/>
+                <w:iCs w:val="false"/>
+                <w:color w:val="000000"/>
+                <w:sz w:val="18"/>
+                <w:szCs w:val="18"/>
+              </w:rPr>
+              <w:t xml:space="preserve"> (a) circumstances referred to in paragraph 10.3 of the Notices arise and the service provider is unwilling or unable to remediate the issues; (b) the service provider is unable or unwilling to remediate issues and the Bank did not elect to terminate the outsourcing agreement of its own accord; (c) a Bank fails or is unable to demonstrate a satisfactory level of understanding of the nature and extent of risk arising from the MOORS; (d) a Bank fails or is unable to implement adequate measures to address the risks arising from its ongoing outsourced relevant services in a satisfactory and timely manner; (e) adverse developments arise from the MOORS that could impact a Bank; (f) </w:t>
+            </w:r>
+            <w:r>
+              <w:rPr>
+                <w:rFonts w:ascii="Arial" w:cs="Arial" w:eastAsia="Arial" w:hAnsi="Arial"/>
+                <w:i w:val="false"/>
+                <w:iCs w:val="false"/>
+                <w:color w:val="000000"/>
+                <w:sz w:val="18"/>
+                <w:szCs w:val="18"/>
+                <w:highlight w:val="yellow"/>
+                <w:highlightCs w:val="yellow"/>
+              </w:rPr>
+              <w:t xml:space="preserve">MAS or an auditor appointed by MAS, is prevented by the service provider from auditing the books, systems and premises of the service provider for any of the purposes mentioned in section 47A(10) of the Banking Act 1970 (the "Act")</w:t>
+            </w:r>
+            <w:r>
+              <w:rPr>
+                <w:rFonts w:ascii="Arial" w:cs="Arial" w:eastAsia="Arial" w:hAnsi="Arial"/>
+                <w:i w:val="false"/>
+                <w:iCs w:val="false"/>
+                <w:color w:val="000000"/>
+                <w:sz w:val="18"/>
+                <w:szCs w:val="18"/>
+              </w:rPr>
+              <w:t xml:space="preserve">; (g) where the sub-contracting agreement provides for the matter mentioned in paragraph 3.5.3(b)(iv), the Bank or any auditor appointed by the Bank, is prevented by the sub-contractor from auditing the books, systems and premises of the sub-contractor for any of the purposes mentioned in paragraph 3.5.3(b)(iv); or (h) where the sub-contracting agreement provides for the matter mentioned in paragraph 3.5.3(b)(v), the Bank, or any person appointed by the Bank, is prevented by the sub-contractor from obtaining any record, document, report or information relating to the sub-contracting arrangement.</w:t>
+            </w:r>
+          </w:p>
+          <w:p>
+            <w:pPr>
+              <w:spacing w:after="40" w:before="40"/>
+            </w:pPr>
+            <w:r>
+              <w:rPr>
+                <w:rFonts w:ascii="Arial" w:cs="Arial" w:eastAsia="Arial" w:hAnsi="Arial"/>
+                <w:i w:val="false"/>
+                <w:iCs w:val="false"/>
+                <w:color w:val="595959"/>
+                <w:sz w:val="14"/>
+                <w:szCs w:val="14"/>
+              </w:rPr>
               <w:t xml:space="preserve">15 – MAS will only direct Banks to terminate outsourcing agreements for MOORS as a last resort. Banks do not have to exercise the termination rights if they are able to work with the service provider to remediate the issues giving rise to the ground(s) for termination.</w:t>
             </w:r>
           </w:p>
@@ -8684,7 +9194,7 @@
                 <w:sz w:val="18"/>
                 <w:szCs w:val="18"/>
               </w:rPr>
-              <w:t xml:space="preserve">: (a) Maintain a register of outsourcing arrangements … </w:t>
+              <w:t xml:space="preserve">: (a) Maintain a register of outsourcing arrangements and ensure that the register is readily accessible for review by the board and senior management of the institution. </w:t>
             </w:r>
             <w:r>
               <w:rPr>
@@ -8708,7 +9218,7 @@
                 <w:sz w:val="18"/>
                 <w:szCs w:val="18"/>
               </w:rPr>
-              <w:t xml:space="preserve"> [otherwise as per Bank item (a), cross-referring ¶5.2]; (b)–(c) [as per Bank items (b)–(c), addressee adjusted]; </w:t>
+              <w:t xml:space="preserve"> The register should be updated promptly and form part of the oversight and governance reviews undertaken by the board and senior management of the institution, similar to those described in paragraph 5.2; (b) Establish multi-disciplinary outsourcing management groups with members from different risk and internal control functions including legal, compliance and finance, to ensure that all relevant technical issues and legal and regulatory requirements are met. The institution should allocate sufficient resources, in terms of both time and skilled manpower, to the management groups to enable its staff to adequately plan and oversee the entire outsourcing lifecycle; (c) Establish outsourcing management control groups to monitor and control the outsourced service on an ongoing basis. There should be policies and procedures to monitor service delivery and the confidentiality and security of customer information, for the purpose of gauging ongoing compliance with agreed service levels and the viability of the institution's operations. Such monitoring should be regular and validated through the review of reports by auditors of the service provider or audits commissioned by the institution; </w:t>
             </w:r>
             <w:r>
               <w:rPr>
@@ -8732,7 +9242,23 @@
                 <w:sz w:val="18"/>
                 <w:szCs w:val="18"/>
               </w:rPr>
-              <w:t xml:space="preserve"> (e) Reporting policies and procedures [as per Bank item (d)]; and (f) Perform comprehensive pre- and post- implementation reviews … [as per Bank item (e)].</w:t>
+              <w:t xml:space="preserve"> (e) Reporting policies and procedures — Reports on the monitoring and control activities of the institution should be reviewed by its senior management16 and provided to the board for information. The institution should ensure that monitoring metrics and performance data are not aggregated with those belonging to other customers of the service provider. The institution should also ensure that any adverse development arising in any outsourcing arrangement is brought to the attention of the senior management of the institution and service provider, or to the institution's board, where warranted, on a timely basis. When adverse development occurs, prompt actions should be taken by an institution to review the outsourcing relationship for modification or termination of the agreement; and (f) Perform comprehensive pre- and post- implementation reviews of new outsourcing arrangements or when amendments are made to the outsourcing arrangements. If an outsourcing arrangement is materially amended, a comprehensive due diligence of the outsourcing arrangement should also be conducted.</w:t>
+            </w:r>
+          </w:p>
+          <w:p>
+            <w:pPr>
+              <w:spacing w:after="40" w:before="40"/>
+            </w:pPr>
+            <w:r>
+              <w:rPr>
+                <w:rFonts w:ascii="Arial" w:cs="Arial" w:eastAsia="Arial" w:hAnsi="Arial"/>
+                <w:i w:val="false"/>
+                <w:iCs w:val="false"/>
+                <w:color w:val="595959"/>
+                <w:sz w:val="14"/>
+                <w:szCs w:val="14"/>
+              </w:rPr>
+              <w:t xml:space="preserve">16 – Refer to paragraph 5.2.3.</w:t>
             </w:r>
           </w:p>
         </w:tc>
@@ -10720,7 +11246,7 @@
                 <w:sz w:val="18"/>
                 <w:szCs w:val="18"/>
               </w:rPr>
-              <w:t xml:space="preserve"> Material outsourcing arrangements with service providers located outside Singapore should be conducted in a manner so as not to hinder MAS' efforts to supervise the Singapore business activities of the institution (i.e., from its books, accounts and documents) in a timely manner, in particular: (a) [as per Bank item (a)]. (b) [as per Bank item (b), plus:] </w:t>
+              <w:t xml:space="preserve"> Material outsourcing arrangements with service providers located outside Singapore should be conducted in a manner so as not to hinder MAS' efforts to supervise the Singapore business activities of the institution (i.e., from its books, accounts and documents) in a timely manner, in particular: (a) An institution should, in principle, enter into outsourcing arrangements only with service providers operating in jurisdictions that generally uphold confidentiality clauses and agreements. (b) An institution should not enter into outsourcing arrangements with service providers in jurisdictions where prompt access to information by MAS or agents appointed by MAS to act on its behalf, at the service provider, may be impeded by legal or administrative restrictions. An institution must at least commit to retrieve information readily from the service provider should MAS request for such information. </w:t>
             </w:r>
             <w:r>
               <w:rPr>
@@ -11458,16 +11984,32 @@
                 <w:sz w:val="18"/>
                 <w:szCs w:val="18"/>
               </w:rPr>
-              <w:t xml:space="preserve"> [Body text identical to the Bank provision, addressee adjusted.] Footnote 20: "Any departure from this best practice should be </w:t>
-            </w:r>
-            <w:r>
-              <w:rPr>
-                <w:rFonts w:ascii="Arial" w:cs="Arial" w:eastAsia="Arial" w:hAnsi="Arial"/>
-                <w:i w:val="false"/>
-                <w:iCs w:val="false"/>
-                <w:color w:val="000000"/>
-                <w:sz w:val="18"/>
-                <w:szCs w:val="18"/>
+              <w:t xml:space="preserve"> Where the outsourced service is the internal audit function of an institution, there are additional issues that an institution should deliberate upon. One of these is the lack of independence or the appearance of impaired independence, when a service provider is handling multiple engagements for an institution, such as internal and external audits, and consulting work. There is doubt that the service provider, in its internal audit role, would criticise itself for the quality of the external audit or consultancy services provided to the institution. In addition, as operations of an institution could be complex and involve large transaction volumes and amounts, it should ensure service providers have the expertise to adequately complete the engagement. An institution should address these and other relevant issues before outsourcing the internal audit function. In addition, as a sound practice, institutions should not outsource their internal audit function to the institution's external audit firm20.</w:t>
+            </w:r>
+          </w:p>
+          <w:p>
+            <w:pPr>
+              <w:spacing w:after="40" w:before="40"/>
+            </w:pPr>
+            <w:r>
+              <w:rPr>
+                <w:rFonts w:ascii="Arial" w:cs="Arial" w:eastAsia="Arial" w:hAnsi="Arial"/>
+                <w:i w:val="false"/>
+                <w:iCs w:val="false"/>
+                <w:color w:val="595959"/>
+                <w:sz w:val="14"/>
+                <w:szCs w:val="14"/>
+              </w:rPr>
+              <w:t xml:space="preserve">20 – Any departure from this best practice should be </w:t>
+            </w:r>
+            <w:r>
+              <w:rPr>
+                <w:rFonts w:ascii="Arial" w:cs="Arial" w:eastAsia="Arial" w:hAnsi="Arial"/>
+                <w:i w:val="false"/>
+                <w:iCs w:val="false"/>
+                <w:color w:val="595959"/>
+                <w:sz w:val="14"/>
+                <w:szCs w:val="14"/>
                 <w:highlight w:val="yellow"/>
                 <w:highlightCs w:val="yellow"/>
               </w:rPr>
@@ -11478,11 +12020,11 @@
                 <w:rFonts w:ascii="Arial" w:cs="Arial" w:eastAsia="Arial" w:hAnsi="Arial"/>
                 <w:i w:val="false"/>
                 <w:iCs w:val="false"/>
-                <w:color w:val="000000"/>
-                <w:sz w:val="18"/>
-                <w:szCs w:val="18"/>
-              </w:rPr>
-              <w:t xml:space="preserve"> and should remain within the bounds of the applicable ethical standards for the statutory or external auditor."</w:t>
+                <w:color w:val="595959"/>
+                <w:sz w:val="14"/>
+                <w:szCs w:val="14"/>
+              </w:rPr>
+              <w:t xml:space="preserve"> and should remain within the bounds of the applicable ethical standards for the statutory or external auditor.</w:t>
             </w:r>
           </w:p>
         </w:tc>
@@ -12117,18 +12659,18 @@
                 <w:sz w:val="18"/>
                 <w:szCs w:val="18"/>
               </w:rPr>
-              <w:t xml:space="preserve">Cloud Computing</w:t>
-            </w:r>
-            <w:r>
-              <w:rPr>
-                <w:rFonts w:ascii="Arial" w:cs="Arial" w:eastAsia="Arial" w:hAnsi="Arial"/>
-                <w:i w:val="false"/>
-                <w:iCs w:val="false"/>
-                <w:color w:val="000000"/>
-                <w:sz w:val="18"/>
-                <w:szCs w:val="18"/>
-              </w:rPr>
-              <w:t xml:space="preserve"> (¶¶1–8). Cloud services (CS) as a combination of business and delivery model (SaaS/PaaS/IaaS); advantages (economies of scale, cost savings, quality administration, uniform security standards, scalability, resilience); private/public/hybrid models with distinct trade-offs; maturing provider security (strong authentication, access controls, tokenisation, encryption); </w:t>
+              <w:t xml:space="preserve">Cloud Computing.</w:t>
+            </w:r>
+            <w:r>
+              <w:rPr>
+                <w:rFonts w:ascii="Arial" w:cs="Arial" w:eastAsia="Arial" w:hAnsi="Arial"/>
+                <w:i w:val="false"/>
+                <w:iCs w:val="false"/>
+                <w:color w:val="000000"/>
+                <w:sz w:val="18"/>
+                <w:szCs w:val="18"/>
+              </w:rPr>
+              <w:t xml:space="preserve"> 1. Cloud services (CS) are a combination of a business and delivery model that enable on-demand access to a shared pool of resources such as applications, servers, storage and network security. The service is typically delivered in the form of Software as a Service (SaaS), Platform as a Service (PaaS) and Infrastructure as a Service (IaaS). 2. CS can potentially offer a number of advantages, which include economies of scale, cost-savings, access to quality system administration as well as operations that adhere to uniform security standards and best practices. CS may also be used to provide the flexibility and agility for Banks to scale up or pare down on computing resources quickly as usage requirements change, without major hardware and software outlay as well as lead-time. In addition, the distributed nature of CS may enhance system resilience during location-specific disasters or disruptions. 3. It has been noted that more and more Banks are adopting CS to fulfil their business and operational requirements. These CS deployments may be operated in-house or off-premises by service providers. While the latter can take the form of a private27 or public28 cloud, there is a growing trend for Banks to adopt a combination of private and public clouds to create a hybrid cloud. The different cloud models provide for distinct operational and security trade-offs. 4. In the recent years, cloud technology has evolved and matured considerably and CS providers have become aware of the technology and security requirements of Banks to protect sensitive customer data. In this regard, a number of CS providers have implemented strong authentication, access controls, tokenisation techniques and data encryption to bolster security to meet Banks' requirements. 5. </w:t>
             </w:r>
             <w:r>
               <w:rPr>
@@ -12152,7 +12694,39 @@
                 <w:sz w:val="18"/>
                 <w:szCs w:val="18"/>
               </w:rPr>
-              <w:t xml:space="preserve">; CS risks are not distinct from other outsourcing — apply the Guidelines' due diligence and governance; be aware of multi-tenancy, data commingling and multi-location processing — address data access, confidentiality, integrity, sovereignty, recoverability, regulatory compliance and auditing; ensure the service provider can clearly identify and segregate customer data using strong physical or logical controls, with robust access controls that survive the tenure of the contract; Banks remain ultimately responsible and accountable, with risk-based oversight commensurate with materiality. [Abridged; the full text is reproduced identically in both instruments.]</w:t>
+              <w:t xml:space="preserve"> and recognises that Banks may leverage on such a service to enhance their operations and service efficiency while reaping the benefits of CS' scalable, standardised and secured infrastructure. 6. The types of risks in CS that confront Banks are not distinct from that of other forms of outsourcing arrangements. Banks should perform the necessary due diligence and apply sound governance and risk management practices articulated in this set of Guidelines when subscribing to CS. 7. Banks should be aware of CS' typical characteristics such as multi-tenancy, data commingling and the higher propensity for processing to be carried out in multiple locations. Hence, Banks should take active steps to address the risks associated with data access, confidentiality, integrity, sovereignty, recoverability, regulatory compliance and auditing. In particular, Banks should ensure that the service provider possesses the ability to clearly identify and segregate customer data using strong physical or logical controls. The service provider should have in place robust access controls to protect customer information and such access controls should survive the tenure of the contract of the CS. 8. Banks are ultimately responsible and accountable for maintaining oversight of CS and managing the attendant risks of adopting CS, as in any other form of outsourcing arrangements. A risk-based approach should be taken by Banks to ensure that the level of oversight and controls are commensurate with the materiality of the risks posed by the CS.</w:t>
+            </w:r>
+          </w:p>
+          <w:p>
+            <w:pPr>
+              <w:spacing w:after="40" w:before="40"/>
+            </w:pPr>
+            <w:r>
+              <w:rPr>
+                <w:rFonts w:ascii="Arial" w:cs="Arial" w:eastAsia="Arial" w:hAnsi="Arial"/>
+                <w:i w:val="false"/>
+                <w:iCs w:val="false"/>
+                <w:color w:val="595959"/>
+                <w:sz w:val="14"/>
+                <w:szCs w:val="14"/>
+              </w:rPr>
+              <w:t xml:space="preserve">27 – A cloud infrastructure operated solely for an organisation.</w:t>
+            </w:r>
+          </w:p>
+          <w:p>
+            <w:pPr>
+              <w:spacing w:after="40" w:before="40"/>
+            </w:pPr>
+            <w:r>
+              <w:rPr>
+                <w:rFonts w:ascii="Arial" w:cs="Arial" w:eastAsia="Arial" w:hAnsi="Arial"/>
+                <w:i w:val="false"/>
+                <w:iCs w:val="false"/>
+                <w:color w:val="595959"/>
+                <w:sz w:val="14"/>
+                <w:szCs w:val="14"/>
+              </w:rPr>
+              <w:t xml:space="preserve">28 – A cloud infrastructure made available to the general public or an industry group, and is owned by a third-party service provider.</w:t>
             </w:r>
           </w:p>
         </w:tc>
@@ -12206,18 +12780,25 @@
                 <w:highlight w:val="yellow"/>
                 <w:highlightCs w:val="yellow"/>
               </w:rPr>
-              <w:t xml:space="preserve">1. Examples of services that, when performed by a third party, would be regarded as outsourcing arrangements (non-exhaustive): (a) application processing (e.g. loan origination, credit cards); (b) white-labelling arrangements; (c) middle and back office operations; (d) business continuity and disaster recovery functions; (e) claims administration; (f) document processing; (g) information systems hosting (SaaS/PaaS/IaaS); (h) information systems management and maintenance; (i) investment management; (j) management of policy issuance and claims operations by managing agents; (k) manpower management; (l) marketing and research; (m) professional services related to the business activities of the institution (e.g. accounting, internal audit, actuarial, compliance); (n) support services related to archival, storage and destruction of data and records; and (o) calculation of financial benchmarks. 2. Arrangements generally NOT considered outsourcing: (a) industry-characteristic third-party services (custody with specified custodians under SF(LCB)R reg 27; telecommunications and public utilities; postal services; market information services (Bloomberg, Moody's, S&amp;P); common network infrastructure (Visa, MasterCard, MEPS+); clearing and settlement arrangements; regulator-overseen global financial messaging (SWIFT); correspondent banking); (b) introducer arrangements and principal-agent relationships (insurance agents, underwriting agents, introducers); (c) arrangements the institution is not legally or administratively able to provide (statutory audit and independent audit assessments; discrete advisory services; independent consulting).</w:t>
-            </w:r>
-            <w:r>
-              <w:rPr>
-                <w:rFonts w:ascii="Arial" w:cs="Arial" w:eastAsia="Arial" w:hAnsi="Arial"/>
-                <w:i w:val="false"/>
-                <w:iCs w:val="false"/>
-                <w:color w:val="000000"/>
-                <w:sz w:val="18"/>
-                <w:szCs w:val="18"/>
-              </w:rPr>
-              <w:t xml:space="preserve"> [Abridged from the full lists.]</w:t>
+              <w:t xml:space="preserve">1. The following are examples of some services that, when performed by a third party, would be regarded as outsourcing arrangements for the purposes of these Guidelines although they are not exhaustive: (a) application processing (e.g. loan origination, credit cards); (b) white-labelling arrangements such as for trading and hedging facilities; (c) middle and back office operations (e.g. electronic funds transfer, payroll processing, custody operations, quality control, purchasing, maintaining the register of participants of a collective investment scheme (CIS) and sending of accounts and reports to CIS participants, order processing, trade settlement and risk management); (d) business continuity and disaster recovery functions and activities; (e) claims administration (e.g. loan negotiations, loan processing, collateral management, collection of bad loans); (f) document processing (e.g. cheques, credit card and bill payments, bank statements, other corporate payments, customer statement printing); (g) information systems hosting (e.g. software-as-a-service, platform-as-a-service, infrastructure-as-a-service); (h) information systems management and maintenance (e.g. data entry and processing, data centres, data centre facilities management, end-user support, local area networks management, help desks, information technology security operations); (i) investment management (e.g. discretionary portfolio management, cash management); (j) management of policy issuance and claims operations by managing agents; (k) manpower management (e.g. benefits and compensation administration, staff appointment, training and development); (l) marketing and research (e.g. product development, data warehousing and mining, media relations, call centres, telemarketing); (m) professional services related to the business activities of the institution (e.g. accounting, internal audit, actuarial, compliance); (n) support services related to archival, storage and destruction of data and records; and (o) calculation of financial benchmarks.</w:t>
+            </w:r>
+          </w:p>
+          <w:p>
+            <w:pPr>
+              <w:spacing w:after="40" w:before="40"/>
+            </w:pPr>
+            <w:r>
+              <w:rPr>
+                <w:rFonts w:ascii="Arial" w:cs="Arial" w:eastAsia="Arial" w:hAnsi="Arial"/>
+                <w:i w:val="false"/>
+                <w:iCs w:val="false"/>
+                <w:color w:val="000000"/>
+                <w:sz w:val="18"/>
+                <w:szCs w:val="18"/>
+                <w:highlight w:val="yellow"/>
+                <w:highlightCs w:val="yellow"/>
+              </w:rPr>
+              <w:t xml:space="preserve">2. The following arrangements would generally not be considered outsourcing arrangements: (a) Arrangements in which certain industry characteristics require the use of third-party providers — (i) maintenance of custody account with specified custodians as required under Regulation 27 of the Securities and Futures (Licensing and Conduct of Business) Regulations; (ii) telecommunication services and public utilities (e.g. electricity, SMS gateway services); (iii) postal services; (iv) market information services (e.g. Bloomberg, Moody's, Standard &amp; Poor's); (v) common network infrastructure (e.g. Visa, MasterCard, MEPS+); (vi) clearing and settlement arrangements between clearing houses and settlement institutions and their members, and similar arrangements between members and non-members; (vii) global financial messaging infrastructure which are subject to oversight by relevant regulators (e.g. SWIFT); and (viii) correspondent banking services. (b) Introducer arrangements and arrangements that pertain to principal-agent relationships — (i) sale of insurance policies by agents, and ancillary services relating to those sales; (ii) acceptance of business by underwriting agents; and (iii) introducer arrangements (where the institution does not have any contractual relationship with customers). (c) Arrangements that the institution is not legally or administratively able to provide — (i) statutory audit and independent audit assessments; (ii) discrete advisory services (e.g. legal opinions, independent appraisals, trustees in bankruptcy, loss adjuster); and independent consulting (e.g. consultancy services for areas which the institution does not have the internal expertise to conduct)</w:t>
             </w:r>
           </w:p>
         </w:tc>
@@ -12386,7 +12967,7 @@
                 <w:sz w:val="18"/>
                 <w:szCs w:val="18"/>
               </w:rPr>
-              <w:t xml:space="preserve"> *Worded identically to Bank Guidelines Annex 1 ("institution" for "Bank").*</w:t>
+              <w:t xml:space="preserve"> 1. An institution should assess the materiality in an outsourcing arrangement. In assessing materiality, MAS recognises that qualitative judgment is involved and the circumstances faced by individual institutions may vary. Factors that an institution should consider include: (a) importance of the business activity to be outsourced (e.g. in terms of contribution to income and profit); (b) potential impact of the outsourcing on earnings, solvency, liquidity, funding and capital, and risk profile; (c) impact on the institution's reputation and brand value, and ability to achieve its business objectives, strategy and plans, should the service provider fail to perform the service or encounter a breach of confidentiality or security (e.g. compromise of customer information); (d) impact on the institution's customers, should the service provider fail to perform the service or encounter a breach of confidentiality or security; (e) impact on the institution's counterparties and the Singapore financial market, should the service provider fail to perform the service; (f) cost of the outsourcing as a proportion of total operating costs of the institution; (g) cost of outsourcing failure, which will require the institution to bring the outsourced activity in-house or seek similar service from another service provider, as a proportion of total operating costs of the institution; (h) aggregate exposure to a particular service provider in cases where the institution outsources various functions to the same service provider; and (i) ability to maintain appropriate internal controls and meet regulatory requirements, if the service provider faces operational problems. 2. Outsourcing of all or substantially all of its risk management or internal control functions, including compliance, internal audit, financial accounting and actuarial (other than performing certification activities) is to be considered a material outsourcing arrangement. 3. An institution should undertake periodic reviews of its outsourcing arrangements to identify new outsourcing risks as they arise. An outsourcing arrangement that was previously not material may subsequently become material from incremental services outsourced to the same service provider or an increase in volume or change in nature of the service outsourced to the service provider. Outsourcing risks may also increase when the service provider sub-contracts the service or makes significant changes to its sub-contracting arrangements. 4. An institution should consider materiality at both the institution's level and as a group, i.e., together with the institution's branches and corporations under its control.</w:t>
             </w:r>
           </w:p>
         </w:tc>
@@ -12669,7 +13250,39 @@
                 <w:sz w:val="18"/>
                 <w:szCs w:val="18"/>
               </w:rPr>
-              <w:t xml:space="preserve"> *Worded identically to Bank Guidelines Annex 2 ("institutions" for "Banks").*</w:t>
+              <w:t xml:space="preserve"> 1. Cloud services (CS) are a combination of a business and delivery model that enable on-demand access to a shared pool of resources such as applications, servers, storage and network security. The service is typically delivered in the form of Software as a Service (SaaS), Platform as a Service (PaaS) and Infrastructure as a Service (IaaS). 2. CS can potentially offer a number of advantages, which include economies of scale, cost-savings, access to quality system administration as well as operations that adhere to uniform security standards and best practices. CS may also be used to provide the flexibility and agility for institutions to scale up or pare down on computing resources quickly as usage requirements change, without major hardware and software outlay as well as lead-time. In addition, the distributed nature of CS may enhance system resilience during location-specific disasters or disruptions. 3. It has been noted that more and more institutions are adopting CS to fulfil their business and operational requirements. These CS deployments may be operated in-house or off-premises by service providers. While the latter can take the form of a private21 or public22 cloud, there is a growing trend for institutions to adopt a combination of private and public clouds to create a hybrid cloud. The different cloud models provide for distinct operational and security trade-offs. 4. In the recent years, cloud technology has evolved and matured considerably and CS providers have become aware of the technology and security requirements of institutions to protect sensitive customer data. In this regard, a number of CS providers have implemented strong authentication, access controls, tokenisation techniques and data encryption to bolster security to meet institutions' requirements. 5. MAS considers CS operated by service providers as a form of outsourcing and recognises that institutions may leverage on such a service to enhance their operations and service efficiency while reaping the benefits of CS' scalable, standardised and secured infrastructure. 6. The types of risks in CS that confront institutions are not distinct from that of other forms of outsourcing arrangements. Institutions should perform the necessary due diligence and apply sound governance and risk management practices articulated in this set of Guidelines when subscribing to CS. 7. Institutions should be aware of CS' typical characteristics such as multi-tenancy, data commingling and the higher propensity for processing to be carried out in multiple locations. Hence, institutions should take active steps to address the risks associated with data access, confidentiality, integrity, sovereignty, recoverability, regulatory compliance and auditing. In particular, institutions should ensure that the service provider possesses the ability to clearly identify and segregate customer data using strong physical or logical controls. The service provider should have in place robust access controls to protect customer information and such access controls should survive the tenure of the contract of the CS. 8. Institutions are ultimately responsible and accountable for maintaining oversight of CS and managing the attendant risks of adopting CS, as in any other form of outsourcing arrangements. A risk-based approach should be taken by institutions to ensure that the level of oversight and controls are commensurate with the materiality of the risks posed by the CS.</w:t>
+            </w:r>
+          </w:p>
+          <w:p>
+            <w:pPr>
+              <w:spacing w:after="40" w:before="40"/>
+            </w:pPr>
+            <w:r>
+              <w:rPr>
+                <w:rFonts w:ascii="Arial" w:cs="Arial" w:eastAsia="Arial" w:hAnsi="Arial"/>
+                <w:i w:val="false"/>
+                <w:iCs w:val="false"/>
+                <w:color w:val="595959"/>
+                <w:sz w:val="14"/>
+                <w:szCs w:val="14"/>
+              </w:rPr>
+              <w:t xml:space="preserve">21 – A cloud infrastructure operated solely for an organisation.</w:t>
+            </w:r>
+          </w:p>
+          <w:p>
+            <w:pPr>
+              <w:spacing w:after="40" w:before="40"/>
+            </w:pPr>
+            <w:r>
+              <w:rPr>
+                <w:rFonts w:ascii="Arial" w:cs="Arial" w:eastAsia="Arial" w:hAnsi="Arial"/>
+                <w:i w:val="false"/>
+                <w:iCs w:val="false"/>
+                <w:color w:val="595959"/>
+                <w:sz w:val="14"/>
+                <w:szCs w:val="14"/>
+              </w:rPr>
+              <w:t xml:space="preserve">22 – A cloud infrastructure made available to the general public or an industry group, and is owned by a third-party service provider.</w:t>
             </w:r>
           </w:p>
         </w:tc>

</xml_diff>

<commit_message>
Apply Sonnet verification fixes to comparative table
Adds missing FI 5.1.1 Overview row; renumbers FI footnotes to the FI
document's own sequence; restores three dropped Bank footnotes and
Annex 3 verbatim text; fixes punctuation/article artifacts and
highlight placement flagged by three verification agents.

Co-Authored-By: Claude Fable 5 <noreply@anthropic.com>
Claude-Session: https://claude.ai/code/session_01JPzxLJCqu7ynMjqaCPY5Jt
</commit_message>
<xml_diff>
--- a/mas-outsourcing-comparative-table.docx
+++ b/mas-outsourcing-comparative-table.docx
@@ -1658,7 +1658,7 @@
                 <w:sz w:val="18"/>
                 <w:szCs w:val="18"/>
               </w:rPr>
-              <w:t xml:space="preserve">1.  Bank ¶2.1 is found in ¶¶4.1.1–4.1.2 of the FI Guidelines, identically worded but split across two provisions — with one addition: FI ¶4.1.1 states that observance "should include </w:t>
+              <w:t xml:space="preserve">1.  Bank ¶2.1 is found in ¶¶4.1.1–4.1.2 of the FI Guidelines, split across two provisions and worded identically save that FI ¶4.1.2 says "pre-notification of new material outsourcing arrangements" (vs "MOORS") and "the potential impact of the outsourcing on the institution" (vs "of the outsourcing arrangement on the Bank") — with one addition: FI ¶4.1.1 states that observance "should include </w:t>
             </w:r>
             <w:r>
               <w:rPr>
@@ -2480,7 +2480,7 @@
                 <w:sz w:val="18"/>
                 <w:szCs w:val="18"/>
               </w:rPr>
-              <w:t xml:space="preserve">Section 3 of the Bank Guidelines corresponds to Section 5 of the FI Guidelines (offset: Bank 3.1→FI 5.2, 3.2→5.3, 3.3→5.4, 3.4→5.5, 3.5→folded into 5.5.2(j), 3.6→5.6, 3.7→5.7, 3.8→5.8, 3.9→5.9, 3.10→5.10, 3.11→5.11, 3.12→5.12). Section 3 of the FI Guidelines ("Definitions") has no Bank counterpart — Bank ¶1.4 defers to the Notices for definitions.</w:t>
+              <w:t xml:space="preserve">Section 3 of the Bank Guidelines corresponds to Section 5 of the FI Guidelines (FI sub-section 5.1 "Overview" has no Bank counterpart — see row [FI 5.1.1]; offset: Bank 3.1→FI 5.2, 3.2→5.3, 3.3→5.4, 3.4→5.5, 3.5→folded into 5.5.2(j), 3.6→5.6, 3.7→5.7, 3.8→5.8, 3.9→5.9, 3.10→5.10, 3.11→5.11, 3.12→5.12). Section 3 of the FI Guidelines ("Definitions") has no Bank counterpart — Bank ¶1.4 defers to the Notices for definitions.</w:t>
             </w:r>
           </w:p>
         </w:tc>
@@ -2510,7 +2510,35 @@
                 <w:sz w:val="18"/>
                 <w:szCs w:val="18"/>
               </w:rPr>
-              <w:t xml:space="preserve">3.1</w:t>
+              <w:t xml:space="preserve">[FI 5.1.1]</w:t>
+            </w:r>
+          </w:p>
+        </w:tc>
+        <w:tc>
+          <w:tcPr>
+            <w:tcW w:type="dxa" w:w="5300"/>
+            <w:tcMar>
+              <w:top w:type="dxa" w:w="60"/>
+              <w:left w:type="dxa" w:w="100"/>
+              <w:bottom w:type="dxa" w:w="60"/>
+              <w:right w:type="dxa" w:w="100"/>
+            </w:tcMar>
+            <w:vAlign w:val="top"/>
+          </w:tcPr>
+          <w:p>
+            <w:pPr>
+              <w:spacing w:after="40" w:before="40"/>
+            </w:pPr>
+            <w:r>
+              <w:rPr>
+                <w:rFonts w:ascii="Arial" w:cs="Arial" w:eastAsia="Arial" w:hAnsi="Arial"/>
+                <w:i/>
+                <w:iCs/>
+                <w:color w:val="595959"/>
+                <w:sz w:val="18"/>
+                <w:szCs w:val="18"/>
+              </w:rPr>
+              <w:t xml:space="preserve">No provision here under the Bank Guidelines.</w:t>
             </w:r>
           </w:p>
         </w:tc>
@@ -2540,18 +2568,89 @@
                 <w:sz w:val="18"/>
                 <w:szCs w:val="18"/>
               </w:rPr>
-              <w:t xml:space="preserve">Responsibilities of the Board and Senior Management</w:t>
-            </w:r>
-            <w:r>
-              <w:rPr>
-                <w:rFonts w:ascii="Arial" w:cs="Arial" w:eastAsia="Arial" w:hAnsi="Arial"/>
-                <w:i w:val="false"/>
-                <w:iCs w:val="false"/>
-                <w:color w:val="000000"/>
-                <w:sz w:val="18"/>
-                <w:szCs w:val="18"/>
-              </w:rPr>
-              <w:t xml:space="preserve"> *(sub-section heading)*</w:t>
+              <w:t xml:space="preserve">[¶5.1.1 – Overview]</w:t>
+            </w:r>
+            <w:r>
+              <w:rPr>
+                <w:rFonts w:ascii="Arial" w:cs="Arial" w:eastAsia="Arial" w:hAnsi="Arial"/>
+                <w:i w:val="false"/>
+                <w:iCs w:val="false"/>
+                <w:color w:val="000000"/>
+                <w:sz w:val="18"/>
+                <w:szCs w:val="18"/>
+              </w:rPr>
+              <w:t xml:space="preserve"> </w:t>
+            </w:r>
+            <w:r>
+              <w:rPr>
+                <w:rFonts w:ascii="Arial" w:cs="Arial" w:eastAsia="Arial" w:hAnsi="Arial"/>
+                <w:i w:val="false"/>
+                <w:iCs w:val="false"/>
+                <w:color w:val="000000"/>
+                <w:sz w:val="18"/>
+                <w:szCs w:val="18"/>
+                <w:highlight w:val="yellow"/>
+                <w:highlightCs w:val="yellow"/>
+              </w:rPr>
+              <w:t xml:space="preserve">In supervising an institution, MAS will review its implementation of these Guidelines, the quality of its board and senior management oversight and governance, internal controls and risk management with regard to managing outsourcing risks.</w:t>
+            </w:r>
+          </w:p>
+        </w:tc>
+        <w:tc>
+          <w:tcPr>
+            <w:tcW w:type="dxa" w:w="3000"/>
+            <w:tcMar>
+              <w:top w:type="dxa" w:w="60"/>
+              <w:left w:type="dxa" w:w="100"/>
+              <w:bottom w:type="dxa" w:w="60"/>
+              <w:right w:type="dxa" w:w="100"/>
+            </w:tcMar>
+            <w:vAlign w:val="top"/>
+          </w:tcPr>
+          <w:p>
+            <w:pPr>
+              <w:spacing w:after="40" w:before="40"/>
+            </w:pPr>
+            <w:r>
+              <w:rPr>
+                <w:rFonts w:ascii="Arial" w:cs="Arial" w:eastAsia="Arial" w:hAnsi="Arial"/>
+                <w:i w:val="false"/>
+                <w:iCs w:val="false"/>
+                <w:color w:val="000000"/>
+                <w:sz w:val="18"/>
+                <w:szCs w:val="18"/>
+              </w:rPr>
+              <w:t xml:space="preserve">1.  FI-only overview provision (sub-section 5.1); the equivalent idea is folded into Bank ¶2.1. No Bank counterpart provision.</w:t>
+            </w:r>
+          </w:p>
+        </w:tc>
+      </w:tr>
+      <w:tr>
+        <w:tc>
+          <w:tcPr>
+            <w:tcW w:type="dxa" w:w="800"/>
+            <w:tcMar>
+              <w:top w:type="dxa" w:w="60"/>
+              <w:left w:type="dxa" w:w="100"/>
+              <w:bottom w:type="dxa" w:w="60"/>
+              <w:right w:type="dxa" w:w="100"/>
+            </w:tcMar>
+            <w:vAlign w:val="top"/>
+          </w:tcPr>
+          <w:p>
+            <w:pPr>
+              <w:spacing w:after="40" w:before="40"/>
+            </w:pPr>
+            <w:r>
+              <w:rPr>
+                <w:rFonts w:ascii="Arial" w:cs="Arial" w:eastAsia="Arial" w:hAnsi="Arial"/>
+                <w:i w:val="false"/>
+                <w:iCs w:val="false"/>
+                <w:color w:val="000000"/>
+                <w:sz w:val="18"/>
+                <w:szCs w:val="18"/>
+              </w:rPr>
+              <w:t xml:space="preserve">3.1</w:t>
             </w:r>
           </w:p>
         </w:tc>
@@ -2581,6 +2680,47 @@
                 <w:sz w:val="18"/>
                 <w:szCs w:val="18"/>
               </w:rPr>
+              <w:t xml:space="preserve">Responsibilities of the Board and Senior Management</w:t>
+            </w:r>
+            <w:r>
+              <w:rPr>
+                <w:rFonts w:ascii="Arial" w:cs="Arial" w:eastAsia="Arial" w:hAnsi="Arial"/>
+                <w:i w:val="false"/>
+                <w:iCs w:val="false"/>
+                <w:color w:val="000000"/>
+                <w:sz w:val="18"/>
+                <w:szCs w:val="18"/>
+              </w:rPr>
+              <w:t xml:space="preserve"> *(sub-section heading)*</w:t>
+            </w:r>
+          </w:p>
+        </w:tc>
+        <w:tc>
+          <w:tcPr>
+            <w:tcW w:type="dxa" w:w="5300"/>
+            <w:tcMar>
+              <w:top w:type="dxa" w:w="60"/>
+              <w:left w:type="dxa" w:w="100"/>
+              <w:bottom w:type="dxa" w:w="60"/>
+              <w:right w:type="dxa" w:w="100"/>
+            </w:tcMar>
+            <w:vAlign w:val="top"/>
+          </w:tcPr>
+          <w:p>
+            <w:pPr>
+              <w:spacing w:after="40" w:before="40"/>
+            </w:pPr>
+            <w:r>
+              <w:rPr>
+                <w:rFonts w:ascii="Arial" w:cs="Arial" w:eastAsia="Arial" w:hAnsi="Arial"/>
+                <w:b/>
+                <w:bCs/>
+                <w:i w:val="false"/>
+                <w:iCs w:val="false"/>
+                <w:color w:val="000000"/>
+                <w:sz w:val="18"/>
+                <w:szCs w:val="18"/>
+              </w:rPr>
               <w:t xml:space="preserve">[¶3.1 – Definitions]</w:t>
             </w:r>
             <w:r>
@@ -2666,7 +2806,31 @@
                 <w:sz w:val="18"/>
                 <w:szCs w:val="18"/>
               </w:rPr>
-              <w:t xml:space="preserve">"bridge-institution" means an institution, whether incorporated in Singapore or outside Singapore, to temporarily take over and maintain certain assets, liabilities and operations of a distressed financial institution, as part of a resolution Authority's exercise of a resolution power;</w:t>
+              <w:t xml:space="preserve">"bridge-institution" means an institution, whether incorporated in Singapore or outside Singapore, to temporarily take over and maintain certain assets, liabilities and operations of a distressed financial institution, as part of a resolution Authority's exercise of a </w:t>
+            </w:r>
+            <w:r>
+              <w:rPr>
+                <w:rFonts w:ascii="Arial" w:cs="Arial" w:eastAsia="Arial" w:hAnsi="Arial"/>
+                <w:i w:val="false"/>
+                <w:iCs w:val="false"/>
+                <w:color w:val="000000"/>
+                <w:sz w:val="18"/>
+                <w:szCs w:val="18"/>
+                <w:highlight w:val="yellow"/>
+                <w:highlightCs w:val="yellow"/>
+              </w:rPr>
+              <w:t xml:space="preserve">resolution power</w:t>
+            </w:r>
+            <w:r>
+              <w:rPr>
+                <w:rFonts w:ascii="Arial" w:cs="Arial" w:eastAsia="Arial" w:hAnsi="Arial"/>
+                <w:i w:val="false"/>
+                <w:iCs w:val="false"/>
+                <w:color w:val="000000"/>
+                <w:sz w:val="18"/>
+                <w:szCs w:val="18"/>
+              </w:rPr>
+              <w:t xml:space="preserve">;</w:t>
             </w:r>
           </w:p>
           <w:p>
@@ -3523,7 +3687,7 @@
                 <w:sz w:val="18"/>
                 <w:szCs w:val="18"/>
               </w:rPr>
-              <w:t xml:space="preserve"> Senior management is responsible for: (a) evaluating the materiality and risks from all existing and prospective outsourcing arrangements, based on the framework approved by the board; (b) developing sound and prudent outsourcing policies and procedures that are commensurate with the nature, scope and complexity of the outsourcing arrangements as well as ensuring that such policies and procedures are implemented effectively; (c) reviewing regularly the effectiveness of, and appropriately adjusting, policies, standards and procedures to reflect changes in the institution's overall risk profile and risk environment; (d) monitoring and maintaining effective control of all risks from its material outsourcing arrangements on a institution-wide basis; (e) ensuring that contingency plans, based on realistic and probable disruptive scenarios, are in place and tested; (f) ensuring that there is independent review and audit for compliance with outsourcing policies and procedures; (g) ensuring that appropriate and timely remedial actions are taken to address audit findings; and (h) communicating information pertaining to risks arising from its material outsourcing arrangements to the board in a timely manner.</w:t>
+              <w:t xml:space="preserve"> Senior management is responsible for: (a) evaluating the materiality and risks from all existing and prospective outsourcing arrangements, based on the framework approved by the board; (b) developing sound and prudent outsourcing policies and procedures that are commensurate with the nature, scope and complexity of the outsourcing arrangements as well as ensuring that such policies and procedures are implemented effectively; (c) reviewing regularly the effectiveness of, and appropriately adjusting, policies, standards and procedures to reflect changes in the institution's overall risk profile and risk environment; (d) monitoring and maintaining effective control of all risks from its material outsourcing arrangements on an institution-wide basis; (e) ensuring that contingency plans, based on realistic and probable disruptive scenarios, are in place and tested; (f) ensuring that there is independent review and audit for compliance with outsourcing policies and procedures; (g) ensuring that appropriate and timely remedial actions are taken to address audit findings; and (h) communicating information pertaining to risks arising from its material outsourcing arrangements to the board in a timely manner.</w:t>
             </w:r>
           </w:p>
         </w:tc>
@@ -4176,7 +4340,7 @@
                 <w:sz w:val="18"/>
                 <w:szCs w:val="18"/>
               </w:rPr>
-              <w:t xml:space="preserve">1.  Found at FI ¶5.3.1, worded identically in substance; sub-substantive drift only — Bank (c) "outsourced relevant service … as if the service is performed by the Bank" vs FI "outsourced service … as if the outsourcing arrangement is performed by the institution".</w:t>
+              <w:t xml:space="preserve">1.  Found at FI ¶5.3.1, worded identically in substance; sub-substantive drift only — Bank (c) "outsourced relevant service … as if the service is performed by the Bank" vs FI "outsourced service … as if the outsourcing arrangement is performed by the institution"; FI also reads "would need to fully appreciate" (Bank: "need to") and "unexpected termination in the outsourcing arrangement" (Bank: "of").</w:t>
             </w:r>
           </w:p>
         </w:tc>
@@ -5803,7 +5967,7 @@
                 <w:sz w:val="18"/>
                 <w:szCs w:val="18"/>
               </w:rPr>
-              <w:t xml:space="preserve">; (g) notification of adverse developments — A Bank should specify in its outsourcing agreement the type of events and the circumstances under which the service provider should report to the Bank in order for the Bank to take prompt risk mitigation measures and notify MAS of such developments under paragraph 2.2; (h) dispute resolution — A Bank should specify in its outsourcing agreement the resolution process, events of default, and the indemnities, remedies and recourse of the respective parties in the agreement. The Bank should ensure that its contractual rights can be exercised in the event of a breach of the outsourcing agreement by the service provider; (i) default termination and early exit; (j) applicable laws — Agreements should include choice-of-law provisions, agreement covenants and jurisdictional covenants that provide for adjudication of disputes between the parties under the laws of a specific jurisdiction.</w:t>
+              <w:t xml:space="preserve">; (g) notification of adverse developments — A Bank should specify in its outsourcing agreement the type of events and the circumstances under which the service provider should report to the Bank in order for the Bank to take prompt risk mitigation measures and notify MAS of such developments under paragraph 2.2; (h) dispute resolution — A Bank should specify in its outsourcing agreement the resolution process, events of default, and the indemnities, remedies and recourse of the respective parties in the agreement. The Bank should ensure that its contractual rights can be exercised in the event of a breach of the outsourcing agreement by the service provider; (i) default termination and early exit13; (j) applicable laws — Agreements should include choice-of-law provisions, agreement covenants and jurisdictional covenants that provide for adjudication of disputes between the parties under the laws of a specific jurisdiction.</w:t>
             </w:r>
           </w:p>
           <w:p>
@@ -5838,71 +6002,6 @@
               <w:t xml:space="preserve">12 – The provisions of the outsourcing agreement for a MOORS that relate to audit and inspection should include the requirements set out in paragraph 7.1(d) of the Notices. Refer also to paragraph 3.9.</w:t>
             </w:r>
           </w:p>
-        </w:tc>
-        <w:tc>
-          <w:tcPr>
-            <w:tcW w:type="dxa" w:w="5300"/>
-            <w:tcMar>
-              <w:top w:type="dxa" w:w="60"/>
-              <w:left w:type="dxa" w:w="100"/>
-              <w:bottom w:type="dxa" w:w="60"/>
-              <w:right w:type="dxa" w:w="100"/>
-            </w:tcMar>
-            <w:vAlign w:val="top"/>
-          </w:tcPr>
-          <w:p>
-            <w:pPr>
-              <w:spacing w:after="40" w:before="40"/>
-            </w:pPr>
-            <w:r>
-              <w:rPr>
-                <w:rFonts w:ascii="Arial" w:cs="Arial" w:eastAsia="Arial" w:hAnsi="Arial"/>
-                <w:b/>
-                <w:bCs/>
-                <w:i w:val="false"/>
-                <w:iCs w:val="false"/>
-                <w:color w:val="000000"/>
-                <w:sz w:val="18"/>
-                <w:szCs w:val="18"/>
-              </w:rPr>
-              <w:t xml:space="preserve">[¶5.5.2]</w:t>
-            </w:r>
-            <w:r>
-              <w:rPr>
-                <w:rFonts w:ascii="Arial" w:cs="Arial" w:eastAsia="Arial" w:hAnsi="Arial"/>
-                <w:i w:val="false"/>
-                <w:iCs w:val="false"/>
-                <w:color w:val="000000"/>
-                <w:sz w:val="18"/>
-                <w:szCs w:val="18"/>
-              </w:rPr>
-              <w:t xml:space="preserve"> An institution should ensure that every outsourcing agreement addresses the risks identified at the risk evaluation and due diligence stages. Each outsourcing agreement should allow for timely renegotiation and renewal to enable the institution to retain an appropriate level of control over the outsourcing arrangement and the right to intervene with appropriate measures to meet its legal and regulatory obligations. It should at the very least, have provisions to address the following aspects of outsourcing: (a) scope of the outsourcing arrangement; (b) performance, operational, internal control and risk management standards; (c) confidentiality and security9; (d) business continuity management10; (e) monitoring and control11; (f) audit and inspection12; (g) notification of adverse developments — An institution should specify in its outsourcing agreement the type of events and the circumstances under which the service provider should report to the institution in order for an institution to take prompt risk mitigation measures and notify MAS of such developments under paragraph 4.2.1; (h) dispute resolution — An institution should specify in its outsourcing agreement the resolution process, events of default, and the indemnities, remedies and recourse of the respective parties in the agreement. The institution should ensure that its contractual rights can be exercised in the event of a breach of the outsourcing agreement by the service provider; (i) default termination and early exit — set out in full at rows 3.4.3 and 3.4.4 of this table; </w:t>
-            </w:r>
-            <w:r>
-              <w:rPr>
-                <w:rFonts w:ascii="Arial" w:cs="Arial" w:eastAsia="Arial" w:hAnsi="Arial"/>
-                <w:i w:val="false"/>
-                <w:iCs w:val="false"/>
-                <w:color w:val="000000"/>
-                <w:sz w:val="18"/>
-                <w:szCs w:val="18"/>
-                <w:highlight w:val="yellow"/>
-                <w:highlightCs w:val="yellow"/>
-              </w:rPr>
-              <w:t xml:space="preserve">(j) sub-contracting</w:t>
-            </w:r>
-            <w:r>
-              <w:rPr>
-                <w:rFonts w:ascii="Arial" w:cs="Arial" w:eastAsia="Arial" w:hAnsi="Arial"/>
-                <w:i w:val="false"/>
-                <w:iCs w:val="false"/>
-                <w:color w:val="000000"/>
-                <w:sz w:val="18"/>
-                <w:szCs w:val="18"/>
-              </w:rPr>
-              <w:t xml:space="preserve"> — set out in full at row 3.5.1 of this table; (k) applicable laws — Agreements should include choice-of-law provisions, agreement covenants and jurisdictional covenants that provide for adjudication of disputes between the parties under the laws of a specific jurisdiction.</w:t>
-            </w:r>
-          </w:p>
           <w:p>
             <w:pPr>
               <w:spacing w:after="40" w:before="40"/>
@@ -5916,7 +6015,72 @@
                 <w:sz w:val="14"/>
                 <w:szCs w:val="14"/>
               </w:rPr>
-              <w:t xml:space="preserve">9 – Refer to paragraph 5.6.</w:t>
+              <w:t xml:space="preserve">13 – Refer to paragraphs 3.4.3 to 3.4.8.</w:t>
+            </w:r>
+          </w:p>
+        </w:tc>
+        <w:tc>
+          <w:tcPr>
+            <w:tcW w:type="dxa" w:w="5300"/>
+            <w:tcMar>
+              <w:top w:type="dxa" w:w="60"/>
+              <w:left w:type="dxa" w:w="100"/>
+              <w:bottom w:type="dxa" w:w="60"/>
+              <w:right w:type="dxa" w:w="100"/>
+            </w:tcMar>
+            <w:vAlign w:val="top"/>
+          </w:tcPr>
+          <w:p>
+            <w:pPr>
+              <w:spacing w:after="40" w:before="40"/>
+            </w:pPr>
+            <w:r>
+              <w:rPr>
+                <w:rFonts w:ascii="Arial" w:cs="Arial" w:eastAsia="Arial" w:hAnsi="Arial"/>
+                <w:b/>
+                <w:bCs/>
+                <w:i w:val="false"/>
+                <w:iCs w:val="false"/>
+                <w:color w:val="000000"/>
+                <w:sz w:val="18"/>
+                <w:szCs w:val="18"/>
+              </w:rPr>
+              <w:t xml:space="preserve">[¶5.5.2]</w:t>
+            </w:r>
+            <w:r>
+              <w:rPr>
+                <w:rFonts w:ascii="Arial" w:cs="Arial" w:eastAsia="Arial" w:hAnsi="Arial"/>
+                <w:i w:val="false"/>
+                <w:iCs w:val="false"/>
+                <w:color w:val="000000"/>
+                <w:sz w:val="18"/>
+                <w:szCs w:val="18"/>
+              </w:rPr>
+              <w:t xml:space="preserve"> An institution should ensure that every outsourcing agreement addresses the risks identified at the risk evaluation and due diligence stages. Each outsourcing agreement should allow for timely renegotiation and renewal to enable the institution to retain an appropriate level of control over the outsourcing arrangement and the right to intervene with appropriate measures to meet its legal and regulatory obligations. It should at the very least, have provisions to address the following aspects of outsourcing: (a) scope of the outsourcing arrangement; (b) performance, operational, internal control and risk management standards; (c) confidentiality and security9; (d) business continuity management10; (e) monitoring and control11; (f) audit and inspection12; (g) notification of adverse developments — An institution should specify in its outsourcing agreement the type of events and the circumstances under which the service provider should report to the institution in order for an institution to take prompt risk mitigation measures and notify MAS of such developments under paragraph 4.2.1; (h) dispute resolution — An institution should specify in its outsourcing agreement the resolution process, events of default, and the indemnities, remedies and recourse of the respective parties in the agreement. The institution should ensure that its contractual rights can be exercised in the event of a breach of the outsourcing agreement by the service provider; (i) default termination and early exit — set out in full at rows 3.4.3 and 3.4.4 of this table; </w:t>
+            </w:r>
+            <w:r>
+              <w:rPr>
+                <w:rFonts w:ascii="Arial" w:cs="Arial" w:eastAsia="Arial" w:hAnsi="Arial"/>
+                <w:i w:val="false"/>
+                <w:iCs w:val="false"/>
+                <w:color w:val="000000"/>
+                <w:sz w:val="18"/>
+                <w:szCs w:val="18"/>
+                <w:highlight w:val="yellow"/>
+                <w:highlightCs w:val="yellow"/>
+              </w:rPr>
+              <w:t xml:space="preserve">(j) sub-contracting</w:t>
+            </w:r>
+            <w:r>
+              <w:rPr>
+                <w:rFonts w:ascii="Arial" w:cs="Arial" w:eastAsia="Arial" w:hAnsi="Arial"/>
+                <w:i w:val="false"/>
+                <w:iCs w:val="false"/>
+                <w:color w:val="000000"/>
+                <w:sz w:val="18"/>
+                <w:szCs w:val="18"/>
+              </w:rPr>
+              <w:t xml:space="preserve"> — set out in full at row 3.5.1 of this table; (k) applicable laws — Agreements should include choice-of-law provisions, agreement covenants and jurisdictional covenants that provide for adjudication of disputes between the parties under the laws of a specific jurisdiction.</w:t>
             </w:r>
           </w:p>
           <w:p>
@@ -5932,7 +6096,7 @@
                 <w:sz w:val="14"/>
                 <w:szCs w:val="14"/>
               </w:rPr>
-              <w:t xml:space="preserve">10 – Refer to paragraph 5.7.</w:t>
+              <w:t xml:space="preserve">9 – Refer to paragraph 5.6.</w:t>
             </w:r>
           </w:p>
           <w:p>
@@ -5948,7 +6112,7 @@
                 <w:sz w:val="14"/>
                 <w:szCs w:val="14"/>
               </w:rPr>
-              <w:t xml:space="preserve">11 – Refer to paragraph 5.8.</w:t>
+              <w:t xml:space="preserve">10 – Refer to paragraph 5.7.</w:t>
             </w:r>
           </w:p>
           <w:p>
@@ -5964,286 +6128,7 @@
                 <w:sz w:val="14"/>
                 <w:szCs w:val="14"/>
               </w:rPr>
-              <w:t xml:space="preserve">12 – Refer to paragraph 5.9.</w:t>
-            </w:r>
-          </w:p>
-        </w:tc>
-        <w:tc>
-          <w:tcPr>
-            <w:tcW w:type="dxa" w:w="3000"/>
-            <w:tcMar>
-              <w:top w:type="dxa" w:w="60"/>
-              <w:left w:type="dxa" w:w="100"/>
-              <w:bottom w:type="dxa" w:w="60"/>
-              <w:right w:type="dxa" w:w="100"/>
-            </w:tcMar>
-            <w:vAlign w:val="top"/>
-          </w:tcPr>
-          <w:p>
-            <w:pPr>
-              <w:spacing w:after="40" w:before="40"/>
-            </w:pPr>
-            <w:r>
-              <w:rPr>
-                <w:rFonts w:ascii="Arial" w:cs="Arial" w:eastAsia="Arial" w:hAnsi="Arial"/>
-                <w:i w:val="false"/>
-                <w:iCs w:val="false"/>
-                <w:color w:val="000000"/>
-                <w:sz w:val="18"/>
-                <w:szCs w:val="18"/>
-              </w:rPr>
-              <w:t xml:space="preserve">1.  Same core checklist, found at FI ¶5.5.2, with three differences: (i) the FI list adds </w:t>
-            </w:r>
-            <w:r>
-              <w:rPr>
-                <w:rFonts w:ascii="Arial" w:cs="Arial" w:eastAsia="Arial" w:hAnsi="Arial"/>
-                <w:i w:val="false"/>
-                <w:iCs w:val="false"/>
-                <w:color w:val="000000"/>
-                <w:sz w:val="18"/>
-                <w:szCs w:val="18"/>
-                <w:highlight w:val="yellow"/>
-                <w:highlightCs w:val="yellow"/>
-              </w:rPr>
-              <w:t xml:space="preserve">item (j) sub-contracting</w:t>
-            </w:r>
-            <w:r>
-              <w:rPr>
-                <w:rFonts w:ascii="Arial" w:cs="Arial" w:eastAsia="Arial" w:hAnsi="Arial"/>
-                <w:i w:val="false"/>
-                <w:iCs w:val="false"/>
-                <w:color w:val="000000"/>
-                <w:sz w:val="18"/>
-                <w:szCs w:val="18"/>
-              </w:rPr>
-              <w:t xml:space="preserve"> (the Bank Guidelines deal with sub-contracting in a dedicated §3.5); (ii) Bank footnotes 9 and 12 require MOORS agreements to include the binding requirements of Notices ¶7.1(a)–(c) and ¶7.1(d) — no FI equivalent; (iii) the FI version expands "default termination and early exit" inline (see next row).</w:t>
-            </w:r>
-          </w:p>
-        </w:tc>
-      </w:tr>
-      <w:tr>
-        <w:tc>
-          <w:tcPr>
-            <w:tcW w:type="dxa" w:w="800"/>
-            <w:tcMar>
-              <w:top w:type="dxa" w:w="60"/>
-              <w:left w:type="dxa" w:w="100"/>
-              <w:bottom w:type="dxa" w:w="60"/>
-              <w:right w:type="dxa" w:w="100"/>
-            </w:tcMar>
-            <w:vAlign w:val="top"/>
-          </w:tcPr>
-          <w:p>
-            <w:pPr>
-              <w:spacing w:after="40" w:before="40"/>
-            </w:pPr>
-            <w:r>
-              <w:rPr>
-                <w:rFonts w:ascii="Arial" w:cs="Arial" w:eastAsia="Arial" w:hAnsi="Arial"/>
-                <w:i w:val="false"/>
-                <w:iCs w:val="false"/>
-                <w:color w:val="000000"/>
-                <w:sz w:val="18"/>
-                <w:szCs w:val="18"/>
-              </w:rPr>
-              <w:t xml:space="preserve">3.4.3</w:t>
-            </w:r>
-          </w:p>
-        </w:tc>
-        <w:tc>
-          <w:tcPr>
-            <w:tcW w:type="dxa" w:w="5300"/>
-            <w:tcMar>
-              <w:top w:type="dxa" w:w="60"/>
-              <w:left w:type="dxa" w:w="100"/>
-              <w:bottom w:type="dxa" w:w="60"/>
-              <w:right w:type="dxa" w:w="100"/>
-            </w:tcMar>
-            <w:vAlign w:val="top"/>
-          </w:tcPr>
-          <w:p>
-            <w:pPr>
-              <w:spacing w:after="40" w:before="40"/>
-            </w:pPr>
-            <w:r>
-              <w:rPr>
-                <w:rFonts w:ascii="Arial" w:cs="Arial" w:eastAsia="Arial" w:hAnsi="Arial"/>
-                <w:i w:val="false"/>
-                <w:iCs w:val="false"/>
-                <w:color w:val="000000"/>
-                <w:sz w:val="18"/>
-                <w:szCs w:val="18"/>
-              </w:rPr>
-              <w:t xml:space="preserve">A Bank should have the right to terminate the outsourcing agreement in the event of default, or under any of the following circumstances: </w:t>
-            </w:r>
-            <w:r>
-              <w:rPr>
-                <w:rFonts w:ascii="Arial" w:cs="Arial" w:eastAsia="Arial" w:hAnsi="Arial"/>
-                <w:i w:val="false"/>
-                <w:iCs w:val="false"/>
-                <w:color w:val="000000"/>
-                <w:sz w:val="18"/>
-                <w:szCs w:val="18"/>
-                <w:highlight w:val="yellow"/>
-                <w:highlightCs w:val="yellow"/>
-              </w:rPr>
-              <w:t xml:space="preserve">(a) by giving reasonable notice to the service provider; (b) if the service provider or a sub-contractor, as the case may be, failed to safeguard the confidentiality or integrity of customer information of the Bank; or (c) if there has been a demonstrable deterioration in the ability of the service provider or a sub-contractor to safeguard the confidentiality of customer information.</w:t>
-            </w:r>
-          </w:p>
-        </w:tc>
-        <w:tc>
-          <w:tcPr>
-            <w:tcW w:type="dxa" w:w="5300"/>
-            <w:tcMar>
-              <w:top w:type="dxa" w:w="60"/>
-              <w:left w:type="dxa" w:w="100"/>
-              <w:bottom w:type="dxa" w:w="60"/>
-              <w:right w:type="dxa" w:w="100"/>
-            </w:tcMar>
-            <w:vAlign w:val="top"/>
-          </w:tcPr>
-          <w:p>
-            <w:pPr>
-              <w:spacing w:after="40" w:before="40"/>
-            </w:pPr>
-            <w:r>
-              <w:rPr>
-                <w:rFonts w:ascii="Arial" w:cs="Arial" w:eastAsia="Arial" w:hAnsi="Arial"/>
-                <w:b/>
-                <w:bCs/>
-                <w:i w:val="false"/>
-                <w:iCs w:val="false"/>
-                <w:color w:val="000000"/>
-                <w:sz w:val="18"/>
-                <w:szCs w:val="18"/>
-              </w:rPr>
-              <w:t xml:space="preserve">[¶5.5.2(i)]</w:t>
-            </w:r>
-            <w:r>
-              <w:rPr>
-                <w:rFonts w:ascii="Arial" w:cs="Arial" w:eastAsia="Arial" w:hAnsi="Arial"/>
-                <w:i w:val="false"/>
-                <w:iCs w:val="false"/>
-                <w:color w:val="000000"/>
-                <w:sz w:val="18"/>
-                <w:szCs w:val="18"/>
-              </w:rPr>
-              <w:t xml:space="preserve"> An institution should, have the right to terminate the outsourcing agreement in the event of default, or under circumstances where: </w:t>
-            </w:r>
-            <w:r>
-              <w:rPr>
-                <w:rFonts w:ascii="Arial" w:cs="Arial" w:eastAsia="Arial" w:hAnsi="Arial"/>
-                <w:i w:val="false"/>
-                <w:iCs w:val="false"/>
-                <w:color w:val="000000"/>
-                <w:sz w:val="18"/>
-                <w:szCs w:val="18"/>
-                <w:highlight w:val="yellow"/>
-                <w:highlightCs w:val="yellow"/>
-              </w:rPr>
-              <w:t xml:space="preserve">(i) the service provider undergoes a change in ownership; (ii) the service provider becomes insolvent or goes into liquidation; (iii) the service provider goes into receivership or judicial management whether in Singapore or elsewhere; (iv) there has been a breach of security or confidentiality; or (v) there is a demonstrable deterioration in the ability of the service provider to perform the contracted service.</w:t>
-            </w:r>
-          </w:p>
-        </w:tc>
-        <w:tc>
-          <w:tcPr>
-            <w:tcW w:type="dxa" w:w="3000"/>
-            <w:tcMar>
-              <w:top w:type="dxa" w:w="60"/>
-              <w:left w:type="dxa" w:w="100"/>
-              <w:bottom w:type="dxa" w:w="60"/>
-              <w:right w:type="dxa" w:w="100"/>
-            </w:tcMar>
-            <w:vAlign w:val="top"/>
-          </w:tcPr>
-          <w:p>
-            <w:pPr>
-              <w:spacing w:after="40" w:before="40"/>
-            </w:pPr>
-            <w:r>
-              <w:rPr>
-                <w:rFonts w:ascii="Arial" w:cs="Arial" w:eastAsia="Arial" w:hAnsi="Arial"/>
-                <w:i w:val="false"/>
-                <w:iCs w:val="false"/>
-                <w:color w:val="000000"/>
-                <w:sz w:val="18"/>
-                <w:szCs w:val="18"/>
-              </w:rPr>
-              <w:t xml:space="preserve">1.  Materially different trigger lists. The FI version keeps the traditional corporate-event triggers (change of ownership; insolvency/liquidation; receivership/judicial management) and a service-performance trigger; the Bank list is confidentiality-centred (extending expressly to sub-contractor failures) and adds a no-fault reasonable-notice right.</w:t>
-            </w:r>
-          </w:p>
-          <w:p>
-            <w:pPr>
-              <w:spacing w:after="40" w:before="40"/>
-            </w:pPr>
-            <w:r>
-              <w:rPr>
-                <w:rFonts w:ascii="Arial" w:cs="Arial" w:eastAsia="Arial" w:hAnsi="Arial"/>
-                <w:i w:val="false"/>
-                <w:iCs w:val="false"/>
-                <w:color w:val="000000"/>
-                <w:sz w:val="18"/>
-                <w:szCs w:val="18"/>
-              </w:rPr>
-              <w:t xml:space="preserve">2.  The Bank Guidelines recite no corporate-event triggers — banks’ binding contractual requirements are prescribed by Notices ¶7.1, whose full content the Guidelines do not reproduce. On the face of the two Guidelines, the FI list is the broader one.</w:t>
-            </w:r>
-          </w:p>
-        </w:tc>
-      </w:tr>
-      <w:tr>
-        <w:tc>
-          <w:tcPr>
-            <w:tcW w:type="dxa" w:w="800"/>
-            <w:tcMar>
-              <w:top w:type="dxa" w:w="60"/>
-              <w:left w:type="dxa" w:w="100"/>
-              <w:bottom w:type="dxa" w:w="60"/>
-              <w:right w:type="dxa" w:w="100"/>
-            </w:tcMar>
-            <w:vAlign w:val="top"/>
-          </w:tcPr>
-          <w:p>
-            <w:pPr>
-              <w:spacing w:after="40" w:before="40"/>
-            </w:pPr>
-            <w:r>
-              <w:rPr>
-                <w:rFonts w:ascii="Arial" w:cs="Arial" w:eastAsia="Arial" w:hAnsi="Arial"/>
-                <w:i w:val="false"/>
-                <w:iCs w:val="false"/>
-                <w:color w:val="000000"/>
-                <w:sz w:val="18"/>
-                <w:szCs w:val="18"/>
-              </w:rPr>
-              <w:t xml:space="preserve">3.4.4</w:t>
-            </w:r>
-          </w:p>
-        </w:tc>
-        <w:tc>
-          <w:tcPr>
-            <w:tcW w:type="dxa" w:w="5300"/>
-            <w:tcMar>
-              <w:top w:type="dxa" w:w="60"/>
-              <w:left w:type="dxa" w:w="100"/>
-              <w:bottom w:type="dxa" w:w="60"/>
-              <w:right w:type="dxa" w:w="100"/>
-            </w:tcMar>
-            <w:vAlign w:val="top"/>
-          </w:tcPr>
-          <w:p>
-            <w:pPr>
-              <w:spacing w:after="40" w:before="40"/>
-            </w:pPr>
-            <w:r>
-              <w:rPr>
-                <w:rFonts w:ascii="Arial" w:cs="Arial" w:eastAsia="Arial" w:hAnsi="Arial"/>
-                <w:i w:val="false"/>
-                <w:iCs w:val="false"/>
-                <w:color w:val="000000"/>
-                <w:sz w:val="18"/>
-                <w:szCs w:val="18"/>
-              </w:rPr>
-              <w:t xml:space="preserve">The minimum period to execute a termination provision should be specified in the outsourcing agreement. Other provisions should also be put in place to ensure a smooth transition when the agreement is terminated or being amended. Such provisions may facilitate transferability of the outsourced services to a bridge-institution14 or a third party. Where the outsourcing agreement involves an intra-group entity, the agreement should be legally enforceable against the intra-group entity providing the outsourced service.</w:t>
+              <w:t xml:space="preserve">11 – Refer to paragraph 5.8.</w:t>
             </w:r>
           </w:p>
           <w:p>
@@ -6259,7 +6144,130 @@
                 <w:sz w:val="14"/>
                 <w:szCs w:val="14"/>
               </w:rPr>
-              <w:t xml:space="preserve">14 – "bridge-institution" means an institution, whether incorporated in Singapore or outside Singapore, to temporarily take over and maintain certain assets, liabilities and operations of a distressed financial institution, as part of a resolution Authority's exercise of a resolution.</w:t>
+              <w:t xml:space="preserve">12 – Refer to paragraph 5.9.</w:t>
+            </w:r>
+          </w:p>
+        </w:tc>
+        <w:tc>
+          <w:tcPr>
+            <w:tcW w:type="dxa" w:w="3000"/>
+            <w:tcMar>
+              <w:top w:type="dxa" w:w="60"/>
+              <w:left w:type="dxa" w:w="100"/>
+              <w:bottom w:type="dxa" w:w="60"/>
+              <w:right w:type="dxa" w:w="100"/>
+            </w:tcMar>
+            <w:vAlign w:val="top"/>
+          </w:tcPr>
+          <w:p>
+            <w:pPr>
+              <w:spacing w:after="40" w:before="40"/>
+            </w:pPr>
+            <w:r>
+              <w:rPr>
+                <w:rFonts w:ascii="Arial" w:cs="Arial" w:eastAsia="Arial" w:hAnsi="Arial"/>
+                <w:i w:val="false"/>
+                <w:iCs w:val="false"/>
+                <w:color w:val="000000"/>
+                <w:sz w:val="18"/>
+                <w:szCs w:val="18"/>
+              </w:rPr>
+              <w:t xml:space="preserve">1.  Same core checklist, found at FI ¶5.5.2, with three differences: (i) the FI list adds </w:t>
+            </w:r>
+            <w:r>
+              <w:rPr>
+                <w:rFonts w:ascii="Arial" w:cs="Arial" w:eastAsia="Arial" w:hAnsi="Arial"/>
+                <w:i w:val="false"/>
+                <w:iCs w:val="false"/>
+                <w:color w:val="000000"/>
+                <w:sz w:val="18"/>
+                <w:szCs w:val="18"/>
+                <w:highlight w:val="yellow"/>
+                <w:highlightCs w:val="yellow"/>
+              </w:rPr>
+              <w:t xml:space="preserve">item (j) sub-contracting</w:t>
+            </w:r>
+            <w:r>
+              <w:rPr>
+                <w:rFonts w:ascii="Arial" w:cs="Arial" w:eastAsia="Arial" w:hAnsi="Arial"/>
+                <w:i w:val="false"/>
+                <w:iCs w:val="false"/>
+                <w:color w:val="000000"/>
+                <w:sz w:val="18"/>
+                <w:szCs w:val="18"/>
+              </w:rPr>
+              <w:t xml:space="preserve"> (the Bank Guidelines deal with sub-contracting in a dedicated §3.5); (ii) Bank footnotes 9 and 12 require MOORS agreements to include the binding requirements of Notices ¶7.1(a)–(c) and ¶7.1(d) — no FI equivalent; (iii) the FI version expands "default termination and early exit" inline (see next row).</w:t>
+            </w:r>
+          </w:p>
+        </w:tc>
+      </w:tr>
+      <w:tr>
+        <w:tc>
+          <w:tcPr>
+            <w:tcW w:type="dxa" w:w="800"/>
+            <w:tcMar>
+              <w:top w:type="dxa" w:w="60"/>
+              <w:left w:type="dxa" w:w="100"/>
+              <w:bottom w:type="dxa" w:w="60"/>
+              <w:right w:type="dxa" w:w="100"/>
+            </w:tcMar>
+            <w:vAlign w:val="top"/>
+          </w:tcPr>
+          <w:p>
+            <w:pPr>
+              <w:spacing w:after="40" w:before="40"/>
+            </w:pPr>
+            <w:r>
+              <w:rPr>
+                <w:rFonts w:ascii="Arial" w:cs="Arial" w:eastAsia="Arial" w:hAnsi="Arial"/>
+                <w:i w:val="false"/>
+                <w:iCs w:val="false"/>
+                <w:color w:val="000000"/>
+                <w:sz w:val="18"/>
+                <w:szCs w:val="18"/>
+              </w:rPr>
+              <w:t xml:space="preserve">3.4.3</w:t>
+            </w:r>
+          </w:p>
+        </w:tc>
+        <w:tc>
+          <w:tcPr>
+            <w:tcW w:type="dxa" w:w="5300"/>
+            <w:tcMar>
+              <w:top w:type="dxa" w:w="60"/>
+              <w:left w:type="dxa" w:w="100"/>
+              <w:bottom w:type="dxa" w:w="60"/>
+              <w:right w:type="dxa" w:w="100"/>
+            </w:tcMar>
+            <w:vAlign w:val="top"/>
+          </w:tcPr>
+          <w:p>
+            <w:pPr>
+              <w:spacing w:after="40" w:before="40"/>
+            </w:pPr>
+            <w:r>
+              <w:rPr>
+                <w:rFonts w:ascii="Arial" w:cs="Arial" w:eastAsia="Arial" w:hAnsi="Arial"/>
+                <w:i w:val="false"/>
+                <w:iCs w:val="false"/>
+                <w:color w:val="000000"/>
+                <w:sz w:val="18"/>
+                <w:szCs w:val="18"/>
+              </w:rPr>
+              <w:t xml:space="preserve">A Bank should have the right to terminate the outsourcing agreement in the event of default, or under any of the following circumstances: </w:t>
+            </w:r>
+            <w:r>
+              <w:rPr>
+                <w:rFonts w:ascii="Arial" w:cs="Arial" w:eastAsia="Arial" w:hAnsi="Arial"/>
+                <w:i w:val="false"/>
+                <w:iCs w:val="false"/>
+                <w:color w:val="000000"/>
+                <w:sz w:val="18"/>
+                <w:szCs w:val="18"/>
+                <w:highlight w:val="yellow"/>
+                <w:highlightCs w:val="yellow"/>
+              </w:rPr>
+              <w:t xml:space="preserve">(a) by giving reasonable notice to the service provider; (b) if the service provider or a sub-contractor, as the case may be, failed to safeguard the confidentiality or integrity of customer information of the Bank; or (c) if there has been a demonstrable deterioration in the ability of the service provider or a sub-contractor to safeguard the confidentiality of customer information.</w:t>
             </w:r>
           </w:p>
         </w:tc>
@@ -6289,18 +6297,133 @@
                 <w:sz w:val="18"/>
                 <w:szCs w:val="18"/>
               </w:rPr>
-              <w:t xml:space="preserve">[¶5.5.2(i) (closing text)]</w:t>
-            </w:r>
-            <w:r>
-              <w:rPr>
-                <w:rFonts w:ascii="Arial" w:cs="Arial" w:eastAsia="Arial" w:hAnsi="Arial"/>
-                <w:i w:val="false"/>
-                <w:iCs w:val="false"/>
-                <w:color w:val="000000"/>
-                <w:sz w:val="18"/>
-                <w:szCs w:val="18"/>
-              </w:rPr>
-              <w:t xml:space="preserve"> The minimum period to execute a termination provision should be specified in the outsourcing agreement. Other provisions should also be put in place to ensure a smooth transition when the agreement is terminated or being amended. Such provisions may facilitate transferability of the outsourced services to a bridge-institution14 or a third party. Where the outsourcing agreement involves an intra-group entity, the agreement should be legally enforceable against the intra-group entity providing the outsourced service.</w:t>
+              <w:t xml:space="preserve">[¶5.5.2(i)]</w:t>
+            </w:r>
+            <w:r>
+              <w:rPr>
+                <w:rFonts w:ascii="Arial" w:cs="Arial" w:eastAsia="Arial" w:hAnsi="Arial"/>
+                <w:i w:val="false"/>
+                <w:iCs w:val="false"/>
+                <w:color w:val="000000"/>
+                <w:sz w:val="18"/>
+                <w:szCs w:val="18"/>
+              </w:rPr>
+              <w:t xml:space="preserve"> An institution should, have the right to terminate the outsourcing agreement in the event of default, or under circumstances where: </w:t>
+            </w:r>
+            <w:r>
+              <w:rPr>
+                <w:rFonts w:ascii="Arial" w:cs="Arial" w:eastAsia="Arial" w:hAnsi="Arial"/>
+                <w:i w:val="false"/>
+                <w:iCs w:val="false"/>
+                <w:color w:val="000000"/>
+                <w:sz w:val="18"/>
+                <w:szCs w:val="18"/>
+                <w:highlight w:val="yellow"/>
+                <w:highlightCs w:val="yellow"/>
+              </w:rPr>
+              <w:t xml:space="preserve">(i) the service provider undergoes a change in ownership; (ii) the service provider becomes insolvent or goes into liquidation; (iii) the service provider goes into receivership or judicial management whether in Singapore or elsewhere; (iv) there has been a breach of security or confidentiality; or (v) there is a demonstrable deterioration in the ability of the service provider to perform the contracted service.</w:t>
+            </w:r>
+          </w:p>
+        </w:tc>
+        <w:tc>
+          <w:tcPr>
+            <w:tcW w:type="dxa" w:w="3000"/>
+            <w:tcMar>
+              <w:top w:type="dxa" w:w="60"/>
+              <w:left w:type="dxa" w:w="100"/>
+              <w:bottom w:type="dxa" w:w="60"/>
+              <w:right w:type="dxa" w:w="100"/>
+            </w:tcMar>
+            <w:vAlign w:val="top"/>
+          </w:tcPr>
+          <w:p>
+            <w:pPr>
+              <w:spacing w:after="40" w:before="40"/>
+            </w:pPr>
+            <w:r>
+              <w:rPr>
+                <w:rFonts w:ascii="Arial" w:cs="Arial" w:eastAsia="Arial" w:hAnsi="Arial"/>
+                <w:i w:val="false"/>
+                <w:iCs w:val="false"/>
+                <w:color w:val="000000"/>
+                <w:sz w:val="18"/>
+                <w:szCs w:val="18"/>
+              </w:rPr>
+              <w:t xml:space="preserve">1.  Materially different trigger lists. The FI version keeps the traditional corporate-event triggers (change of ownership; insolvency/liquidation; receivership/judicial management) and a service-performance trigger; the Bank list is confidentiality-centred (extending expressly to sub-contractor failures) and adds a no-fault reasonable-notice right.</w:t>
+            </w:r>
+          </w:p>
+          <w:p>
+            <w:pPr>
+              <w:spacing w:after="40" w:before="40"/>
+            </w:pPr>
+            <w:r>
+              <w:rPr>
+                <w:rFonts w:ascii="Arial" w:cs="Arial" w:eastAsia="Arial" w:hAnsi="Arial"/>
+                <w:i w:val="false"/>
+                <w:iCs w:val="false"/>
+                <w:color w:val="000000"/>
+                <w:sz w:val="18"/>
+                <w:szCs w:val="18"/>
+              </w:rPr>
+              <w:t xml:space="preserve">2.  The Bank Guidelines recite no corporate-event triggers — banks’ binding contractual requirements are prescribed by Notices ¶7.1, whose full content the Guidelines do not reproduce. On the face of the two Guidelines, the FI list is the broader one.</w:t>
+            </w:r>
+          </w:p>
+        </w:tc>
+      </w:tr>
+      <w:tr>
+        <w:tc>
+          <w:tcPr>
+            <w:tcW w:type="dxa" w:w="800"/>
+            <w:tcMar>
+              <w:top w:type="dxa" w:w="60"/>
+              <w:left w:type="dxa" w:w="100"/>
+              <w:bottom w:type="dxa" w:w="60"/>
+              <w:right w:type="dxa" w:w="100"/>
+            </w:tcMar>
+            <w:vAlign w:val="top"/>
+          </w:tcPr>
+          <w:p>
+            <w:pPr>
+              <w:spacing w:after="40" w:before="40"/>
+            </w:pPr>
+            <w:r>
+              <w:rPr>
+                <w:rFonts w:ascii="Arial" w:cs="Arial" w:eastAsia="Arial" w:hAnsi="Arial"/>
+                <w:i w:val="false"/>
+                <w:iCs w:val="false"/>
+                <w:color w:val="000000"/>
+                <w:sz w:val="18"/>
+                <w:szCs w:val="18"/>
+              </w:rPr>
+              <w:t xml:space="preserve">3.4.4</w:t>
+            </w:r>
+          </w:p>
+        </w:tc>
+        <w:tc>
+          <w:tcPr>
+            <w:tcW w:type="dxa" w:w="5300"/>
+            <w:tcMar>
+              <w:top w:type="dxa" w:w="60"/>
+              <w:left w:type="dxa" w:w="100"/>
+              <w:bottom w:type="dxa" w:w="60"/>
+              <w:right w:type="dxa" w:w="100"/>
+            </w:tcMar>
+            <w:vAlign w:val="top"/>
+          </w:tcPr>
+          <w:p>
+            <w:pPr>
+              <w:spacing w:after="40" w:before="40"/>
+            </w:pPr>
+            <w:r>
+              <w:rPr>
+                <w:rFonts w:ascii="Arial" w:cs="Arial" w:eastAsia="Arial" w:hAnsi="Arial"/>
+                <w:i w:val="false"/>
+                <w:iCs w:val="false"/>
+                <w:color w:val="000000"/>
+                <w:sz w:val="18"/>
+                <w:szCs w:val="18"/>
+              </w:rPr>
+              <w:t xml:space="preserve">The minimum period to execute a termination provision should be specified in the outsourcing agreement. Other provisions should also be put in place to ensure a smooth transition when the agreement is terminated or being amended. Such provisions may facilitate transferability of the outsourced services to a bridge-institution14 or a third party. Where the outsourcing agreement involves an intra-group entity, the agreement should be legally enforceable against the intra-group entity providing the outsourced service.</w:t>
             </w:r>
           </w:p>
           <w:p>
@@ -6322,124 +6445,42 @@
         </w:tc>
         <w:tc>
           <w:tcPr>
-            <w:tcW w:type="dxa" w:w="3000"/>
-            <w:tcMar>
-              <w:top w:type="dxa" w:w="60"/>
-              <w:left w:type="dxa" w:w="100"/>
-              <w:bottom w:type="dxa" w:w="60"/>
-              <w:right w:type="dxa" w:w="100"/>
-            </w:tcMar>
-            <w:vAlign w:val="top"/>
-          </w:tcPr>
-          <w:p>
-            <w:pPr>
-              <w:spacing w:after="40" w:before="40"/>
-            </w:pPr>
-            <w:r>
-              <w:rPr>
-                <w:rFonts w:ascii="Arial" w:cs="Arial" w:eastAsia="Arial" w:hAnsi="Arial"/>
-                <w:i w:val="false"/>
-                <w:iCs w:val="false"/>
-                <w:color w:val="000000"/>
-                <w:sz w:val="18"/>
-                <w:szCs w:val="18"/>
-              </w:rPr>
-              <w:t xml:space="preserve">1.  Found in the closing text of FI ¶5.5.2(i), worded identically ("bridge-institution" defined identically at FI fn 13).</w:t>
-            </w:r>
-          </w:p>
-        </w:tc>
-      </w:tr>
-      <w:tr>
-        <w:tc>
-          <w:tcPr>
-            <w:tcW w:type="dxa" w:w="800"/>
-            <w:tcMar>
-              <w:top w:type="dxa" w:w="60"/>
-              <w:left w:type="dxa" w:w="100"/>
-              <w:bottom w:type="dxa" w:w="60"/>
-              <w:right w:type="dxa" w:w="100"/>
-            </w:tcMar>
-            <w:vAlign w:val="top"/>
-          </w:tcPr>
-          <w:p>
-            <w:pPr>
-              <w:spacing w:after="40" w:before="40"/>
-            </w:pPr>
-            <w:r>
-              <w:rPr>
-                <w:rFonts w:ascii="Arial" w:cs="Arial" w:eastAsia="Arial" w:hAnsi="Arial"/>
-                <w:i w:val="false"/>
-                <w:iCs w:val="false"/>
-                <w:color w:val="000000"/>
-                <w:sz w:val="18"/>
-                <w:szCs w:val="18"/>
-              </w:rPr>
-              <w:t xml:space="preserve">3.4.5</w:t>
-            </w:r>
-          </w:p>
-        </w:tc>
-        <w:tc>
-          <w:tcPr>
-            <w:tcW w:type="dxa" w:w="5300"/>
-            <w:tcMar>
-              <w:top w:type="dxa" w:w="60"/>
-              <w:left w:type="dxa" w:w="100"/>
-              <w:bottom w:type="dxa" w:w="60"/>
-              <w:right w:type="dxa" w:w="100"/>
-            </w:tcMar>
-            <w:vAlign w:val="top"/>
-          </w:tcPr>
-          <w:p>
-            <w:pPr>
-              <w:spacing w:after="40" w:before="40"/>
-            </w:pPr>
-            <w:r>
-              <w:rPr>
-                <w:rFonts w:ascii="Arial" w:cs="Arial" w:eastAsia="Arial" w:hAnsi="Arial"/>
-                <w:i w:val="false"/>
-                <w:iCs w:val="false"/>
-                <w:color w:val="000000"/>
-                <w:sz w:val="18"/>
-                <w:szCs w:val="18"/>
-                <w:highlight w:val="yellow"/>
-                <w:highlightCs w:val="yellow"/>
-              </w:rPr>
-              <w:t xml:space="preserve">For the purposes of paragraph 7.1(g) in the Notices, MAS will consider directing a Bank to terminate the contract, or to stop obtaining or receiving the MOORS15, when</w:t>
-            </w:r>
-            <w:r>
-              <w:rPr>
-                <w:rFonts w:ascii="Arial" w:cs="Arial" w:eastAsia="Arial" w:hAnsi="Arial"/>
-                <w:i w:val="false"/>
-                <w:iCs w:val="false"/>
-                <w:color w:val="000000"/>
-                <w:sz w:val="18"/>
-                <w:szCs w:val="18"/>
-              </w:rPr>
-              <w:t xml:space="preserve"> (a) circumstances referred to in paragraph 10.3 of the Notices arise and the service provider is unwilling or unable to remediate the issues; (b) the service provider is unable or unwilling to remediate issues and the Bank did not elect to terminate the outsourcing agreement of its own accord; (c) a Bank fails or is unable to demonstrate a satisfactory level of understanding of the nature and extent of risk arising from the MOORS; (d) a Bank fails or is unable to implement adequate measures to address the risks arising from its ongoing outsourced relevant services in a satisfactory and timely manner; (e) adverse developments arise from the MOORS that could impact a Bank; (f) </w:t>
-            </w:r>
-            <w:r>
-              <w:rPr>
-                <w:rFonts w:ascii="Arial" w:cs="Arial" w:eastAsia="Arial" w:hAnsi="Arial"/>
-                <w:i w:val="false"/>
-                <w:iCs w:val="false"/>
-                <w:color w:val="000000"/>
-                <w:sz w:val="18"/>
-                <w:szCs w:val="18"/>
-                <w:highlight w:val="yellow"/>
-                <w:highlightCs w:val="yellow"/>
-              </w:rPr>
-              <w:t xml:space="preserve">MAS or an auditor appointed by MAS, is prevented by the service provider from auditing the books, systems and premises of the service provider for any of the purposes mentioned in section 47A(10) of the Banking Act 1970 (the "Act")</w:t>
-            </w:r>
-            <w:r>
-              <w:rPr>
-                <w:rFonts w:ascii="Arial" w:cs="Arial" w:eastAsia="Arial" w:hAnsi="Arial"/>
-                <w:i w:val="false"/>
-                <w:iCs w:val="false"/>
-                <w:color w:val="000000"/>
-                <w:sz w:val="18"/>
-                <w:szCs w:val="18"/>
-              </w:rPr>
-              <w:t xml:space="preserve">; (g) where the sub-contracting agreement provides for the matter mentioned in paragraph 3.5.3(b)(iv), the Bank or any auditor appointed by the Bank, is prevented by the sub-contractor from auditing the books, systems and premises of the sub-contractor for any of the purposes mentioned in paragraph 3.5.3(b)(iv); or (h) where the sub-contracting agreement provides for the matter mentioned in paragraph 3.5.3(b)(v), the Bank, or any person appointed by the Bank, is prevented by the sub-contractor from obtaining any record, document, report or information relating to the sub-contracting arrangement.</w:t>
+            <w:tcW w:type="dxa" w:w="5300"/>
+            <w:tcMar>
+              <w:top w:type="dxa" w:w="60"/>
+              <w:left w:type="dxa" w:w="100"/>
+              <w:bottom w:type="dxa" w:w="60"/>
+              <w:right w:type="dxa" w:w="100"/>
+            </w:tcMar>
+            <w:vAlign w:val="top"/>
+          </w:tcPr>
+          <w:p>
+            <w:pPr>
+              <w:spacing w:after="40" w:before="40"/>
+            </w:pPr>
+            <w:r>
+              <w:rPr>
+                <w:rFonts w:ascii="Arial" w:cs="Arial" w:eastAsia="Arial" w:hAnsi="Arial"/>
+                <w:b/>
+                <w:bCs/>
+                <w:i w:val="false"/>
+                <w:iCs w:val="false"/>
+                <w:color w:val="000000"/>
+                <w:sz w:val="18"/>
+                <w:szCs w:val="18"/>
+              </w:rPr>
+              <w:t xml:space="preserve">[¶5.5.2(i) (closing text)]</w:t>
+            </w:r>
+            <w:r>
+              <w:rPr>
+                <w:rFonts w:ascii="Arial" w:cs="Arial" w:eastAsia="Arial" w:hAnsi="Arial"/>
+                <w:i w:val="false"/>
+                <w:iCs w:val="false"/>
+                <w:color w:val="000000"/>
+                <w:sz w:val="18"/>
+                <w:szCs w:val="18"/>
+              </w:rPr>
+              <w:t xml:space="preserve"> The minimum period to execute a termination provision should be specified in the outsourcing agreement. Other provisions should also be put in place to ensure a smooth transition when the agreement is terminated or being amended. Such provisions may facilitate transferability of the outsourced services to a bridge-institution13 or a third party. Where the outsourcing agreement involves an intra-group entity, the agreement should be legally enforceable against the intra-group entity providing the outsourced service.</w:t>
             </w:r>
           </w:p>
           <w:p>
@@ -6455,6 +6496,145 @@
                 <w:sz w:val="14"/>
                 <w:szCs w:val="14"/>
               </w:rPr>
+              <w:t xml:space="preserve">13 – "bridge-institution" means an institution, whether incorporated in Singapore or outside Singapore, to temporarily take over and maintain certain assets, liabilities and operations of a distressed financial institution, as part of a resolution Authority's exercise of a resolution.</w:t>
+            </w:r>
+          </w:p>
+        </w:tc>
+        <w:tc>
+          <w:tcPr>
+            <w:tcW w:type="dxa" w:w="3000"/>
+            <w:tcMar>
+              <w:top w:type="dxa" w:w="60"/>
+              <w:left w:type="dxa" w:w="100"/>
+              <w:bottom w:type="dxa" w:w="60"/>
+              <w:right w:type="dxa" w:w="100"/>
+            </w:tcMar>
+            <w:vAlign w:val="top"/>
+          </w:tcPr>
+          <w:p>
+            <w:pPr>
+              <w:spacing w:after="40" w:before="40"/>
+            </w:pPr>
+            <w:r>
+              <w:rPr>
+                <w:rFonts w:ascii="Arial" w:cs="Arial" w:eastAsia="Arial" w:hAnsi="Arial"/>
+                <w:i w:val="false"/>
+                <w:iCs w:val="false"/>
+                <w:color w:val="000000"/>
+                <w:sz w:val="18"/>
+                <w:szCs w:val="18"/>
+              </w:rPr>
+              <w:t xml:space="preserve">1.  Found in the closing text of FI ¶5.5.2(i), worded identically ("bridge-institution" defined identically at FI fn 13).</w:t>
+            </w:r>
+          </w:p>
+        </w:tc>
+      </w:tr>
+      <w:tr>
+        <w:tc>
+          <w:tcPr>
+            <w:tcW w:type="dxa" w:w="800"/>
+            <w:tcMar>
+              <w:top w:type="dxa" w:w="60"/>
+              <w:left w:type="dxa" w:w="100"/>
+              <w:bottom w:type="dxa" w:w="60"/>
+              <w:right w:type="dxa" w:w="100"/>
+            </w:tcMar>
+            <w:vAlign w:val="top"/>
+          </w:tcPr>
+          <w:p>
+            <w:pPr>
+              <w:spacing w:after="40" w:before="40"/>
+            </w:pPr>
+            <w:r>
+              <w:rPr>
+                <w:rFonts w:ascii="Arial" w:cs="Arial" w:eastAsia="Arial" w:hAnsi="Arial"/>
+                <w:i w:val="false"/>
+                <w:iCs w:val="false"/>
+                <w:color w:val="000000"/>
+                <w:sz w:val="18"/>
+                <w:szCs w:val="18"/>
+              </w:rPr>
+              <w:t xml:space="preserve">3.4.5</w:t>
+            </w:r>
+          </w:p>
+        </w:tc>
+        <w:tc>
+          <w:tcPr>
+            <w:tcW w:type="dxa" w:w="5300"/>
+            <w:tcMar>
+              <w:top w:type="dxa" w:w="60"/>
+              <w:left w:type="dxa" w:w="100"/>
+              <w:bottom w:type="dxa" w:w="60"/>
+              <w:right w:type="dxa" w:w="100"/>
+            </w:tcMar>
+            <w:vAlign w:val="top"/>
+          </w:tcPr>
+          <w:p>
+            <w:pPr>
+              <w:spacing w:after="40" w:before="40"/>
+            </w:pPr>
+            <w:r>
+              <w:rPr>
+                <w:rFonts w:ascii="Arial" w:cs="Arial" w:eastAsia="Arial" w:hAnsi="Arial"/>
+                <w:i w:val="false"/>
+                <w:iCs w:val="false"/>
+                <w:color w:val="000000"/>
+                <w:sz w:val="18"/>
+                <w:szCs w:val="18"/>
+                <w:highlight w:val="yellow"/>
+                <w:highlightCs w:val="yellow"/>
+              </w:rPr>
+              <w:t xml:space="preserve">For the purposes of paragraph 7.1(g) in the Notices, MAS will consider directing a Bank to terminate the contract, or to stop obtaining or receiving the MOORS15, when</w:t>
+            </w:r>
+            <w:r>
+              <w:rPr>
+                <w:rFonts w:ascii="Arial" w:cs="Arial" w:eastAsia="Arial" w:hAnsi="Arial"/>
+                <w:i w:val="false"/>
+                <w:iCs w:val="false"/>
+                <w:color w:val="000000"/>
+                <w:sz w:val="18"/>
+                <w:szCs w:val="18"/>
+              </w:rPr>
+              <w:t xml:space="preserve"> (a) circumstances referred to in paragraph 10.3 of the Notices arise and the service provider is unwilling or unable to remediate the issues; (b) the service provider is unable or unwilling to remediate issues and the Bank did not elect to terminate the outsourcing agreement of its own accord; (c) a Bank fails or is unable to demonstrate a satisfactory level of understanding of the nature and extent of risk arising from the MOORS; (d) a Bank fails or is unable to implement adequate measures to address the risks arising from its ongoing outsourced relevant services in a satisfactory and timely manner; (e) adverse developments arise from the MOORS that could impact a Bank; (f) </w:t>
+            </w:r>
+            <w:r>
+              <w:rPr>
+                <w:rFonts w:ascii="Arial" w:cs="Arial" w:eastAsia="Arial" w:hAnsi="Arial"/>
+                <w:i w:val="false"/>
+                <w:iCs w:val="false"/>
+                <w:color w:val="000000"/>
+                <w:sz w:val="18"/>
+                <w:szCs w:val="18"/>
+                <w:highlight w:val="yellow"/>
+                <w:highlightCs w:val="yellow"/>
+              </w:rPr>
+              <w:t xml:space="preserve">MAS or an auditor appointed by MAS, is prevented by the service provider from auditing the books, systems and premises of the service provider for any of the purposes mentioned in section 47A(10) of the Banking Act 1970 (the "Act")</w:t>
+            </w:r>
+            <w:r>
+              <w:rPr>
+                <w:rFonts w:ascii="Arial" w:cs="Arial" w:eastAsia="Arial" w:hAnsi="Arial"/>
+                <w:i w:val="false"/>
+                <w:iCs w:val="false"/>
+                <w:color w:val="000000"/>
+                <w:sz w:val="18"/>
+                <w:szCs w:val="18"/>
+              </w:rPr>
+              <w:t xml:space="preserve">; (g) where the sub-contracting agreement provides for the matter mentioned in paragraph 3.5.3(b)(iv), the Bank or any auditor appointed by the Bank, is prevented by the sub-contractor from auditing the books, systems and premises of the sub-contractor for any of the purposes mentioned in paragraph 3.5.3(b)(iv); or (h) where the sub-contracting agreement provides for the matter mentioned in paragraph 3.5.3(b)(v), the Bank, or any person appointed by the Bank, is prevented by the sub-contractor from obtaining any record, document, report or information relating to the sub-contracting arrangement.</w:t>
+            </w:r>
+          </w:p>
+          <w:p>
+            <w:pPr>
+              <w:spacing w:after="40" w:before="40"/>
+            </w:pPr>
+            <w:r>
+              <w:rPr>
+                <w:rFonts w:ascii="Arial" w:cs="Arial" w:eastAsia="Arial" w:hAnsi="Arial"/>
+                <w:i w:val="false"/>
+                <w:iCs w:val="false"/>
+                <w:color w:val="595959"/>
+                <w:sz w:val="14"/>
+                <w:szCs w:val="14"/>
+              </w:rPr>
               <w:t xml:space="preserve">15 – MAS will only direct Banks to terminate outsourcing agreements for MOORS as a last resort. Banks do not have to exercise the termination rights if they are able to work with the service provider to remediate the issues giving rise to the ground(s) for termination.</w:t>
             </w:r>
           </w:p>
@@ -6867,7 +7047,7 @@
                 <w:sz w:val="18"/>
                 <w:szCs w:val="18"/>
               </w:rPr>
-              <w:t xml:space="preserve"> Each agreement should be tailored to address issues arising from country risks and potential obstacles in exercising oversight and management of the outsourcing arrangements made with a service provider outside Singapore16.</w:t>
+              <w:t xml:space="preserve"> Each agreement should be tailored to address issues arising from country risks and potential obstacles in exercising oversight and management of the outsourcing arrangements made with a service provider outside Singapore14.</w:t>
             </w:r>
           </w:p>
           <w:p>
@@ -6883,7 +7063,7 @@
                 <w:sz w:val="14"/>
                 <w:szCs w:val="14"/>
               </w:rPr>
-              <w:t xml:space="preserve">16 – Refer to paragraph 5.10.</w:t>
+              <w:t xml:space="preserve">14 – Refer to paragraph 5.10.</w:t>
             </w:r>
           </w:p>
         </w:tc>
@@ -8048,7 +8228,7 @@
                 <w:sz w:val="18"/>
                 <w:szCs w:val="18"/>
               </w:rPr>
-              <w:t xml:space="preserve"> An institution should be proactive in identifying and specifying requirements for confidentiality and security in the outsourcing arrangement. An institution should take the following steps to protect the confidentiality and security of customer information: (a) State the responsibilities of contracting parties in the outsourcing agreement to ensure the adequacy and effectiveness of security policies and practices, including the circumstances under which each party has the right to change security requirements. The outsourcing agreement should also address: (i) the issue of the party liable for losses in the event of a breach of security or confidentiality and the service provider's obligation to inform the institution; and (ii) the issue of access to and disclosure of customer information by the service provider. Customer information should be used by the service provider and its staff strictly for the purpose of the contracted service; (b) Disclose customer information to the service provider only on a need-to-know basis; (c) Ensure the service provider is able to protect the confidentiality of customer information, documents, records, and assets, particularly where multi-tenancy20 arrangements are present at the service provider; and (d) Review and monitor the security practices and control processes of the service provider on a regular basis, including commissioning audits or obtaining periodic expert reports on confidentiality, security adequacy and compliance in respect of the operations of the service provider, and requiring the service provider to disclose to the institution breaches of confidentiality in relation to customer information.</w:t>
+              <w:t xml:space="preserve"> An institution should be proactive in identifying and specifying requirements for confidentiality and security in the outsourcing arrangement. An institution should take the following steps to protect the confidentiality and security of customer information: (a) State the responsibilities of contracting parties in the outsourcing agreement to ensure the adequacy and effectiveness of security policies and practices, including the circumstances under which each party has the right to change security requirements. The outsourcing agreement should also address: (i) the issue of the party liable for losses in the event of a breach of security or confidentiality and the service provider's obligation to inform the institution; and (ii) the issue of access to and disclosure of customer information by the service provider. Customer information should be used by the service provider and its staff strictly for the purpose of the contracted service; (b) Disclose customer information to the service provider only on a need-to-know basis; (c) Ensure the service provider is able to protect the confidentiality of customer information, documents, records, and assets, particularly where multi-tenancy15 arrangements are present at the service provider; and (d) Review and monitor the security practices and control processes of the service provider on a regular basis, including commissioning audits or obtaining periodic expert reports on confidentiality, security adequacy and compliance in respect of the operations of the service provider, and requiring the service provider to disclose to the institution breaches of confidentiality in relation to customer information.</w:t>
             </w:r>
           </w:p>
           <w:p>
@@ -8064,7 +8244,7 @@
                 <w:sz w:val="14"/>
                 <w:szCs w:val="14"/>
               </w:rPr>
-              <w:t xml:space="preserve">20 – Multi-tenancy generally refers to a mode of operation adopted by service providers where a single computing infrastructure (e.g. servers, databases) is used to serve multiple customers (tenants).</w:t>
+              <w:t xml:space="preserve">15 – Multi-tenancy generally refers to a mode of operation adopted by service providers where a single computing infrastructure (e.g. servers, databases) is used to serve multiple customers (tenants).</w:t>
             </w:r>
           </w:p>
         </w:tc>
@@ -9113,7 +9293,7 @@
                 <w:sz w:val="18"/>
                 <w:szCs w:val="18"/>
               </w:rPr>
-              <w:t xml:space="preserve"> of outsourcing arrangements and ensure that the register is readily accessible for review by the board and senior management of the Bank. The register should be updated promptly and form part of the oversight and governance reviews undertaken by the board and senior management of the Bank, similar to those described in paragraph 3.1; (b) Establish multi-disciplinary outsourcing management groups with members from different risk and internal control functions including legal, compliance and finance, to ensure that all relevant technical issues and legal and regulatory requirements are met. The Bank should allocate sufficient resources, in terms of both time and skilled manpower, to the management groups to enable its staff to adequately plan and oversee the entire outsourcing lifecycle; (c) Establish outsourcing management control groups to monitor and control the outsourced relevant service on an ongoing basis. There should be policies and procedures to monitor service delivery and the confidentiality and security of customer information, for the purpose of gauging ongoing compliance with agreed service levels and the viability of the Bank's operations. Such monitoring should be regular and validated through the review of reports by auditors of the service provider or audits commissioned by the Bank; (d) Reporting policies and procedures — Reports on the monitoring and control activities of the Bank should be reviewed by its senior management and provided to the board for information. The Bank should ensure that monitoring metrics and performance data are not aggregated with those belonging to other customers of the service provider. The Bank should also ensure that any adverse development arising in any outsourcing arrangement is brought to the attention of the senior management of the Bank and service provider, or to the Bank's board, where warranted, on a timely basis. When an adverse development occurs, prompt actions should be taken by a Bank to review the outsourcing relationship for modification or termination of the agreement; and (e) Perform comprehensive pre- and post- implementation reviews of new outsourcing arrangements or when amendments are made to the outsourcing arrangements. If an outsourcing arrangement is materially amended, a comprehensive due diligence of the outsourcing arrangement should also be conducted.</w:t>
+              <w:t xml:space="preserve"> of outsourcing arrangements and ensure that the register is readily accessible for review by the board and senior management of the Bank. The register should be updated promptly and form part of the oversight and governance reviews undertaken by the board and senior management of the Bank, similar to those described in paragraph 3.1; (b) Establish multi-disciplinary outsourcing management groups with members from different risk and internal control functions including legal, compliance and finance, to ensure that all relevant technical issues and legal and regulatory requirements are met. The Bank should allocate sufficient resources, in terms of both time and skilled manpower, to the management groups to enable its staff to adequately plan and oversee the entire outsourcing lifecycle; (c) Establish outsourcing management control groups to monitor and control the outsourced relevant service on an ongoing basis. There should be policies and procedures to monitor service delivery and the confidentiality and security of customer information, for the purpose of gauging ongoing compliance with agreed service levels and the viability of the Bank's operations. Such monitoring should be regular and validated through the review of reports by auditors of the service provider or audits commissioned by the Bank; (d) Reporting policies and procedures — Reports on the monitoring and control activities of the Bank should be reviewed by its senior management22 and provided to the board for information. The Bank should ensure that monitoring metrics and performance data are not aggregated with those belonging to other customers of the service provider. The Bank should also ensure that any adverse development arising in any outsourcing arrangement is brought to the attention of the senior management of the Bank and service provider, or to the Bank's board, where warranted, on a timely basis. When an adverse development occurs, prompt actions should be taken by a Bank to review the outsourcing relationship for modification or termination of the agreement; and (e) Perform comprehensive pre- and post- implementation reviews of new outsourcing arrangements or when amendments are made to the outsourcing arrangements. If an outsourcing arrangement is materially amended, a comprehensive due diligence of the outsourcing arrangement should also be conducted.</w:t>
             </w:r>
           </w:p>
           <w:p>
@@ -9132,119 +9312,6 @@
               <w:t xml:space="preserve">21 – Banks should submit their registers according to the template set out at this link.</w:t>
             </w:r>
           </w:p>
-        </w:tc>
-        <w:tc>
-          <w:tcPr>
-            <w:tcW w:type="dxa" w:w="5300"/>
-            <w:tcMar>
-              <w:top w:type="dxa" w:w="60"/>
-              <w:left w:type="dxa" w:w="100"/>
-              <w:bottom w:type="dxa" w:w="60"/>
-              <w:right w:type="dxa" w:w="100"/>
-            </w:tcMar>
-            <w:vAlign w:val="top"/>
-          </w:tcPr>
-          <w:p>
-            <w:pPr>
-              <w:spacing w:after="40" w:before="40"/>
-            </w:pPr>
-            <w:r>
-              <w:rPr>
-                <w:rFonts w:ascii="Arial" w:cs="Arial" w:eastAsia="Arial" w:hAnsi="Arial"/>
-                <w:b/>
-                <w:bCs/>
-                <w:i w:val="false"/>
-                <w:iCs w:val="false"/>
-                <w:color w:val="000000"/>
-                <w:sz w:val="18"/>
-                <w:szCs w:val="18"/>
-              </w:rPr>
-              <w:t xml:space="preserve">[¶5.8.2]</w:t>
-            </w:r>
-            <w:r>
-              <w:rPr>
-                <w:rFonts w:ascii="Arial" w:cs="Arial" w:eastAsia="Arial" w:hAnsi="Arial"/>
-                <w:i w:val="false"/>
-                <w:iCs w:val="false"/>
-                <w:color w:val="000000"/>
-                <w:sz w:val="18"/>
-                <w:szCs w:val="18"/>
-              </w:rPr>
-              <w:t xml:space="preserve"> An institution should put in place all the following measures for effective monitoring and control of any </w:t>
-            </w:r>
-            <w:r>
-              <w:rPr>
-                <w:rFonts w:ascii="Arial" w:cs="Arial" w:eastAsia="Arial" w:hAnsi="Arial"/>
-                <w:i w:val="false"/>
-                <w:iCs w:val="false"/>
-                <w:color w:val="000000"/>
-                <w:sz w:val="18"/>
-                <w:szCs w:val="18"/>
-                <w:highlight w:val="yellow"/>
-                <w:highlightCs w:val="yellow"/>
-              </w:rPr>
-              <w:t xml:space="preserve">material outsourcing arrangement</w:t>
-            </w:r>
-            <w:r>
-              <w:rPr>
-                <w:rFonts w:ascii="Arial" w:cs="Arial" w:eastAsia="Arial" w:hAnsi="Arial"/>
-                <w:i w:val="false"/>
-                <w:iCs w:val="false"/>
-                <w:color w:val="000000"/>
-                <w:sz w:val="18"/>
-                <w:szCs w:val="18"/>
-              </w:rPr>
-              <w:t xml:space="preserve">: (a) Maintain a register of outsourcing arrangements and ensure that the register is readily accessible for review by the board and senior management of the institution. </w:t>
-            </w:r>
-            <w:r>
-              <w:rPr>
-                <w:rFonts w:ascii="Arial" w:cs="Arial" w:eastAsia="Arial" w:hAnsi="Arial"/>
-                <w:i w:val="false"/>
-                <w:iCs w:val="false"/>
-                <w:color w:val="000000"/>
-                <w:sz w:val="18"/>
-                <w:szCs w:val="18"/>
-                <w:highlight w:val="yellow"/>
-                <w:highlightCs w:val="yellow"/>
-              </w:rPr>
-              <w:t xml:space="preserve">Information maintained in the register should include those set out in Annex 4.</w:t>
-            </w:r>
-            <w:r>
-              <w:rPr>
-                <w:rFonts w:ascii="Arial" w:cs="Arial" w:eastAsia="Arial" w:hAnsi="Arial"/>
-                <w:i w:val="false"/>
-                <w:iCs w:val="false"/>
-                <w:color w:val="000000"/>
-                <w:sz w:val="18"/>
-                <w:szCs w:val="18"/>
-              </w:rPr>
-              <w:t xml:space="preserve"> The register should be updated promptly and form part of the oversight and governance reviews undertaken by the board and senior management of the institution, similar to those described in paragraph 5.2; (b) Establish multi-disciplinary outsourcing management groups with members from different risk and internal control functions including legal, compliance and finance, to ensure that all relevant technical issues and legal and regulatory requirements are met. The institution should allocate sufficient resources, in terms of both time and skilled manpower, to the management groups to enable its staff to adequately plan and oversee the entire outsourcing lifecycle; (c) Establish outsourcing management control groups to monitor and control the outsourced service on an ongoing basis. There should be policies and procedures to monitor service delivery and the confidentiality and security of customer information, for the purpose of gauging ongoing compliance with agreed service levels and the viability of the institution's operations. Such monitoring should be regular and validated through the review of reports by auditors of the service provider or audits commissioned by the institution; </w:t>
-            </w:r>
-            <w:r>
-              <w:rPr>
-                <w:rFonts w:ascii="Arial" w:cs="Arial" w:eastAsia="Arial" w:hAnsi="Arial"/>
-                <w:i w:val="false"/>
-                <w:iCs w:val="false"/>
-                <w:color w:val="000000"/>
-                <w:sz w:val="18"/>
-                <w:szCs w:val="18"/>
-                <w:highlight w:val="yellow"/>
-                <w:highlightCs w:val="yellow"/>
-              </w:rPr>
-              <w:t xml:space="preserve">(d) Periodic reviews, at least on an annual basis, on all material outsourcing arrangements. This is to ensure that the institution's outsourcing risk management policies and procedures, and these Guidelines, are effectively implemented. Such reviews should ascertain the adequacy of internal risk management and management information systems established by the institution (e.g. assessing the effectiveness of processes and metrics used to evaluate the performance and security of the service provider) and highlight any deficiency in the institution's systems of control;</w:t>
-            </w:r>
-            <w:r>
-              <w:rPr>
-                <w:rFonts w:ascii="Arial" w:cs="Arial" w:eastAsia="Arial" w:hAnsi="Arial"/>
-                <w:i w:val="false"/>
-                <w:iCs w:val="false"/>
-                <w:color w:val="000000"/>
-                <w:sz w:val="18"/>
-                <w:szCs w:val="18"/>
-              </w:rPr>
-              <w:t xml:space="preserve"> (e) Reporting policies and procedures — Reports on the monitoring and control activities of the institution should be reviewed by its senior management16 and provided to the board for information. The institution should ensure that monitoring metrics and performance data are not aggregated with those belonging to other customers of the service provider. The institution should also ensure that any adverse development arising in any outsourcing arrangement is brought to the attention of the senior management of the institution and service provider, or to the institution's board, where warranted, on a timely basis. When adverse development occurs, prompt actions should be taken by an institution to review the outsourcing relationship for modification or termination of the agreement; and (f) Perform comprehensive pre- and post- implementation reviews of new outsourcing arrangements or when amendments are made to the outsourcing arrangements. If an outsourcing arrangement is materially amended, a comprehensive due diligence of the outsourcing arrangement should also be conducted.</w:t>
-            </w:r>
-          </w:p>
           <w:p>
             <w:pPr>
               <w:spacing w:after="40" w:before="40"/>
@@ -9258,6 +9325,135 @@
                 <w:sz w:val="14"/>
                 <w:szCs w:val="14"/>
               </w:rPr>
+              <w:t xml:space="preserve">22 – Refer to paragraph 3.1.3.</w:t>
+            </w:r>
+          </w:p>
+        </w:tc>
+        <w:tc>
+          <w:tcPr>
+            <w:tcW w:type="dxa" w:w="5300"/>
+            <w:tcMar>
+              <w:top w:type="dxa" w:w="60"/>
+              <w:left w:type="dxa" w:w="100"/>
+              <w:bottom w:type="dxa" w:w="60"/>
+              <w:right w:type="dxa" w:w="100"/>
+            </w:tcMar>
+            <w:vAlign w:val="top"/>
+          </w:tcPr>
+          <w:p>
+            <w:pPr>
+              <w:spacing w:after="40" w:before="40"/>
+            </w:pPr>
+            <w:r>
+              <w:rPr>
+                <w:rFonts w:ascii="Arial" w:cs="Arial" w:eastAsia="Arial" w:hAnsi="Arial"/>
+                <w:b/>
+                <w:bCs/>
+                <w:i w:val="false"/>
+                <w:iCs w:val="false"/>
+                <w:color w:val="000000"/>
+                <w:sz w:val="18"/>
+                <w:szCs w:val="18"/>
+              </w:rPr>
+              <w:t xml:space="preserve">[¶5.8.2]</w:t>
+            </w:r>
+            <w:r>
+              <w:rPr>
+                <w:rFonts w:ascii="Arial" w:cs="Arial" w:eastAsia="Arial" w:hAnsi="Arial"/>
+                <w:i w:val="false"/>
+                <w:iCs w:val="false"/>
+                <w:color w:val="000000"/>
+                <w:sz w:val="18"/>
+                <w:szCs w:val="18"/>
+              </w:rPr>
+              <w:t xml:space="preserve"> An institution should put in place all the following measures for effective monitoring and control of any </w:t>
+            </w:r>
+            <w:r>
+              <w:rPr>
+                <w:rFonts w:ascii="Arial" w:cs="Arial" w:eastAsia="Arial" w:hAnsi="Arial"/>
+                <w:i w:val="false"/>
+                <w:iCs w:val="false"/>
+                <w:color w:val="000000"/>
+                <w:sz w:val="18"/>
+                <w:szCs w:val="18"/>
+                <w:highlight w:val="yellow"/>
+                <w:highlightCs w:val="yellow"/>
+              </w:rPr>
+              <w:t xml:space="preserve">material outsourcing arrangement</w:t>
+            </w:r>
+            <w:r>
+              <w:rPr>
+                <w:rFonts w:ascii="Arial" w:cs="Arial" w:eastAsia="Arial" w:hAnsi="Arial"/>
+                <w:i w:val="false"/>
+                <w:iCs w:val="false"/>
+                <w:color w:val="000000"/>
+                <w:sz w:val="18"/>
+                <w:szCs w:val="18"/>
+              </w:rPr>
+              <w:t xml:space="preserve">: (a) Maintain a register of outsourcing arrangements and ensure that the register is readily accessible for review by the board and senior management of the institution. </w:t>
+            </w:r>
+            <w:r>
+              <w:rPr>
+                <w:rFonts w:ascii="Arial" w:cs="Arial" w:eastAsia="Arial" w:hAnsi="Arial"/>
+                <w:i w:val="false"/>
+                <w:iCs w:val="false"/>
+                <w:color w:val="000000"/>
+                <w:sz w:val="18"/>
+                <w:szCs w:val="18"/>
+                <w:highlight w:val="yellow"/>
+                <w:highlightCs w:val="yellow"/>
+              </w:rPr>
+              <w:t xml:space="preserve">Information maintained in the register should include those set out in Annex 4.</w:t>
+            </w:r>
+            <w:r>
+              <w:rPr>
+                <w:rFonts w:ascii="Arial" w:cs="Arial" w:eastAsia="Arial" w:hAnsi="Arial"/>
+                <w:i w:val="false"/>
+                <w:iCs w:val="false"/>
+                <w:color w:val="000000"/>
+                <w:sz w:val="18"/>
+                <w:szCs w:val="18"/>
+              </w:rPr>
+              <w:t xml:space="preserve"> The register should be updated promptly and form part of the oversight and governance reviews undertaken by the board and senior management of the institution, similar to those described in paragraph 5.2; (b) Establish multi-disciplinary outsourcing management groups with members from different risk and internal control functions including legal, compliance and finance, to ensure that all relevant technical issues and legal and regulatory requirements are met. The institution should allocate sufficient resources, in terms of both time and skilled manpower, to the management groups to enable its staff to adequately plan and oversee the entire outsourcing lifecycle; (c) Establish outsourcing management control groups to monitor and control the outsourced service on an ongoing basis. There should be policies and procedures to monitor service delivery and the confidentiality and security of customer information, for the purpose of gauging ongoing compliance with agreed service levels and the viability of the institution's operations. Such monitoring should be regular and validated through the review of reports by auditors of the service provider or audits commissioned by the institution; </w:t>
+            </w:r>
+            <w:r>
+              <w:rPr>
+                <w:rFonts w:ascii="Arial" w:cs="Arial" w:eastAsia="Arial" w:hAnsi="Arial"/>
+                <w:i w:val="false"/>
+                <w:iCs w:val="false"/>
+                <w:color w:val="000000"/>
+                <w:sz w:val="18"/>
+                <w:szCs w:val="18"/>
+                <w:highlight w:val="yellow"/>
+                <w:highlightCs w:val="yellow"/>
+              </w:rPr>
+              <w:t xml:space="preserve">(d) Periodic reviews, at least on an annual basis, on all material outsourcing arrangements. This is to ensure that the institution's outsourcing risk management policies and procedures, and these Guidelines, are effectively implemented. Such reviews should ascertain the adequacy of internal risk management and management information systems established by the institution (e.g. assessing the effectiveness of processes and metrics used to evaluate the performance and security of the service provider) and highlight any deficiency in the institution's systems of control;</w:t>
+            </w:r>
+            <w:r>
+              <w:rPr>
+                <w:rFonts w:ascii="Arial" w:cs="Arial" w:eastAsia="Arial" w:hAnsi="Arial"/>
+                <w:i w:val="false"/>
+                <w:iCs w:val="false"/>
+                <w:color w:val="000000"/>
+                <w:sz w:val="18"/>
+                <w:szCs w:val="18"/>
+              </w:rPr>
+              <w:t xml:space="preserve"> (e) Reporting policies and procedures — Reports on the monitoring and control activities of the institution should be reviewed by its senior management16 and provided to the board for information. The institution should ensure that monitoring metrics and performance data are not aggregated with those belonging to other customers of the service provider. The institution should also ensure that any adverse development arising in any outsourcing arrangement is brought to the attention of the senior management of the institution and service provider, or to the institution's board, where warranted, on a timely basis. When adverse development occurs, prompt actions should be taken by an institution to review the outsourcing relationship for modification or termination of the agreement; and (f) Perform comprehensive pre- and post- implementation reviews of new outsourcing arrangements or when amendments are made to the outsourcing arrangements. If an outsourcing arrangement is materially amended, a comprehensive due diligence of the outsourcing arrangement should also be conducted.</w:t>
+            </w:r>
+          </w:p>
+          <w:p>
+            <w:pPr>
+              <w:spacing w:after="40" w:before="40"/>
+            </w:pPr>
+            <w:r>
+              <w:rPr>
+                <w:rFonts w:ascii="Arial" w:cs="Arial" w:eastAsia="Arial" w:hAnsi="Arial"/>
+                <w:i w:val="false"/>
+                <w:iCs w:val="false"/>
+                <w:color w:val="595959"/>
+                <w:sz w:val="14"/>
+                <w:szCs w:val="14"/>
+              </w:rPr>
               <w:t xml:space="preserve">16 – Refer to paragraph 5.2.3.</w:t>
             </w:r>
           </w:p>
@@ -10163,7 +10359,7 @@
                 <w:sz w:val="18"/>
                 <w:szCs w:val="18"/>
               </w:rPr>
-              <w:t xml:space="preserve"> An institution should ensure that independent audits and/or expert assessments of all its outsourcing arrangements are conducted. In determining the frequency of audit and expert assessment, the institution should consider the nature and extent of risk and impact to the institution from the outsourcing arrangements. The scope of the audits and expert assessments should include an assessment of the service providers' and its sub-contractors' security23 and control environment, incident management process (for material breaches, service disruptions or other material issues) and the institution's observance of the expectations in these Guidelines in relation to the outsourcing arrangement.</w:t>
+              <w:t xml:space="preserve"> An institution should ensure that independent audits and/or expert assessments of all its outsourcing arrangements are conducted. In determining the frequency of audit and expert assessment, the institution should consider the nature and extent of risk and impact to the institution from the outsourcing arrangements. The scope of the audits and expert assessments should include an assessment of the service providers' and its sub-contractors' security17 and control environment incident management process (for material breaches, service disruptions or other material issues) and the institution's observance of the expectations in these Guidelines in relation to the outsourcing arrangement.</w:t>
             </w:r>
           </w:p>
           <w:p>
@@ -10179,7 +10375,7 @@
                 <w:sz w:val="14"/>
                 <w:szCs w:val="14"/>
               </w:rPr>
-              <w:t xml:space="preserve">23 – The security environment refers to both the physical and IT security environments.</w:t>
+              <w:t xml:space="preserve">17 – The security environment refers to both the physical and IT security environments.</w:t>
             </w:r>
           </w:p>
         </w:tc>
@@ -10313,7 +10509,7 @@
                 <w:sz w:val="18"/>
                 <w:szCs w:val="18"/>
               </w:rPr>
-              <w:t xml:space="preserve">. The appointed persons should possess the requisite knowledge and skills to perform the audit, and be independent of the unit or function performing the outsourcing arrangement. Senior management should ensure that appropriate and timely remedial actions are taken to address the audit findings. Banks and service providers should have adequate processes in place to ensure that remedial actions are satisfactorily completed. Actions taken by the service provider to address the audit findings should be appropriately validated by the Bank before closure. Where necessary, the relevant persons who possess the requisite knowledge and skills should be involved to validate the effectiveness of the security and control measures taken.</w:t>
+              <w:t xml:space="preserve">. The appointed persons should possess the requisite knowledge and skills to perform the audit, and be independent of the unit or function performing the outsourcing arrangement. Senior management should ensure that appropriate and timely remedial actions are taken to address the audit findings25. Banks and service providers should have adequate processes in place to ensure that remedial actions are satisfactorily completed. Actions taken by the service provider to address the audit findings should be appropriately validated by the Bank before closure. Where necessary, the relevant persons who possess the requisite knowledge and skills should be involved to validate the effectiveness of the security and control measures taken.</w:t>
             </w:r>
           </w:p>
           <w:p>
@@ -10356,47 +10552,6 @@
               <w:t xml:space="preserve">, a bank should conduct its own audits to supplement the audits performed by the service provider's auditors, where necessary.</w:t>
             </w:r>
           </w:p>
-        </w:tc>
-        <w:tc>
-          <w:tcPr>
-            <w:tcW w:type="dxa" w:w="5300"/>
-            <w:tcMar>
-              <w:top w:type="dxa" w:w="60"/>
-              <w:left w:type="dxa" w:w="100"/>
-              <w:bottom w:type="dxa" w:w="60"/>
-              <w:right w:type="dxa" w:w="100"/>
-            </w:tcMar>
-            <w:vAlign w:val="top"/>
-          </w:tcPr>
-          <w:p>
-            <w:pPr>
-              <w:spacing w:after="40" w:before="40"/>
-            </w:pPr>
-            <w:r>
-              <w:rPr>
-                <w:rFonts w:ascii="Arial" w:cs="Arial" w:eastAsia="Arial" w:hAnsi="Arial"/>
-                <w:b/>
-                <w:bCs/>
-                <w:i w:val="false"/>
-                <w:iCs w:val="false"/>
-                <w:color w:val="000000"/>
-                <w:sz w:val="18"/>
-                <w:szCs w:val="18"/>
-              </w:rPr>
-              <w:t xml:space="preserve">[¶5.9.6]</w:t>
-            </w:r>
-            <w:r>
-              <w:rPr>
-                <w:rFonts w:ascii="Arial" w:cs="Arial" w:eastAsia="Arial" w:hAnsi="Arial"/>
-                <w:i w:val="false"/>
-                <w:iCs w:val="false"/>
-                <w:color w:val="000000"/>
-                <w:sz w:val="18"/>
-                <w:szCs w:val="18"/>
-              </w:rPr>
-              <w:t xml:space="preserve"> The independent audit and/or expert assessment on the service provider and its sub-contractors may be performed by the institution's internal or external auditors, the service provider's external auditors24 or by agents appointed by the institution. The appointed persons should possess the requisite knowledge and skills to perform the audit, and be independent of the unit or function performing the outsourcing arrangement. Senior management should ensure that appropriate and timely remedial actions are taken to address the audit findings. institutions and service providers should have adequate processes in place to ensure that remedial actions are satisfactorily completed. Actions taken by the service provider to address the audit findings should be appropriately validated by the institution before closure. Where necessary, the relevant persons who possess the requisite knowledge and skills should be involved to validate the effectiveness of the security and control measures taken.</w:t>
-            </w:r>
-          </w:p>
           <w:p>
             <w:pPr>
               <w:spacing w:after="40" w:before="40"/>
@@ -10410,7 +10565,80 @@
                 <w:sz w:val="14"/>
                 <w:szCs w:val="14"/>
               </w:rPr>
-              <w:t xml:space="preserve">24 – An institution should conduct its own audits to supplement the audits performed by the service provider's auditors, where necessary.</w:t>
+              <w:t xml:space="preserve">25 – Please refer to paragraph 3.1 on Responsibilities of Board and Senior Management.</w:t>
+            </w:r>
+          </w:p>
+        </w:tc>
+        <w:tc>
+          <w:tcPr>
+            <w:tcW w:type="dxa" w:w="5300"/>
+            <w:tcMar>
+              <w:top w:type="dxa" w:w="60"/>
+              <w:left w:type="dxa" w:w="100"/>
+              <w:bottom w:type="dxa" w:w="60"/>
+              <w:right w:type="dxa" w:w="100"/>
+            </w:tcMar>
+            <w:vAlign w:val="top"/>
+          </w:tcPr>
+          <w:p>
+            <w:pPr>
+              <w:spacing w:after="40" w:before="40"/>
+            </w:pPr>
+            <w:r>
+              <w:rPr>
+                <w:rFonts w:ascii="Arial" w:cs="Arial" w:eastAsia="Arial" w:hAnsi="Arial"/>
+                <w:b/>
+                <w:bCs/>
+                <w:i w:val="false"/>
+                <w:iCs w:val="false"/>
+                <w:color w:val="000000"/>
+                <w:sz w:val="18"/>
+                <w:szCs w:val="18"/>
+              </w:rPr>
+              <w:t xml:space="preserve">[¶5.9.6]</w:t>
+            </w:r>
+            <w:r>
+              <w:rPr>
+                <w:rFonts w:ascii="Arial" w:cs="Arial" w:eastAsia="Arial" w:hAnsi="Arial"/>
+                <w:i w:val="false"/>
+                <w:iCs w:val="false"/>
+                <w:color w:val="000000"/>
+                <w:sz w:val="18"/>
+                <w:szCs w:val="18"/>
+              </w:rPr>
+              <w:t xml:space="preserve"> The independent audit and/or expert assessment on the service provider and its sub-contractors may be performed by the institution's internal or external auditors, the service provider's external auditors18 or by agents appointed by the institution. The appointed persons should possess the requisite knowledge and skills to perform the audit, and be independent of the unit or function performing the outsourcing arrangement. Senior management should ensure that appropriate and timely remedial actions are taken to address the audit findings19. Institutions and the service providers should have adequate processes in place to ensure that remedial actions are satisfactorily completed. Actions taken by the service provider to address the audit findings should be appropriately validated by the institution before closure. Where necessary, the relevant persons who possess the requisite knowledge and skills should be involved to validate the effectiveness of the security and control measures taken.</w:t>
+            </w:r>
+          </w:p>
+          <w:p>
+            <w:pPr>
+              <w:spacing w:after="40" w:before="40"/>
+            </w:pPr>
+            <w:r>
+              <w:rPr>
+                <w:rFonts w:ascii="Arial" w:cs="Arial" w:eastAsia="Arial" w:hAnsi="Arial"/>
+                <w:i w:val="false"/>
+                <w:iCs w:val="false"/>
+                <w:color w:val="595959"/>
+                <w:sz w:val="14"/>
+                <w:szCs w:val="14"/>
+              </w:rPr>
+              <w:t xml:space="preserve">18 – An institution should conduct its own audits to supplement the audits performed by the service provider's auditors, where necessary.</w:t>
+            </w:r>
+          </w:p>
+          <w:p>
+            <w:pPr>
+              <w:spacing w:after="40" w:before="40"/>
+            </w:pPr>
+            <w:r>
+              <w:rPr>
+                <w:rFonts w:ascii="Arial" w:cs="Arial" w:eastAsia="Arial" w:hAnsi="Arial"/>
+                <w:i w:val="false"/>
+                <w:iCs w:val="false"/>
+                <w:color w:val="595959"/>
+                <w:sz w:val="14"/>
+                <w:szCs w:val="14"/>
+              </w:rPr>
+              <w:t xml:space="preserve">19 – Please refer to para 5.2 on Responsibilities of Board and Senior Management.</w:t>
             </w:r>
           </w:p>
         </w:tc>
@@ -11119,7 +11347,7 @@
                 <w:sz w:val="18"/>
                 <w:szCs w:val="18"/>
               </w:rPr>
-              <w:t xml:space="preserve"> The engagement of a service provider in a foreign country, or an outsourcing arrangement whereby the outsourced function is performed in a foreign country may expose an institution to country risk - economic, social and political conditions and events in a foreign country that may adversely affect the institution. Such conditions and events could prevent the service provider from carrying out the terms of its agreement with the institution. In its risk management of such outsourcing arrangements, an institution should take into account, as part of its due diligence, and on a continuous basis: (a) government policies; (b) political, social, economic conditions; (c) legal and regulatory developments in the foreign country; and (d) the institution's ability to effectively monitor the service provider, and execute its business continuity management plans and exit strategy. An institution should also be aware of the disaster recovery arrangements and locations established by the service provider in relation to the outsourcing arrangement. As information and data could be moved to primary or backup sites located in foreign countries, the risks associated with the medium of transport, be it physical or electronic, should also be considered.</w:t>
+              <w:t xml:space="preserve"> The engagement of a service provider in a foreign country, or an outsourcing arrangement whereby the outsourced function is performed in a foreign country, may expose an institution to country risk - economic, social and political conditions and events in a foreign country that may adversely affect the institution. Such conditions and events could prevent the service provider from carrying out the terms of its agreement with the institution. In its risk management of such outsourcing arrangements, an institution should take into account, as part of its due diligence, and on a continuous basis: (a) government policies; (b) political, social, economic conditions; (c) legal and regulatory developments in the foreign country; and (d) the institution's ability to effectively monitor the service provider, and execute its business continuity management plans and exit strategy. An institution should also be aware of the disaster recovery arrangements and locations established by the service provider in relation to the outsourcing arrangement. As information and data could be moved to primary or backup sites located in foreign countries, the risks associated with the medium of transport, be it physical or electronic, should also be considered.</w:t>
             </w:r>
           </w:p>
         </w:tc>
@@ -11574,7 +11802,7 @@
                 <w:sz w:val="18"/>
                 <w:szCs w:val="18"/>
               </w:rPr>
-              <w:t xml:space="preserve"> These Guidelines are applicable to outsourcing arrangements with parties within an institution's group. The expectations may be addressed within group-wide risk management policies and procedure. The institution would be expected to provide, when requested, information demonstrating the structure and processes by which its board and senior management discharge their role in the oversight and management of outsourcing risks on a group-wide basis. For an institution incorporated or established outside Singapore, the roles and responsibilities of the local management are set out in paragraph 5.2.5.</w:t>
+              <w:t xml:space="preserve"> These Guidelines are applicable to outsourcing arrangements with parties within an institution's group. The expectations may be addressed within group-wide risk management policies and procedures. The institution would be expected to provide, when requested, information demonstrating the structure and processes by which its board and senior management discharge their role in the oversight and management of outsourcing risks on a group-wide basis. For an institution incorporated or established outside Singapore, the roles and responsibilities of the local management are set out in paragraph 5.2.5.</w:t>
             </w:r>
           </w:p>
         </w:tc>
@@ -12670,31 +12898,7 @@
                 <w:sz w:val="18"/>
                 <w:szCs w:val="18"/>
               </w:rPr>
-              <w:t xml:space="preserve"> 1. Cloud services (CS) are a combination of a business and delivery model that enable on-demand access to a shared pool of resources such as applications, servers, storage and network security. The service is typically delivered in the form of Software as a Service (SaaS), Platform as a Service (PaaS) and Infrastructure as a Service (IaaS). 2. CS can potentially offer a number of advantages, which include economies of scale, cost-savings, access to quality system administration as well as operations that adhere to uniform security standards and best practices. CS may also be used to provide the flexibility and agility for Banks to scale up or pare down on computing resources quickly as usage requirements change, without major hardware and software outlay as well as lead-time. In addition, the distributed nature of CS may enhance system resilience during location-specific disasters or disruptions. 3. It has been noted that more and more Banks are adopting CS to fulfil their business and operational requirements. These CS deployments may be operated in-house or off-premises by service providers. While the latter can take the form of a private27 or public28 cloud, there is a growing trend for Banks to adopt a combination of private and public clouds to create a hybrid cloud. The different cloud models provide for distinct operational and security trade-offs. 4. In the recent years, cloud technology has evolved and matured considerably and CS providers have become aware of the technology and security requirements of Banks to protect sensitive customer data. In this regard, a number of CS providers have implemented strong authentication, access controls, tokenisation techniques and data encryption to bolster security to meet Banks' requirements. 5. </w:t>
-            </w:r>
-            <w:r>
-              <w:rPr>
-                <w:rFonts w:ascii="Arial" w:cs="Arial" w:eastAsia="Arial" w:hAnsi="Arial"/>
-                <w:i w:val="false"/>
-                <w:iCs w:val="false"/>
-                <w:color w:val="000000"/>
-                <w:sz w:val="18"/>
-                <w:szCs w:val="18"/>
-                <w:highlight w:val="yellow"/>
-                <w:highlightCs w:val="yellow"/>
-              </w:rPr>
-              <w:t xml:space="preserve">MAS considers CS operated by service providers as a form of outsourcing</w:t>
-            </w:r>
-            <w:r>
-              <w:rPr>
-                <w:rFonts w:ascii="Arial" w:cs="Arial" w:eastAsia="Arial" w:hAnsi="Arial"/>
-                <w:i w:val="false"/>
-                <w:iCs w:val="false"/>
-                <w:color w:val="000000"/>
-                <w:sz w:val="18"/>
-                <w:szCs w:val="18"/>
-              </w:rPr>
-              <w:t xml:space="preserve"> and recognises that Banks may leverage on such a service to enhance their operations and service efficiency while reaping the benefits of CS' scalable, standardised and secured infrastructure. 6. The types of risks in CS that confront Banks are not distinct from that of other forms of outsourcing arrangements. Banks should perform the necessary due diligence and apply sound governance and risk management practices articulated in this set of Guidelines when subscribing to CS. 7. Banks should be aware of CS' typical characteristics such as multi-tenancy, data commingling and the higher propensity for processing to be carried out in multiple locations. Hence, Banks should take active steps to address the risks associated with data access, confidentiality, integrity, sovereignty, recoverability, regulatory compliance and auditing. In particular, Banks should ensure that the service provider possesses the ability to clearly identify and segregate customer data using strong physical or logical controls. The service provider should have in place robust access controls to protect customer information and such access controls should survive the tenure of the contract of the CS. 8. Banks are ultimately responsible and accountable for maintaining oversight of CS and managing the attendant risks of adopting CS, as in any other form of outsourcing arrangements. A risk-based approach should be taken by Banks to ensure that the level of oversight and controls are commensurate with the materiality of the risks posed by the CS.</w:t>
+              <w:t xml:space="preserve"> 1. Cloud services (CS) are a combination of a business and delivery model that enable on-demand access to a shared pool of resources such as applications, servers, storage and network security. The service is typically delivered in the form of Software as a Service (SaaS), Platform as a Service (PaaS) and Infrastructure as a Service (IaaS). 2. CS can potentially offer a number of advantages, which include economies of scale, cost-savings, access to quality system administration as well as operations that adhere to uniform security standards and best practices. CS may also be used to provide the flexibility and agility for Banks to scale up or pare down on computing resources quickly as usage requirements change, without major hardware and software outlay as well as lead-time. In addition, the distributed nature of CS may enhance system resilience during location-specific disasters or disruptions. 3. It has been noted that more and more Banks are adopting CS to fulfil their business and operational requirements. These CS deployments may be operated in-house or off-premises by service providers. While the latter can take the form of a private27 or public28 cloud, there is a growing trend for Banks to adopt a combination of private and public clouds to create a hybrid cloud. The different cloud models provide for distinct operational and security trade-offs. 4. In the recent years, cloud technology has evolved and matured considerably and CS providers have become aware of the technology and security requirements of Banks to protect sensitive customer data. In this regard, a number of CS providers have implemented strong authentication, access controls, tokenisation techniques and data encryption to bolster security to meet Banks' requirements. 5. MAS considers CS operated by service providers as a form of outsourcing and recognises that Banks may leverage on such a service to enhance their operations and service efficiency while reaping the benefits of CS' scalable, standardised and secured infrastructure. 6. The types of risks in CS that confront Banks are not distinct from that of other forms of outsourcing arrangements. Banks should perform the necessary due diligence and apply sound governance and risk management practices articulated in this set of Guidelines when subscribing to CS. 7. Banks should be aware of CS' typical characteristics such as multi-tenancy, data commingling and the higher propensity for processing to be carried out in multiple locations. Hence, Banks should take active steps to address the risks associated with data access, confidentiality, integrity, sovereignty, recoverability, regulatory compliance and auditing. In particular, Banks should ensure that the service provider possesses the ability to clearly identify and segregate customer data using strong physical or logical controls. The service provider should have in place robust access controls to protect customer information and such access controls should survive the tenure of the contract of the CS. 8. Banks are ultimately responsible and accountable for maintaining oversight of CS and managing the attendant risks of adopting CS, as in any other form of outsourcing arrangements. A risk-based approach should be taken by Banks to ensure that the level of oversight and controls are commensurate with the materiality of the risks posed by the CS.</w:t>
             </w:r>
           </w:p>
           <w:p>
@@ -12902,18 +13106,31 @@
                 <w:sz w:val="18"/>
                 <w:szCs w:val="18"/>
               </w:rPr>
-              <w:t xml:space="preserve">Applicability of Notices and Guidelines for Banks to Different Categories of Services.</w:t>
-            </w:r>
-            <w:r>
-              <w:rPr>
-                <w:rFonts w:ascii="Arial" w:cs="Arial" w:eastAsia="Arial" w:hAnsi="Arial"/>
-                <w:i w:val="false"/>
-                <w:iCs w:val="false"/>
-                <w:color w:val="000000"/>
-                <w:sz w:val="18"/>
-                <w:szCs w:val="18"/>
-              </w:rPr>
-              <w:t xml:space="preserve"> Decision framework over "Relevant Services" as defined in s 47A(12) of the Banking Act 1970 (any service obtained or received by the bank, other than a service provided in the course of employment by an employee or by a director/officer in the course of appointment, and excluding any service specified by MAS by written notice): </w:t>
+              <w:t xml:space="preserve">Applicablity of Notices and Guidelines for Banks to Different Categories of Services</w:t>
+            </w:r>
+            <w:r>
+              <w:rPr>
+                <w:rFonts w:ascii="Arial" w:cs="Arial" w:eastAsia="Arial" w:hAnsi="Arial"/>
+                <w:i w:val="false"/>
+                <w:iCs w:val="false"/>
+                <w:color w:val="000000"/>
+                <w:sz w:val="18"/>
+                <w:szCs w:val="18"/>
+              </w:rPr>
+              <w:t xml:space="preserve"> [sic, as in the original].</w:t>
+            </w:r>
+            <w:r>
+              <w:rPr>
+                <w:rFonts w:ascii="Arial" w:cs="Arial" w:eastAsia="Arial" w:hAnsi="Arial"/>
+                <w:b/>
+                <w:bCs/>
+                <w:i w:val="false"/>
+                <w:iCs w:val="false"/>
+                <w:color w:val="000000"/>
+                <w:sz w:val="18"/>
+                <w:szCs w:val="18"/>
+              </w:rPr>
+              <w:t xml:space="preserve"> Decision framework over "Relevant Services" as defined in s 47A(12) of the Banking Act 1970 (means any service obtained or received by the bank, other than a service provided in the course of employment by an employee of the bank or a service provided by a director or an officer of the bank in the course of the director's or officer's appointment, and does not include any service specified by the Authority by written notice): </w:t>
             </w:r>
             <w:r>
               <w:rPr>
@@ -12926,7 +13143,7 @@
                 <w:highlight w:val="yellow"/>
                 <w:highlightCs w:val="yellow"/>
               </w:rPr>
-              <w:t xml:space="preserve">1. Non-Outsourced Relevant Services — not subject to Notices and Guidelines; should still be subject to adequate risk management and sound internal controls. 2. Non-Ongoing ORS — not subject to Notices and Guidelines except where the ORS involves disclosure of customer information, in which case Section C of the Notices and the outsourcing-register requirement apply; still subject to adequate risk management. 3. Non-material Ongoing ORS — subject to the register requirement in the Notices, and Section C where customer information is disclosed; the Bank should implement the Guidelines commensurate with the nature of risks. 4. Material Ongoing ORS (MOORS) — subject to the Notices and the Guidelines.</w:t>
+              <w:t xml:space="preserve">1. Non-Outsourced Relevant Services — not subject to Notices and Guidelines; should still be subject to adequate risk management and sound internal controls. 2. Non-Ongoing ORS — not subject to Notices and Guidelines except where the ORS involves disclosure of customer information, in which case Section C of the Notices and the outsourcing-register requirement apply; still subject to adequate risk management and sound internal controls. 3. Non-material Ongoing ORS — subject to the register requirement in the Notices, and Section C where customer information is disclosed; the Bank should implement the Guidelines commensurate with the nature of risks. 4. Material Ongoing ORS (MOORS) — subject to the Notices and the Guidelines.</w:t>
             </w:r>
           </w:p>
         </w:tc>

</xml_diff>